<commit_message>
report written up to race sec
</commit_message>
<xml_diff>
--- a/report/412YZ/report_412YZ_v2.docx
+++ b/report/412YZ/report_412YZ_v2.docx
@@ -505,7 +505,7 @@
           <w:sz w:val="22"/>
           <w:szCs w:val="22"/>
         </w:rPr>
-        <w:t xml:space="preserve">More females (54%) responded to the survey than males (34%). The table below shows how respondents identified by gender and sexual orientation.</w:t>
+        <w:t xml:space="preserve">More females (54%) responded to the survey than males (34%). Twenty-one transgender and non-binary youth also responded to the survey (12%), up from 12 youth (7%) in 2025. As represented in the table below, youth of all genders selected a variety of terms to describe their sexual orientation. Young women were more likely than their male peers to identify as LGBTQ (38% v. 21%), and 38% of respondents identified as LGBTQ in some way.</w:t>
       </w:r>
     </w:p>
     <w:p>
@@ -2489,7 +2489,7 @@
           <w:sz w:val="22"/>
           <w:szCs w:val="22"/>
         </w:rPr>
-        <w:t xml:space="preserve">About 52% of survey respondents identified as Black, 28% as White, and 17% as Multiracial.</w:t>
+        <w:t xml:space="preserve">Just over half of survey respondents identified as Black when each youth was counted once, while 28% identified as White, 17% as Multiracial, and 3% reported another single racial identity. When full or partial identities are counted using the unique respondent total, 62% of youth identified as Black, 31% as White, 11% as Multiracial, and 6% as Hispanic or Latinx. This marks a change from the prior year, when 66% of respondents identified as Black either fully or partially. White identification increased from 27% to 31%, while Multiracial identification remained steady at 11% and Hispanic or Latinx identification rose from 4% to 6%.</w:t>
       </w:r>
     </w:p>
     <w:p>
@@ -3591,7 +3591,7 @@
                 <w:sz w:val="22"/>
                 <w:szCs w:val="22"/>
               </w:rPr>
-              <w:t xml:space="preserve">100%</w:t>
+              <w:t xml:space="preserve"/>
             </w:r>
           </w:p>
         </w:tc>
@@ -4032,7 +4032,7 @@
                 <w:sz w:val="22"/>
                 <w:szCs w:val="22"/>
               </w:rPr>
-              <w:t xml:space="preserve">55%</w:t>
+              <w:t xml:space="preserve">62%</w:t>
             </w:r>
           </w:p>
         </w:tc>
@@ -4208,7 +4208,7 @@
                 <w:sz w:val="22"/>
                 <w:szCs w:val="22"/>
               </w:rPr>
-              <w:t xml:space="preserve">27%</w:t>
+              <w:t xml:space="preserve">31%</w:t>
             </w:r>
           </w:p>
         </w:tc>
@@ -4384,7 +4384,7 @@
                 <w:sz w:val="22"/>
                 <w:szCs w:val="22"/>
               </w:rPr>
-              <w:t xml:space="preserve">10%</w:t>
+              <w:t xml:space="preserve">11%</w:t>
             </w:r>
           </w:p>
         </w:tc>
@@ -5094,7 +5094,7 @@
                 <w:sz w:val="22"/>
                 <w:szCs w:val="22"/>
               </w:rPr>
-              <w:t xml:space="preserve">100%</w:t>
+              <w:t xml:space="preserve"/>
             </w:r>
           </w:p>
         </w:tc>

</xml_diff>

<commit_message>
reports reviewed through housing
</commit_message>
<xml_diff>
--- a/report/412YZ/report_412YZ_v2.docx
+++ b/report/412YZ/report_412YZ_v2.docx
@@ -3599,6 +3599,22 @@
     </w:tbl>
     <w:p>
       <w:pPr>
+        <w:pStyle w:val="Normal"/>
+        <w:spacing w:after="240" w:before="240" w:line="240"/>
+      </w:pPr>
+      <w:r>
+        <w:rPr>
+          <w:rFonts w:ascii="Calibri" w:cs="Calibri" w:eastAsia="Calibri" w:hAnsi="Calibri"/>
+          <w:b w:val="false"/>
+          <w:bCs w:val="false"/>
+          <w:sz w:val="22"/>
+          <w:szCs w:val="22"/>
+        </w:rPr>
+        <w:t xml:space="preserve">Note: If a youth selected 2 or more race tokens, they are attributed to "Multiracial" only.</w:t>
+      </w:r>
+    </w:p>
+    <w:p>
+      <w:pPr>
         <w:pStyle w:val="Caption"/>
       </w:pPr>
       <w:r>
@@ -5119,7 +5135,7 @@
     </w:p>
     <w:tbl>
       <w:tblPr>
-        <w:tblW w:type="auto" w:w="0"/>
+        <w:tblW w:type="dxa" w:w="9360"/>
         <w:tblBorders>
           <w:top w:val="none" w:color="FFFFFF" w:sz="0"/>
           <w:left w:val="none" w:color="FFFFFF" w:sz="0"/>
@@ -5128,7 +5144,7 @@
           <w:insideH w:val="single" w:color="auto" w:sz="4"/>
           <w:insideV w:val="single" w:color="auto" w:sz="4"/>
         </w:tblBorders>
-        <w:tblLayout w:type="autofit"/>
+        <w:tblLayout w:type="fixed"/>
       </w:tblPr>
       <w:tblGrid>
         <w:gridCol w:w="100"/>
@@ -5142,7 +5158,7 @@
       <w:tr>
         <w:tc>
           <w:tcPr>
-            <w:tcW w:type="auto" w:w="0"/>
+            <w:tcW w:type="dxa" w:w="3900"/>
             <w:tcBorders>
               <w:top w:val="none" w:color="FFFFFF" w:sz="0"/>
               <w:left w:val="none" w:color="FFFFFF" w:sz="0"/>
@@ -5156,6 +5172,7 @@
               <w:bottom w:type="dxa" w:w="80"/>
               <w:right w:type="dxa" w:w="120"/>
             </w:tcMar>
+            <w:vAlign w:val="center"/>
           </w:tcPr>
           <w:p>
             <w:r>
@@ -5166,13 +5183,14 @@
                 <w:sz w:val="22"/>
                 <w:szCs w:val="22"/>
               </w:rPr>
-              <w:t xml:space="preserve">My Youth Coach…</w:t>
-            </w:r>
-          </w:p>
-        </w:tc>
-        <w:tc>
-          <w:tcPr>
-            <w:tcW w:type="auto" w:w="0"/>
+              <w:t xml:space="preserve">My Youth Coach...</w:t>
+            </w:r>
+          </w:p>
+        </w:tc>
+        <w:tc>
+          <w:tcPr>
+            <w:tcW w:type="dxa" w:w="5460"/>
+            <w:gridSpan w:val="6"/>
             <w:tcBorders>
               <w:top w:val="none" w:color="FFFFFF" w:sz="0"/>
               <w:left w:val="none" w:color="FFFFFF" w:sz="0"/>
@@ -5186,8 +5204,12 @@
               <w:bottom w:type="dxa" w:w="80"/>
               <w:right w:type="dxa" w:w="120"/>
             </w:tcMar>
-          </w:tcPr>
-          <w:p>
+            <w:vAlign w:val="center"/>
+          </w:tcPr>
+          <w:p>
+            <w:pPr>
+              <w:jc w:val="center"/>
+            </w:pPr>
             <w:r>
               <w:rPr>
                 <w:rFonts w:ascii="Calibri" w:cs="Calibri" w:eastAsia="Calibri" w:hAnsi="Calibri"/>
@@ -5196,13 +5218,15 @@
                 <w:sz w:val="22"/>
                 <w:szCs w:val="22"/>
               </w:rPr>
-              <w:t xml:space="preserve">Sep-19</w:t>
-            </w:r>
-          </w:p>
-        </w:tc>
-        <w:tc>
-          <w:tcPr>
-            <w:tcW w:type="auto" w:w="0"/>
+              <w:t xml:space="preserve">% Often or All the Time</w:t>
+            </w:r>
+          </w:p>
+        </w:tc>
+      </w:tr>
+      <w:tr>
+        <w:tc>
+          <w:tcPr>
+            <w:tcW w:type="dxa" w:w="3900"/>
             <w:tcBorders>
               <w:top w:val="none" w:color="FFFFFF" w:sz="0"/>
               <w:left w:val="none" w:color="FFFFFF" w:sz="0"/>
@@ -5216,8 +5240,43 @@
               <w:bottom w:type="dxa" w:w="80"/>
               <w:right w:type="dxa" w:w="120"/>
             </w:tcMar>
-          </w:tcPr>
-          <w:p>
+            <w:vAlign w:val="center"/>
+          </w:tcPr>
+          <w:p>
+            <w:r>
+              <w:rPr>
+                <w:rFonts w:ascii="Calibri" w:cs="Calibri" w:eastAsia="Calibri" w:hAnsi="Calibri"/>
+                <w:b w:val="false"/>
+                <w:bCs w:val="false"/>
+                <w:sz w:val="22"/>
+                <w:szCs w:val="22"/>
+              </w:rPr>
+              <w:t xml:space="preserve"/>
+            </w:r>
+          </w:p>
+        </w:tc>
+        <w:tc>
+          <w:tcPr>
+            <w:tcW w:type="dxa" w:w="910"/>
+            <w:tcBorders>
+              <w:top w:val="none" w:color="FFFFFF" w:sz="0"/>
+              <w:left w:val="none" w:color="FFFFFF" w:sz="0"/>
+              <w:bottom w:val="none" w:color="FFFFFF" w:sz="0"/>
+              <w:right w:val="none" w:color="FFFFFF" w:sz="0"/>
+            </w:tcBorders>
+            <w:shd w:fill="DCE6F1" w:color="auto" w:val="clear"/>
+            <w:tcMar>
+              <w:top w:type="dxa" w:w="80"/>
+              <w:left w:type="dxa" w:w="120"/>
+              <w:bottom w:type="dxa" w:w="80"/>
+              <w:right w:type="dxa" w:w="120"/>
+            </w:tcMar>
+            <w:vAlign w:val="center"/>
+          </w:tcPr>
+          <w:p>
+            <w:pPr>
+              <w:jc w:val="center"/>
+            </w:pPr>
             <w:r>
               <w:rPr>
                 <w:rFonts w:ascii="Calibri" w:cs="Calibri" w:eastAsia="Calibri" w:hAnsi="Calibri"/>
@@ -5226,13 +5285,13 @@
                 <w:sz w:val="22"/>
                 <w:szCs w:val="22"/>
               </w:rPr>
-              <w:t xml:space="preserve">Mar-22</w:t>
-            </w:r>
-          </w:p>
-        </w:tc>
-        <w:tc>
-          <w:tcPr>
-            <w:tcW w:type="auto" w:w="0"/>
+              <w:t xml:space="preserve">Sep-19</w:t>
+            </w:r>
+          </w:p>
+        </w:tc>
+        <w:tc>
+          <w:tcPr>
+            <w:tcW w:type="dxa" w:w="910"/>
             <w:tcBorders>
               <w:top w:val="none" w:color="FFFFFF" w:sz="0"/>
               <w:left w:val="none" w:color="FFFFFF" w:sz="0"/>
@@ -5246,8 +5305,12 @@
               <w:bottom w:type="dxa" w:w="80"/>
               <w:right w:type="dxa" w:w="120"/>
             </w:tcMar>
-          </w:tcPr>
-          <w:p>
+            <w:vAlign w:val="center"/>
+          </w:tcPr>
+          <w:p>
+            <w:pPr>
+              <w:jc w:val="center"/>
+            </w:pPr>
             <w:r>
               <w:rPr>
                 <w:rFonts w:ascii="Calibri" w:cs="Calibri" w:eastAsia="Calibri" w:hAnsi="Calibri"/>
@@ -5256,13 +5319,13 @@
                 <w:sz w:val="22"/>
                 <w:szCs w:val="22"/>
               </w:rPr>
-              <w:t xml:space="preserve">Feb-23</w:t>
-            </w:r>
-          </w:p>
-        </w:tc>
-        <w:tc>
-          <w:tcPr>
-            <w:tcW w:type="auto" w:w="0"/>
+              <w:t xml:space="preserve">Mar-22</w:t>
+            </w:r>
+          </w:p>
+        </w:tc>
+        <w:tc>
+          <w:tcPr>
+            <w:tcW w:type="dxa" w:w="910"/>
             <w:tcBorders>
               <w:top w:val="none" w:color="FFFFFF" w:sz="0"/>
               <w:left w:val="none" w:color="FFFFFF" w:sz="0"/>
@@ -5276,8 +5339,12 @@
               <w:bottom w:type="dxa" w:w="80"/>
               <w:right w:type="dxa" w:w="120"/>
             </w:tcMar>
-          </w:tcPr>
-          <w:p>
+            <w:vAlign w:val="center"/>
+          </w:tcPr>
+          <w:p>
+            <w:pPr>
+              <w:jc w:val="center"/>
+            </w:pPr>
             <w:r>
               <w:rPr>
                 <w:rFonts w:ascii="Calibri" w:cs="Calibri" w:eastAsia="Calibri" w:hAnsi="Calibri"/>
@@ -5286,13 +5353,13 @@
                 <w:sz w:val="22"/>
                 <w:szCs w:val="22"/>
               </w:rPr>
-              <w:t xml:space="preserve">Feb-24</w:t>
-            </w:r>
-          </w:p>
-        </w:tc>
-        <w:tc>
-          <w:tcPr>
-            <w:tcW w:type="auto" w:w="0"/>
+              <w:t xml:space="preserve">Feb-23</w:t>
+            </w:r>
+          </w:p>
+        </w:tc>
+        <w:tc>
+          <w:tcPr>
+            <w:tcW w:type="dxa" w:w="910"/>
             <w:tcBorders>
               <w:top w:val="none" w:color="FFFFFF" w:sz="0"/>
               <w:left w:val="none" w:color="FFFFFF" w:sz="0"/>
@@ -5306,8 +5373,12 @@
               <w:bottom w:type="dxa" w:w="80"/>
               <w:right w:type="dxa" w:w="120"/>
             </w:tcMar>
-          </w:tcPr>
-          <w:p>
+            <w:vAlign w:val="center"/>
+          </w:tcPr>
+          <w:p>
+            <w:pPr>
+              <w:jc w:val="center"/>
+            </w:pPr>
             <w:r>
               <w:rPr>
                 <w:rFonts w:ascii="Calibri" w:cs="Calibri" w:eastAsia="Calibri" w:hAnsi="Calibri"/>
@@ -5316,13 +5387,13 @@
                 <w:sz w:val="22"/>
                 <w:szCs w:val="22"/>
               </w:rPr>
-              <w:t xml:space="preserve">Feb-25</w:t>
-            </w:r>
-          </w:p>
-        </w:tc>
-        <w:tc>
-          <w:tcPr>
-            <w:tcW w:type="auto" w:w="0"/>
+              <w:t xml:space="preserve">Feb-24</w:t>
+            </w:r>
+          </w:p>
+        </w:tc>
+        <w:tc>
+          <w:tcPr>
+            <w:tcW w:type="dxa" w:w="910"/>
             <w:tcBorders>
               <w:top w:val="none" w:color="FFFFFF" w:sz="0"/>
               <w:left w:val="none" w:color="FFFFFF" w:sz="0"/>
@@ -5336,8 +5407,12 @@
               <w:bottom w:type="dxa" w:w="80"/>
               <w:right w:type="dxa" w:w="120"/>
             </w:tcMar>
-          </w:tcPr>
-          <w:p>
+            <w:vAlign w:val="center"/>
+          </w:tcPr>
+          <w:p>
+            <w:pPr>
+              <w:jc w:val="center"/>
+            </w:pPr>
             <w:r>
               <w:rPr>
                 <w:rFonts w:ascii="Calibri" w:cs="Calibri" w:eastAsia="Calibri" w:hAnsi="Calibri"/>
@@ -5346,6 +5421,40 @@
                 <w:sz w:val="22"/>
                 <w:szCs w:val="22"/>
               </w:rPr>
+              <w:t xml:space="preserve">Feb-25</w:t>
+            </w:r>
+          </w:p>
+        </w:tc>
+        <w:tc>
+          <w:tcPr>
+            <w:tcW w:type="dxa" w:w="910"/>
+            <w:tcBorders>
+              <w:top w:val="none" w:color="FFFFFF" w:sz="0"/>
+              <w:left w:val="none" w:color="FFFFFF" w:sz="0"/>
+              <w:bottom w:val="none" w:color="FFFFFF" w:sz="0"/>
+              <w:right w:val="none" w:color="FFFFFF" w:sz="0"/>
+            </w:tcBorders>
+            <w:shd w:fill="DCE6F1" w:color="auto" w:val="clear"/>
+            <w:tcMar>
+              <w:top w:type="dxa" w:w="80"/>
+              <w:left w:type="dxa" w:w="120"/>
+              <w:bottom w:type="dxa" w:w="80"/>
+              <w:right w:type="dxa" w:w="120"/>
+            </w:tcMar>
+            <w:vAlign w:val="center"/>
+          </w:tcPr>
+          <w:p>
+            <w:pPr>
+              <w:jc w:val="center"/>
+            </w:pPr>
+            <w:r>
+              <w:rPr>
+                <w:rFonts w:ascii="Calibri" w:cs="Calibri" w:eastAsia="Calibri" w:hAnsi="Calibri"/>
+                <w:b/>
+                <w:bCs/>
+                <w:sz w:val="22"/>
+                <w:szCs w:val="22"/>
+              </w:rPr>
               <w:t xml:space="preserve">Mar-26</w:t>
             </w:r>
           </w:p>
@@ -5354,204 +5463,236 @@
       <w:tr>
         <w:tc>
           <w:tcPr>
-            <w:tcW w:type="auto" w:w="0"/>
-            <w:tcBorders>
-              <w:top w:val="none" w:color="FFFFFF" w:sz="0"/>
-              <w:left w:val="none" w:color="FFFFFF" w:sz="0"/>
-              <w:bottom w:val="none" w:color="FFFFFF" w:sz="0"/>
-              <w:right w:val="none" w:color="FFFFFF" w:sz="0"/>
-            </w:tcBorders>
-            <w:tcMar>
-              <w:top w:type="dxa" w:w="80"/>
-              <w:left w:type="dxa" w:w="120"/>
-              <w:bottom w:type="dxa" w:w="80"/>
-              <w:right w:type="dxa" w:w="120"/>
-            </w:tcMar>
-          </w:tcPr>
-          <w:p>
-            <w:r>
-              <w:rPr>
-                <w:rFonts w:ascii="Calibri" w:cs="Calibri" w:eastAsia="Calibri" w:hAnsi="Calibri"/>
-                <w:b w:val="false"/>
-                <w:bCs w:val="false"/>
-                <w:sz w:val="22"/>
-                <w:szCs w:val="22"/>
-              </w:rPr>
-              <w:t xml:space="preserve">My Youth Coach…</w:t>
-            </w:r>
-          </w:p>
-        </w:tc>
-        <w:tc>
-          <w:tcPr>
-            <w:tcW w:type="auto" w:w="0"/>
-            <w:tcBorders>
-              <w:top w:val="none" w:color="FFFFFF" w:sz="0"/>
-              <w:left w:val="none" w:color="FFFFFF" w:sz="0"/>
-              <w:bottom w:val="none" w:color="FFFFFF" w:sz="0"/>
-              <w:right w:val="none" w:color="FFFFFF" w:sz="0"/>
-            </w:tcBorders>
-            <w:tcMar>
-              <w:top w:type="dxa" w:w="80"/>
-              <w:left w:type="dxa" w:w="120"/>
-              <w:bottom w:type="dxa" w:w="80"/>
-              <w:right w:type="dxa" w:w="120"/>
-            </w:tcMar>
-          </w:tcPr>
-          <w:p>
-            <w:r>
-              <w:rPr>
-                <w:rFonts w:ascii="Calibri" w:cs="Calibri" w:eastAsia="Calibri" w:hAnsi="Calibri"/>
-                <w:b w:val="false"/>
-                <w:bCs w:val="false"/>
-                <w:sz w:val="22"/>
-                <w:szCs w:val="22"/>
-              </w:rPr>
-              <w:t xml:space="preserve">% Often or All the Time</w:t>
-            </w:r>
-          </w:p>
-        </w:tc>
-        <w:tc>
-          <w:tcPr>
-            <w:tcW w:type="auto" w:w="0"/>
-            <w:tcBorders>
-              <w:top w:val="none" w:color="FFFFFF" w:sz="0"/>
-              <w:left w:val="none" w:color="FFFFFF" w:sz="0"/>
-              <w:bottom w:val="none" w:color="FFFFFF" w:sz="0"/>
-              <w:right w:val="none" w:color="FFFFFF" w:sz="0"/>
-            </w:tcBorders>
-            <w:tcMar>
-              <w:top w:type="dxa" w:w="80"/>
-              <w:left w:type="dxa" w:w="120"/>
-              <w:bottom w:type="dxa" w:w="80"/>
-              <w:right w:type="dxa" w:w="120"/>
-            </w:tcMar>
-          </w:tcPr>
-          <w:p>
-            <w:r>
-              <w:rPr>
-                <w:rFonts w:ascii="Calibri" w:cs="Calibri" w:eastAsia="Calibri" w:hAnsi="Calibri"/>
-                <w:b w:val="false"/>
-                <w:bCs w:val="false"/>
-                <w:sz w:val="22"/>
-                <w:szCs w:val="22"/>
-              </w:rPr>
-              <w:t xml:space="preserve">% Often or All the Time</w:t>
-            </w:r>
-          </w:p>
-        </w:tc>
-        <w:tc>
-          <w:tcPr>
-            <w:tcW w:type="auto" w:w="0"/>
-            <w:tcBorders>
-              <w:top w:val="none" w:color="FFFFFF" w:sz="0"/>
-              <w:left w:val="none" w:color="FFFFFF" w:sz="0"/>
-              <w:bottom w:val="none" w:color="FFFFFF" w:sz="0"/>
-              <w:right w:val="none" w:color="FFFFFF" w:sz="0"/>
-            </w:tcBorders>
-            <w:tcMar>
-              <w:top w:type="dxa" w:w="80"/>
-              <w:left w:type="dxa" w:w="120"/>
-              <w:bottom w:type="dxa" w:w="80"/>
-              <w:right w:type="dxa" w:w="120"/>
-            </w:tcMar>
-          </w:tcPr>
-          <w:p>
-            <w:r>
-              <w:rPr>
-                <w:rFonts w:ascii="Calibri" w:cs="Calibri" w:eastAsia="Calibri" w:hAnsi="Calibri"/>
-                <w:b w:val="false"/>
-                <w:bCs w:val="false"/>
-                <w:sz w:val="22"/>
-                <w:szCs w:val="22"/>
-              </w:rPr>
-              <w:t xml:space="preserve">% Often or All the Time</w:t>
-            </w:r>
-          </w:p>
-        </w:tc>
-        <w:tc>
-          <w:tcPr>
-            <w:tcW w:type="auto" w:w="0"/>
-            <w:tcBorders>
-              <w:top w:val="none" w:color="FFFFFF" w:sz="0"/>
-              <w:left w:val="none" w:color="FFFFFF" w:sz="0"/>
-              <w:bottom w:val="none" w:color="FFFFFF" w:sz="0"/>
-              <w:right w:val="none" w:color="FFFFFF" w:sz="0"/>
-            </w:tcBorders>
-            <w:tcMar>
-              <w:top w:type="dxa" w:w="80"/>
-              <w:left w:type="dxa" w:w="120"/>
-              <w:bottom w:type="dxa" w:w="80"/>
-              <w:right w:type="dxa" w:w="120"/>
-            </w:tcMar>
-          </w:tcPr>
-          <w:p>
-            <w:r>
-              <w:rPr>
-                <w:rFonts w:ascii="Calibri" w:cs="Calibri" w:eastAsia="Calibri" w:hAnsi="Calibri"/>
-                <w:b w:val="false"/>
-                <w:bCs w:val="false"/>
-                <w:sz w:val="22"/>
-                <w:szCs w:val="22"/>
-              </w:rPr>
-              <w:t xml:space="preserve">% Often or All the Time</w:t>
-            </w:r>
-          </w:p>
-        </w:tc>
-        <w:tc>
-          <w:tcPr>
-            <w:tcW w:type="auto" w:w="0"/>
-            <w:tcBorders>
-              <w:top w:val="none" w:color="FFFFFF" w:sz="0"/>
-              <w:left w:val="none" w:color="FFFFFF" w:sz="0"/>
-              <w:bottom w:val="none" w:color="FFFFFF" w:sz="0"/>
-              <w:right w:val="none" w:color="FFFFFF" w:sz="0"/>
-            </w:tcBorders>
-            <w:tcMar>
-              <w:top w:type="dxa" w:w="80"/>
-              <w:left w:type="dxa" w:w="120"/>
-              <w:bottom w:type="dxa" w:w="80"/>
-              <w:right w:type="dxa" w:w="120"/>
-            </w:tcMar>
-          </w:tcPr>
-          <w:p>
-            <w:r>
-              <w:rPr>
-                <w:rFonts w:ascii="Calibri" w:cs="Calibri" w:eastAsia="Calibri" w:hAnsi="Calibri"/>
-                <w:b w:val="false"/>
-                <w:bCs w:val="false"/>
-                <w:sz w:val="22"/>
-                <w:szCs w:val="22"/>
-              </w:rPr>
-              <w:t xml:space="preserve">% Often or All the Time</w:t>
-            </w:r>
-          </w:p>
-        </w:tc>
-        <w:tc>
-          <w:tcPr>
-            <w:tcW w:type="auto" w:w="0"/>
-            <w:tcBorders>
-              <w:top w:val="none" w:color="FFFFFF" w:sz="0"/>
-              <w:left w:val="none" w:color="FFFFFF" w:sz="0"/>
-              <w:bottom w:val="none" w:color="FFFFFF" w:sz="0"/>
-              <w:right w:val="none" w:color="FFFFFF" w:sz="0"/>
-            </w:tcBorders>
-            <w:tcMar>
-              <w:top w:type="dxa" w:w="80"/>
-              <w:left w:type="dxa" w:w="120"/>
-              <w:bottom w:type="dxa" w:w="80"/>
-              <w:right w:type="dxa" w:w="120"/>
-            </w:tcMar>
-          </w:tcPr>
-          <w:p>
-            <w:r>
-              <w:rPr>
-                <w:rFonts w:ascii="Calibri" w:cs="Calibri" w:eastAsia="Calibri" w:hAnsi="Calibri"/>
-                <w:b w:val="false"/>
-                <w:bCs w:val="false"/>
-                <w:sz w:val="22"/>
-                <w:szCs w:val="22"/>
-              </w:rPr>
-              <w:t xml:space="preserve">% Often or All the Time</w:t>
+            <w:tcW w:type="dxa" w:w="3900"/>
+            <w:tcBorders>
+              <w:top w:val="none" w:color="FFFFFF" w:sz="0"/>
+              <w:left w:val="none" w:color="FFFFFF" w:sz="0"/>
+              <w:bottom w:val="none" w:color="FFFFFF" w:sz="0"/>
+              <w:right w:val="none" w:color="FFFFFF" w:sz="0"/>
+            </w:tcBorders>
+            <w:shd w:fill="EEF3F8" w:color="auto" w:val="clear"/>
+            <w:tcMar>
+              <w:top w:type="dxa" w:w="80"/>
+              <w:left w:type="dxa" w:w="120"/>
+              <w:bottom w:type="dxa" w:w="80"/>
+              <w:right w:type="dxa" w:w="120"/>
+            </w:tcMar>
+            <w:vAlign w:val="center"/>
+          </w:tcPr>
+          <w:p>
+            <w:r>
+              <w:rPr>
+                <w:rFonts w:ascii="Calibri" w:cs="Calibri" w:eastAsia="Calibri" w:hAnsi="Calibri"/>
+                <w:b w:val="false"/>
+                <w:bCs w:val="false"/>
+                <w:sz w:val="22"/>
+                <w:szCs w:val="22"/>
+              </w:rPr>
+              <w:t xml:space="preserve">n</w:t>
+            </w:r>
+          </w:p>
+        </w:tc>
+        <w:tc>
+          <w:tcPr>
+            <w:tcW w:type="dxa" w:w="910"/>
+            <w:tcBorders>
+              <w:top w:val="none" w:color="FFFFFF" w:sz="0"/>
+              <w:left w:val="none" w:color="FFFFFF" w:sz="0"/>
+              <w:bottom w:val="none" w:color="FFFFFF" w:sz="0"/>
+              <w:right w:val="none" w:color="FFFFFF" w:sz="0"/>
+            </w:tcBorders>
+            <w:shd w:fill="EEF3F8" w:color="auto" w:val="clear"/>
+            <w:tcMar>
+              <w:top w:type="dxa" w:w="80"/>
+              <w:left w:type="dxa" w:w="120"/>
+              <w:bottom w:type="dxa" w:w="80"/>
+              <w:right w:type="dxa" w:w="120"/>
+            </w:tcMar>
+            <w:vAlign w:val="center"/>
+          </w:tcPr>
+          <w:p>
+            <w:pPr>
+              <w:jc w:val="center"/>
+            </w:pPr>
+            <w:r>
+              <w:rPr>
+                <w:rFonts w:ascii="Calibri" w:cs="Calibri" w:eastAsia="Calibri" w:hAnsi="Calibri"/>
+                <w:b w:val="false"/>
+                <w:bCs w:val="false"/>
+                <w:sz w:val="22"/>
+                <w:szCs w:val="22"/>
+              </w:rPr>
+              <w:t xml:space="preserve">n=154</w:t>
+            </w:r>
+          </w:p>
+        </w:tc>
+        <w:tc>
+          <w:tcPr>
+            <w:tcW w:type="dxa" w:w="910"/>
+            <w:tcBorders>
+              <w:top w:val="none" w:color="FFFFFF" w:sz="0"/>
+              <w:left w:val="none" w:color="FFFFFF" w:sz="0"/>
+              <w:bottom w:val="none" w:color="FFFFFF" w:sz="0"/>
+              <w:right w:val="none" w:color="FFFFFF" w:sz="0"/>
+            </w:tcBorders>
+            <w:shd w:fill="EEF3F8" w:color="auto" w:val="clear"/>
+            <w:tcMar>
+              <w:top w:type="dxa" w:w="80"/>
+              <w:left w:type="dxa" w:w="120"/>
+              <w:bottom w:type="dxa" w:w="80"/>
+              <w:right w:type="dxa" w:w="120"/>
+            </w:tcMar>
+            <w:vAlign w:val="center"/>
+          </w:tcPr>
+          <w:p>
+            <w:pPr>
+              <w:jc w:val="center"/>
+            </w:pPr>
+            <w:r>
+              <w:rPr>
+                <w:rFonts w:ascii="Calibri" w:cs="Calibri" w:eastAsia="Calibri" w:hAnsi="Calibri"/>
+                <w:b w:val="false"/>
+                <w:bCs w:val="false"/>
+                <w:sz w:val="22"/>
+                <w:szCs w:val="22"/>
+              </w:rPr>
+              <w:t xml:space="preserve">n=103</w:t>
+            </w:r>
+          </w:p>
+        </w:tc>
+        <w:tc>
+          <w:tcPr>
+            <w:tcW w:type="dxa" w:w="910"/>
+            <w:tcBorders>
+              <w:top w:val="none" w:color="FFFFFF" w:sz="0"/>
+              <w:left w:val="none" w:color="FFFFFF" w:sz="0"/>
+              <w:bottom w:val="none" w:color="FFFFFF" w:sz="0"/>
+              <w:right w:val="none" w:color="FFFFFF" w:sz="0"/>
+            </w:tcBorders>
+            <w:shd w:fill="EEF3F8" w:color="auto" w:val="clear"/>
+            <w:tcMar>
+              <w:top w:type="dxa" w:w="80"/>
+              <w:left w:type="dxa" w:w="120"/>
+              <w:bottom w:type="dxa" w:w="80"/>
+              <w:right w:type="dxa" w:w="120"/>
+            </w:tcMar>
+            <w:vAlign w:val="center"/>
+          </w:tcPr>
+          <w:p>
+            <w:pPr>
+              <w:jc w:val="center"/>
+            </w:pPr>
+            <w:r>
+              <w:rPr>
+                <w:rFonts w:ascii="Calibri" w:cs="Calibri" w:eastAsia="Calibri" w:hAnsi="Calibri"/>
+                <w:b w:val="false"/>
+                <w:bCs w:val="false"/>
+                <w:sz w:val="22"/>
+                <w:szCs w:val="22"/>
+              </w:rPr>
+              <w:t xml:space="preserve">n=128</w:t>
+            </w:r>
+          </w:p>
+        </w:tc>
+        <w:tc>
+          <w:tcPr>
+            <w:tcW w:type="dxa" w:w="910"/>
+            <w:tcBorders>
+              <w:top w:val="none" w:color="FFFFFF" w:sz="0"/>
+              <w:left w:val="none" w:color="FFFFFF" w:sz="0"/>
+              <w:bottom w:val="none" w:color="FFFFFF" w:sz="0"/>
+              <w:right w:val="none" w:color="FFFFFF" w:sz="0"/>
+            </w:tcBorders>
+            <w:shd w:fill="EEF3F8" w:color="auto" w:val="clear"/>
+            <w:tcMar>
+              <w:top w:type="dxa" w:w="80"/>
+              <w:left w:type="dxa" w:w="120"/>
+              <w:bottom w:type="dxa" w:w="80"/>
+              <w:right w:type="dxa" w:w="120"/>
+            </w:tcMar>
+            <w:vAlign w:val="center"/>
+          </w:tcPr>
+          <w:p>
+            <w:pPr>
+              <w:jc w:val="center"/>
+            </w:pPr>
+            <w:r>
+              <w:rPr>
+                <w:rFonts w:ascii="Calibri" w:cs="Calibri" w:eastAsia="Calibri" w:hAnsi="Calibri"/>
+                <w:b w:val="false"/>
+                <w:bCs w:val="false"/>
+                <w:sz w:val="22"/>
+                <w:szCs w:val="22"/>
+              </w:rPr>
+              <w:t xml:space="preserve">n=142</w:t>
+            </w:r>
+          </w:p>
+        </w:tc>
+        <w:tc>
+          <w:tcPr>
+            <w:tcW w:type="dxa" w:w="910"/>
+            <w:tcBorders>
+              <w:top w:val="none" w:color="FFFFFF" w:sz="0"/>
+              <w:left w:val="none" w:color="FFFFFF" w:sz="0"/>
+              <w:bottom w:val="none" w:color="FFFFFF" w:sz="0"/>
+              <w:right w:val="none" w:color="FFFFFF" w:sz="0"/>
+            </w:tcBorders>
+            <w:shd w:fill="EEF3F8" w:color="auto" w:val="clear"/>
+            <w:tcMar>
+              <w:top w:type="dxa" w:w="80"/>
+              <w:left w:type="dxa" w:w="120"/>
+              <w:bottom w:type="dxa" w:w="80"/>
+              <w:right w:type="dxa" w:w="120"/>
+            </w:tcMar>
+            <w:vAlign w:val="center"/>
+          </w:tcPr>
+          <w:p>
+            <w:pPr>
+              <w:jc w:val="center"/>
+            </w:pPr>
+            <w:r>
+              <w:rPr>
+                <w:rFonts w:ascii="Calibri" w:cs="Calibri" w:eastAsia="Calibri" w:hAnsi="Calibri"/>
+                <w:b w:val="false"/>
+                <w:bCs w:val="false"/>
+                <w:sz w:val="22"/>
+                <w:szCs w:val="22"/>
+              </w:rPr>
+              <w:t xml:space="preserve">n=167</w:t>
+            </w:r>
+          </w:p>
+        </w:tc>
+        <w:tc>
+          <w:tcPr>
+            <w:tcW w:type="dxa" w:w="910"/>
+            <w:tcBorders>
+              <w:top w:val="none" w:color="FFFFFF" w:sz="0"/>
+              <w:left w:val="none" w:color="FFFFFF" w:sz="0"/>
+              <w:bottom w:val="none" w:color="FFFFFF" w:sz="0"/>
+              <w:right w:val="none" w:color="FFFFFF" w:sz="0"/>
+            </w:tcBorders>
+            <w:shd w:fill="EEF3F8" w:color="auto" w:val="clear"/>
+            <w:tcMar>
+              <w:top w:type="dxa" w:w="80"/>
+              <w:left w:type="dxa" w:w="120"/>
+              <w:bottom w:type="dxa" w:w="80"/>
+              <w:right w:type="dxa" w:w="120"/>
+            </w:tcMar>
+            <w:vAlign w:val="center"/>
+          </w:tcPr>
+          <w:p>
+            <w:pPr>
+              <w:jc w:val="center"/>
+            </w:pPr>
+            <w:r>
+              <w:rPr>
+                <w:rFonts w:ascii="Calibri" w:cs="Calibri" w:eastAsia="Calibri" w:hAnsi="Calibri"/>
+                <w:b w:val="false"/>
+                <w:bCs w:val="false"/>
+                <w:sz w:val="22"/>
+                <w:szCs w:val="22"/>
+              </w:rPr>
+              <w:t xml:space="preserve">n=204</w:t>
             </w:r>
           </w:p>
         </w:tc>
@@ -5559,204 +5700,229 @@
       <w:tr>
         <w:tc>
           <w:tcPr>
-            <w:tcW w:type="auto" w:w="0"/>
-            <w:tcBorders>
-              <w:top w:val="none" w:color="FFFFFF" w:sz="0"/>
-              <w:left w:val="none" w:color="FFFFFF" w:sz="0"/>
-              <w:bottom w:val="none" w:color="FFFFFF" w:sz="0"/>
-              <w:right w:val="none" w:color="FFFFFF" w:sz="0"/>
-            </w:tcBorders>
-            <w:tcMar>
-              <w:top w:type="dxa" w:w="80"/>
-              <w:left w:type="dxa" w:w="120"/>
-              <w:bottom w:type="dxa" w:w="80"/>
-              <w:right w:type="dxa" w:w="120"/>
-            </w:tcMar>
-          </w:tcPr>
-          <w:p>
-            <w:r>
-              <w:rPr>
-                <w:rFonts w:ascii="Calibri" w:cs="Calibri" w:eastAsia="Calibri" w:hAnsi="Calibri"/>
-                <w:b w:val="false"/>
-                <w:bCs w:val="false"/>
-                <w:sz w:val="22"/>
-                <w:szCs w:val="22"/>
-              </w:rPr>
-              <w:t xml:space="preserve">My Youth Coach…</w:t>
-            </w:r>
-          </w:p>
-        </w:tc>
-        <w:tc>
-          <w:tcPr>
-            <w:tcW w:type="auto" w:w="0"/>
-            <w:tcBorders>
-              <w:top w:val="none" w:color="FFFFFF" w:sz="0"/>
-              <w:left w:val="none" w:color="FFFFFF" w:sz="0"/>
-              <w:bottom w:val="none" w:color="FFFFFF" w:sz="0"/>
-              <w:right w:val="none" w:color="FFFFFF" w:sz="0"/>
-            </w:tcBorders>
-            <w:tcMar>
-              <w:top w:type="dxa" w:w="80"/>
-              <w:left w:type="dxa" w:w="120"/>
-              <w:bottom w:type="dxa" w:w="80"/>
-              <w:right w:type="dxa" w:w="120"/>
-            </w:tcMar>
-          </w:tcPr>
-          <w:p>
-            <w:r>
-              <w:rPr>
-                <w:rFonts w:ascii="Calibri" w:cs="Calibri" w:eastAsia="Calibri" w:hAnsi="Calibri"/>
-                <w:b w:val="false"/>
-                <w:bCs w:val="false"/>
-                <w:sz w:val="22"/>
-                <w:szCs w:val="22"/>
-              </w:rPr>
-              <w:t xml:space="preserve">Sep-19</w:t>
-            </w:r>
-          </w:p>
-        </w:tc>
-        <w:tc>
-          <w:tcPr>
-            <w:tcW w:type="auto" w:w="0"/>
-            <w:tcBorders>
-              <w:top w:val="none" w:color="FFFFFF" w:sz="0"/>
-              <w:left w:val="none" w:color="FFFFFF" w:sz="0"/>
-              <w:bottom w:val="none" w:color="FFFFFF" w:sz="0"/>
-              <w:right w:val="none" w:color="FFFFFF" w:sz="0"/>
-            </w:tcBorders>
-            <w:tcMar>
-              <w:top w:type="dxa" w:w="80"/>
-              <w:left w:type="dxa" w:w="120"/>
-              <w:bottom w:type="dxa" w:w="80"/>
-              <w:right w:type="dxa" w:w="120"/>
-            </w:tcMar>
-          </w:tcPr>
-          <w:p>
-            <w:r>
-              <w:rPr>
-                <w:rFonts w:ascii="Calibri" w:cs="Calibri" w:eastAsia="Calibri" w:hAnsi="Calibri"/>
-                <w:b w:val="false"/>
-                <w:bCs w:val="false"/>
-                <w:sz w:val="22"/>
-                <w:szCs w:val="22"/>
-              </w:rPr>
-              <w:t xml:space="preserve">Mar-22</w:t>
-            </w:r>
-          </w:p>
-        </w:tc>
-        <w:tc>
-          <w:tcPr>
-            <w:tcW w:type="auto" w:w="0"/>
-            <w:tcBorders>
-              <w:top w:val="none" w:color="FFFFFF" w:sz="0"/>
-              <w:left w:val="none" w:color="FFFFFF" w:sz="0"/>
-              <w:bottom w:val="none" w:color="FFFFFF" w:sz="0"/>
-              <w:right w:val="none" w:color="FFFFFF" w:sz="0"/>
-            </w:tcBorders>
-            <w:tcMar>
-              <w:top w:type="dxa" w:w="80"/>
-              <w:left w:type="dxa" w:w="120"/>
-              <w:bottom w:type="dxa" w:w="80"/>
-              <w:right w:type="dxa" w:w="120"/>
-            </w:tcMar>
-          </w:tcPr>
-          <w:p>
-            <w:r>
-              <w:rPr>
-                <w:rFonts w:ascii="Calibri" w:cs="Calibri" w:eastAsia="Calibri" w:hAnsi="Calibri"/>
-                <w:b w:val="false"/>
-                <w:bCs w:val="false"/>
-                <w:sz w:val="22"/>
-                <w:szCs w:val="22"/>
-              </w:rPr>
-              <w:t xml:space="preserve">Feb-23</w:t>
-            </w:r>
-          </w:p>
-        </w:tc>
-        <w:tc>
-          <w:tcPr>
-            <w:tcW w:type="auto" w:w="0"/>
-            <w:tcBorders>
-              <w:top w:val="none" w:color="FFFFFF" w:sz="0"/>
-              <w:left w:val="none" w:color="FFFFFF" w:sz="0"/>
-              <w:bottom w:val="none" w:color="FFFFFF" w:sz="0"/>
-              <w:right w:val="none" w:color="FFFFFF" w:sz="0"/>
-            </w:tcBorders>
-            <w:tcMar>
-              <w:top w:type="dxa" w:w="80"/>
-              <w:left w:type="dxa" w:w="120"/>
-              <w:bottom w:type="dxa" w:w="80"/>
-              <w:right w:type="dxa" w:w="120"/>
-            </w:tcMar>
-          </w:tcPr>
-          <w:p>
-            <w:r>
-              <w:rPr>
-                <w:rFonts w:ascii="Calibri" w:cs="Calibri" w:eastAsia="Calibri" w:hAnsi="Calibri"/>
-                <w:b w:val="false"/>
-                <w:bCs w:val="false"/>
-                <w:sz w:val="22"/>
-                <w:szCs w:val="22"/>
-              </w:rPr>
-              <w:t xml:space="preserve">Feb-24</w:t>
-            </w:r>
-          </w:p>
-        </w:tc>
-        <w:tc>
-          <w:tcPr>
-            <w:tcW w:type="auto" w:w="0"/>
-            <w:tcBorders>
-              <w:top w:val="none" w:color="FFFFFF" w:sz="0"/>
-              <w:left w:val="none" w:color="FFFFFF" w:sz="0"/>
-              <w:bottom w:val="none" w:color="FFFFFF" w:sz="0"/>
-              <w:right w:val="none" w:color="FFFFFF" w:sz="0"/>
-            </w:tcBorders>
-            <w:tcMar>
-              <w:top w:type="dxa" w:w="80"/>
-              <w:left w:type="dxa" w:w="120"/>
-              <w:bottom w:type="dxa" w:w="80"/>
-              <w:right w:type="dxa" w:w="120"/>
-            </w:tcMar>
-          </w:tcPr>
-          <w:p>
-            <w:r>
-              <w:rPr>
-                <w:rFonts w:ascii="Calibri" w:cs="Calibri" w:eastAsia="Calibri" w:hAnsi="Calibri"/>
-                <w:b w:val="false"/>
-                <w:bCs w:val="false"/>
-                <w:sz w:val="22"/>
-                <w:szCs w:val="22"/>
-              </w:rPr>
-              <w:t xml:space="preserve">Feb-25</w:t>
-            </w:r>
-          </w:p>
-        </w:tc>
-        <w:tc>
-          <w:tcPr>
-            <w:tcW w:type="auto" w:w="0"/>
-            <w:tcBorders>
-              <w:top w:val="none" w:color="FFFFFF" w:sz="0"/>
-              <w:left w:val="none" w:color="FFFFFF" w:sz="0"/>
-              <w:bottom w:val="none" w:color="FFFFFF" w:sz="0"/>
-              <w:right w:val="none" w:color="FFFFFF" w:sz="0"/>
-            </w:tcBorders>
-            <w:tcMar>
-              <w:top w:type="dxa" w:w="80"/>
-              <w:left w:type="dxa" w:w="120"/>
-              <w:bottom w:type="dxa" w:w="80"/>
-              <w:right w:type="dxa" w:w="120"/>
-            </w:tcMar>
-          </w:tcPr>
-          <w:p>
-            <w:r>
-              <w:rPr>
-                <w:rFonts w:ascii="Calibri" w:cs="Calibri" w:eastAsia="Calibri" w:hAnsi="Calibri"/>
-                <w:b w:val="false"/>
-                <w:bCs w:val="false"/>
-                <w:sz w:val="22"/>
-                <w:szCs w:val="22"/>
-              </w:rPr>
-              <w:t xml:space="preserve">Mar-26</w:t>
+            <w:tcW w:type="dxa" w:w="3900"/>
+            <w:tcBorders>
+              <w:top w:val="none" w:color="FFFFFF" w:sz="0"/>
+              <w:left w:val="none" w:color="FFFFFF" w:sz="0"/>
+              <w:bottom w:val="none" w:color="FFFFFF" w:sz="0"/>
+              <w:right w:val="none" w:color="FFFFFF" w:sz="0"/>
+            </w:tcBorders>
+            <w:tcMar>
+              <w:top w:type="dxa" w:w="80"/>
+              <w:left w:type="dxa" w:w="120"/>
+              <w:bottom w:type="dxa" w:w="80"/>
+              <w:right w:type="dxa" w:w="120"/>
+            </w:tcMar>
+            <w:vAlign w:val="center"/>
+          </w:tcPr>
+          <w:p>
+            <w:r>
+              <w:rPr>
+                <w:rFonts w:ascii="Calibri" w:cs="Calibri" w:eastAsia="Calibri" w:hAnsi="Calibri"/>
+                <w:b w:val="false"/>
+                <w:bCs w:val="false"/>
+                <w:sz w:val="22"/>
+                <w:szCs w:val="22"/>
+              </w:rPr>
+              <w:t xml:space="preserve">Is trustworthy</w:t>
+            </w:r>
+          </w:p>
+        </w:tc>
+        <w:tc>
+          <w:tcPr>
+            <w:tcW w:type="dxa" w:w="910"/>
+            <w:tcBorders>
+              <w:top w:val="none" w:color="FFFFFF" w:sz="0"/>
+              <w:left w:val="none" w:color="FFFFFF" w:sz="0"/>
+              <w:bottom w:val="none" w:color="FFFFFF" w:sz="0"/>
+              <w:right w:val="none" w:color="FFFFFF" w:sz="0"/>
+            </w:tcBorders>
+            <w:tcMar>
+              <w:top w:type="dxa" w:w="80"/>
+              <w:left w:type="dxa" w:w="120"/>
+              <w:bottom w:type="dxa" w:w="80"/>
+              <w:right w:type="dxa" w:w="120"/>
+            </w:tcMar>
+            <w:vAlign w:val="center"/>
+          </w:tcPr>
+          <w:p>
+            <w:pPr>
+              <w:jc w:val="center"/>
+            </w:pPr>
+            <w:r>
+              <w:rPr>
+                <w:rFonts w:ascii="Calibri" w:cs="Calibri" w:eastAsia="Calibri" w:hAnsi="Calibri"/>
+                <w:b w:val="false"/>
+                <w:bCs w:val="false"/>
+                <w:sz w:val="22"/>
+                <w:szCs w:val="22"/>
+              </w:rPr>
+              <w:t xml:space="preserve">94%</w:t>
+            </w:r>
+          </w:p>
+        </w:tc>
+        <w:tc>
+          <w:tcPr>
+            <w:tcW w:type="dxa" w:w="910"/>
+            <w:tcBorders>
+              <w:top w:val="none" w:color="FFFFFF" w:sz="0"/>
+              <w:left w:val="none" w:color="FFFFFF" w:sz="0"/>
+              <w:bottom w:val="none" w:color="FFFFFF" w:sz="0"/>
+              <w:right w:val="none" w:color="FFFFFF" w:sz="0"/>
+            </w:tcBorders>
+            <w:tcMar>
+              <w:top w:type="dxa" w:w="80"/>
+              <w:left w:type="dxa" w:w="120"/>
+              <w:bottom w:type="dxa" w:w="80"/>
+              <w:right w:type="dxa" w:w="120"/>
+            </w:tcMar>
+            <w:vAlign w:val="center"/>
+          </w:tcPr>
+          <w:p>
+            <w:pPr>
+              <w:jc w:val="center"/>
+            </w:pPr>
+            <w:r>
+              <w:rPr>
+                <w:rFonts w:ascii="Calibri" w:cs="Calibri" w:eastAsia="Calibri" w:hAnsi="Calibri"/>
+                <w:b w:val="false"/>
+                <w:bCs w:val="false"/>
+                <w:sz w:val="22"/>
+                <w:szCs w:val="22"/>
+              </w:rPr>
+              <w:t xml:space="preserve">91%</w:t>
+            </w:r>
+          </w:p>
+        </w:tc>
+        <w:tc>
+          <w:tcPr>
+            <w:tcW w:type="dxa" w:w="910"/>
+            <w:tcBorders>
+              <w:top w:val="none" w:color="FFFFFF" w:sz="0"/>
+              <w:left w:val="none" w:color="FFFFFF" w:sz="0"/>
+              <w:bottom w:val="none" w:color="FFFFFF" w:sz="0"/>
+              <w:right w:val="none" w:color="FFFFFF" w:sz="0"/>
+            </w:tcBorders>
+            <w:tcMar>
+              <w:top w:type="dxa" w:w="80"/>
+              <w:left w:type="dxa" w:w="120"/>
+              <w:bottom w:type="dxa" w:w="80"/>
+              <w:right w:type="dxa" w:w="120"/>
+            </w:tcMar>
+            <w:vAlign w:val="center"/>
+          </w:tcPr>
+          <w:p>
+            <w:pPr>
+              <w:jc w:val="center"/>
+            </w:pPr>
+            <w:r>
+              <w:rPr>
+                <w:rFonts w:ascii="Calibri" w:cs="Calibri" w:eastAsia="Calibri" w:hAnsi="Calibri"/>
+                <w:b w:val="false"/>
+                <w:bCs w:val="false"/>
+                <w:sz w:val="22"/>
+                <w:szCs w:val="22"/>
+              </w:rPr>
+              <w:t xml:space="preserve">95%</w:t>
+            </w:r>
+          </w:p>
+        </w:tc>
+        <w:tc>
+          <w:tcPr>
+            <w:tcW w:type="dxa" w:w="910"/>
+            <w:tcBorders>
+              <w:top w:val="none" w:color="FFFFFF" w:sz="0"/>
+              <w:left w:val="none" w:color="FFFFFF" w:sz="0"/>
+              <w:bottom w:val="none" w:color="FFFFFF" w:sz="0"/>
+              <w:right w:val="none" w:color="FFFFFF" w:sz="0"/>
+            </w:tcBorders>
+            <w:tcMar>
+              <w:top w:type="dxa" w:w="80"/>
+              <w:left w:type="dxa" w:w="120"/>
+              <w:bottom w:type="dxa" w:w="80"/>
+              <w:right w:type="dxa" w:w="120"/>
+            </w:tcMar>
+            <w:vAlign w:val="center"/>
+          </w:tcPr>
+          <w:p>
+            <w:pPr>
+              <w:jc w:val="center"/>
+            </w:pPr>
+            <w:r>
+              <w:rPr>
+                <w:rFonts w:ascii="Calibri" w:cs="Calibri" w:eastAsia="Calibri" w:hAnsi="Calibri"/>
+                <w:b w:val="false"/>
+                <w:bCs w:val="false"/>
+                <w:sz w:val="22"/>
+                <w:szCs w:val="22"/>
+              </w:rPr>
+              <w:t xml:space="preserve">95%</w:t>
+            </w:r>
+          </w:p>
+        </w:tc>
+        <w:tc>
+          <w:tcPr>
+            <w:tcW w:type="dxa" w:w="910"/>
+            <w:tcBorders>
+              <w:top w:val="none" w:color="FFFFFF" w:sz="0"/>
+              <w:left w:val="none" w:color="FFFFFF" w:sz="0"/>
+              <w:bottom w:val="none" w:color="FFFFFF" w:sz="0"/>
+              <w:right w:val="none" w:color="FFFFFF" w:sz="0"/>
+            </w:tcBorders>
+            <w:tcMar>
+              <w:top w:type="dxa" w:w="80"/>
+              <w:left w:type="dxa" w:w="120"/>
+              <w:bottom w:type="dxa" w:w="80"/>
+              <w:right w:type="dxa" w:w="120"/>
+            </w:tcMar>
+            <w:vAlign w:val="center"/>
+          </w:tcPr>
+          <w:p>
+            <w:pPr>
+              <w:jc w:val="center"/>
+            </w:pPr>
+            <w:r>
+              <w:rPr>
+                <w:rFonts w:ascii="Calibri" w:cs="Calibri" w:eastAsia="Calibri" w:hAnsi="Calibri"/>
+                <w:b w:val="false"/>
+                <w:bCs w:val="false"/>
+                <w:sz w:val="22"/>
+                <w:szCs w:val="22"/>
+              </w:rPr>
+              <w:t xml:space="preserve">90%</w:t>
+            </w:r>
+          </w:p>
+        </w:tc>
+        <w:tc>
+          <w:tcPr>
+            <w:tcW w:type="dxa" w:w="910"/>
+            <w:tcBorders>
+              <w:top w:val="none" w:color="FFFFFF" w:sz="0"/>
+              <w:left w:val="none" w:color="FFFFFF" w:sz="0"/>
+              <w:bottom w:val="none" w:color="FFFFFF" w:sz="0"/>
+              <w:right w:val="none" w:color="FFFFFF" w:sz="0"/>
+            </w:tcBorders>
+            <w:tcMar>
+              <w:top w:type="dxa" w:w="80"/>
+              <w:left w:type="dxa" w:w="120"/>
+              <w:bottom w:type="dxa" w:w="80"/>
+              <w:right w:type="dxa" w:w="120"/>
+            </w:tcMar>
+            <w:vAlign w:val="center"/>
+          </w:tcPr>
+          <w:p>
+            <w:pPr>
+              <w:jc w:val="center"/>
+            </w:pPr>
+            <w:r>
+              <w:rPr>
+                <w:rFonts w:ascii="Calibri" w:cs="Calibri" w:eastAsia="Calibri" w:hAnsi="Calibri"/>
+                <w:b w:val="false"/>
+                <w:bCs w:val="false"/>
+                <w:sz w:val="22"/>
+                <w:szCs w:val="22"/>
+              </w:rPr>
+              <w:t xml:space="preserve">90%</w:t>
             </w:r>
           </w:p>
         </w:tc>
@@ -5764,204 +5930,229 @@
       <w:tr>
         <w:tc>
           <w:tcPr>
-            <w:tcW w:type="auto" w:w="0"/>
-            <w:tcBorders>
-              <w:top w:val="none" w:color="FFFFFF" w:sz="0"/>
-              <w:left w:val="none" w:color="FFFFFF" w:sz="0"/>
-              <w:bottom w:val="none" w:color="FFFFFF" w:sz="0"/>
-              <w:right w:val="none" w:color="FFFFFF" w:sz="0"/>
-            </w:tcBorders>
-            <w:tcMar>
-              <w:top w:type="dxa" w:w="80"/>
-              <w:left w:type="dxa" w:w="120"/>
-              <w:bottom w:type="dxa" w:w="80"/>
-              <w:right w:type="dxa" w:w="120"/>
-            </w:tcMar>
-          </w:tcPr>
-          <w:p>
-            <w:r>
-              <w:rPr>
-                <w:rFonts w:ascii="Calibri" w:cs="Calibri" w:eastAsia="Calibri" w:hAnsi="Calibri"/>
-                <w:b w:val="false"/>
-                <w:bCs w:val="false"/>
-                <w:sz w:val="22"/>
-                <w:szCs w:val="22"/>
-              </w:rPr>
-              <w:t xml:space="preserve">My Youth Coach…</w:t>
-            </w:r>
-          </w:p>
-        </w:tc>
-        <w:tc>
-          <w:tcPr>
-            <w:tcW w:type="auto" w:w="0"/>
-            <w:tcBorders>
-              <w:top w:val="none" w:color="FFFFFF" w:sz="0"/>
-              <w:left w:val="none" w:color="FFFFFF" w:sz="0"/>
-              <w:bottom w:val="none" w:color="FFFFFF" w:sz="0"/>
-              <w:right w:val="none" w:color="FFFFFF" w:sz="0"/>
-            </w:tcBorders>
-            <w:tcMar>
-              <w:top w:type="dxa" w:w="80"/>
-              <w:left w:type="dxa" w:w="120"/>
-              <w:bottom w:type="dxa" w:w="80"/>
-              <w:right w:type="dxa" w:w="120"/>
-            </w:tcMar>
-          </w:tcPr>
-          <w:p>
-            <w:r>
-              <w:rPr>
-                <w:rFonts w:ascii="Calibri" w:cs="Calibri" w:eastAsia="Calibri" w:hAnsi="Calibri"/>
-                <w:b w:val="false"/>
-                <w:bCs w:val="false"/>
-                <w:sz w:val="22"/>
-                <w:szCs w:val="22"/>
-              </w:rPr>
-              <w:t xml:space="preserve">n=154</w:t>
-            </w:r>
-          </w:p>
-        </w:tc>
-        <w:tc>
-          <w:tcPr>
-            <w:tcW w:type="auto" w:w="0"/>
-            <w:tcBorders>
-              <w:top w:val="none" w:color="FFFFFF" w:sz="0"/>
-              <w:left w:val="none" w:color="FFFFFF" w:sz="0"/>
-              <w:bottom w:val="none" w:color="FFFFFF" w:sz="0"/>
-              <w:right w:val="none" w:color="FFFFFF" w:sz="0"/>
-            </w:tcBorders>
-            <w:tcMar>
-              <w:top w:type="dxa" w:w="80"/>
-              <w:left w:type="dxa" w:w="120"/>
-              <w:bottom w:type="dxa" w:w="80"/>
-              <w:right w:type="dxa" w:w="120"/>
-            </w:tcMar>
-          </w:tcPr>
-          <w:p>
-            <w:r>
-              <w:rPr>
-                <w:rFonts w:ascii="Calibri" w:cs="Calibri" w:eastAsia="Calibri" w:hAnsi="Calibri"/>
-                <w:b w:val="false"/>
-                <w:bCs w:val="false"/>
-                <w:sz w:val="22"/>
-                <w:szCs w:val="22"/>
-              </w:rPr>
-              <w:t xml:space="preserve">n=103</w:t>
-            </w:r>
-          </w:p>
-        </w:tc>
-        <w:tc>
-          <w:tcPr>
-            <w:tcW w:type="auto" w:w="0"/>
-            <w:tcBorders>
-              <w:top w:val="none" w:color="FFFFFF" w:sz="0"/>
-              <w:left w:val="none" w:color="FFFFFF" w:sz="0"/>
-              <w:bottom w:val="none" w:color="FFFFFF" w:sz="0"/>
-              <w:right w:val="none" w:color="FFFFFF" w:sz="0"/>
-            </w:tcBorders>
-            <w:tcMar>
-              <w:top w:type="dxa" w:w="80"/>
-              <w:left w:type="dxa" w:w="120"/>
-              <w:bottom w:type="dxa" w:w="80"/>
-              <w:right w:type="dxa" w:w="120"/>
-            </w:tcMar>
-          </w:tcPr>
-          <w:p>
-            <w:r>
-              <w:rPr>
-                <w:rFonts w:ascii="Calibri" w:cs="Calibri" w:eastAsia="Calibri" w:hAnsi="Calibri"/>
-                <w:b w:val="false"/>
-                <w:bCs w:val="false"/>
-                <w:sz w:val="22"/>
-                <w:szCs w:val="22"/>
-              </w:rPr>
-              <w:t xml:space="preserve">n=128</w:t>
-            </w:r>
-          </w:p>
-        </w:tc>
-        <w:tc>
-          <w:tcPr>
-            <w:tcW w:type="auto" w:w="0"/>
-            <w:tcBorders>
-              <w:top w:val="none" w:color="FFFFFF" w:sz="0"/>
-              <w:left w:val="none" w:color="FFFFFF" w:sz="0"/>
-              <w:bottom w:val="none" w:color="FFFFFF" w:sz="0"/>
-              <w:right w:val="none" w:color="FFFFFF" w:sz="0"/>
-            </w:tcBorders>
-            <w:tcMar>
-              <w:top w:type="dxa" w:w="80"/>
-              <w:left w:type="dxa" w:w="120"/>
-              <w:bottom w:type="dxa" w:w="80"/>
-              <w:right w:type="dxa" w:w="120"/>
-            </w:tcMar>
-          </w:tcPr>
-          <w:p>
-            <w:r>
-              <w:rPr>
-                <w:rFonts w:ascii="Calibri" w:cs="Calibri" w:eastAsia="Calibri" w:hAnsi="Calibri"/>
-                <w:b w:val="false"/>
-                <w:bCs w:val="false"/>
-                <w:sz w:val="22"/>
-                <w:szCs w:val="22"/>
-              </w:rPr>
-              <w:t xml:space="preserve">n=142</w:t>
-            </w:r>
-          </w:p>
-        </w:tc>
-        <w:tc>
-          <w:tcPr>
-            <w:tcW w:type="auto" w:w="0"/>
-            <w:tcBorders>
-              <w:top w:val="none" w:color="FFFFFF" w:sz="0"/>
-              <w:left w:val="none" w:color="FFFFFF" w:sz="0"/>
-              <w:bottom w:val="none" w:color="FFFFFF" w:sz="0"/>
-              <w:right w:val="none" w:color="FFFFFF" w:sz="0"/>
-            </w:tcBorders>
-            <w:tcMar>
-              <w:top w:type="dxa" w:w="80"/>
-              <w:left w:type="dxa" w:w="120"/>
-              <w:bottom w:type="dxa" w:w="80"/>
-              <w:right w:type="dxa" w:w="120"/>
-            </w:tcMar>
-          </w:tcPr>
-          <w:p>
-            <w:r>
-              <w:rPr>
-                <w:rFonts w:ascii="Calibri" w:cs="Calibri" w:eastAsia="Calibri" w:hAnsi="Calibri"/>
-                <w:b w:val="false"/>
-                <w:bCs w:val="false"/>
-                <w:sz w:val="22"/>
-                <w:szCs w:val="22"/>
-              </w:rPr>
-              <w:t xml:space="preserve">n=167</w:t>
-            </w:r>
-          </w:p>
-        </w:tc>
-        <w:tc>
-          <w:tcPr>
-            <w:tcW w:type="auto" w:w="0"/>
-            <w:tcBorders>
-              <w:top w:val="none" w:color="FFFFFF" w:sz="0"/>
-              <w:left w:val="none" w:color="FFFFFF" w:sz="0"/>
-              <w:bottom w:val="none" w:color="FFFFFF" w:sz="0"/>
-              <w:right w:val="none" w:color="FFFFFF" w:sz="0"/>
-            </w:tcBorders>
-            <w:tcMar>
-              <w:top w:type="dxa" w:w="80"/>
-              <w:left w:type="dxa" w:w="120"/>
-              <w:bottom w:type="dxa" w:w="80"/>
-              <w:right w:type="dxa" w:w="120"/>
-            </w:tcMar>
-          </w:tcPr>
-          <w:p>
-            <w:r>
-              <w:rPr>
-                <w:rFonts w:ascii="Calibri" w:cs="Calibri" w:eastAsia="Calibri" w:hAnsi="Calibri"/>
-                <w:b w:val="false"/>
-                <w:bCs w:val="false"/>
-                <w:sz w:val="22"/>
-                <w:szCs w:val="22"/>
-              </w:rPr>
-              <w:t xml:space="preserve">n=204</w:t>
+            <w:tcW w:type="dxa" w:w="3900"/>
+            <w:tcBorders>
+              <w:top w:val="none" w:color="FFFFFF" w:sz="0"/>
+              <w:left w:val="none" w:color="FFFFFF" w:sz="0"/>
+              <w:bottom w:val="none" w:color="FFFFFF" w:sz="0"/>
+              <w:right w:val="none" w:color="FFFFFF" w:sz="0"/>
+            </w:tcBorders>
+            <w:tcMar>
+              <w:top w:type="dxa" w:w="80"/>
+              <w:left w:type="dxa" w:w="120"/>
+              <w:bottom w:type="dxa" w:w="80"/>
+              <w:right w:type="dxa" w:w="120"/>
+            </w:tcMar>
+            <w:vAlign w:val="center"/>
+          </w:tcPr>
+          <w:p>
+            <w:r>
+              <w:rPr>
+                <w:rFonts w:ascii="Calibri" w:cs="Calibri" w:eastAsia="Calibri" w:hAnsi="Calibri"/>
+                <w:b w:val="false"/>
+                <w:bCs w:val="false"/>
+                <w:sz w:val="22"/>
+                <w:szCs w:val="22"/>
+              </w:rPr>
+              <w:t xml:space="preserve">Is reliable</w:t>
+            </w:r>
+          </w:p>
+        </w:tc>
+        <w:tc>
+          <w:tcPr>
+            <w:tcW w:type="dxa" w:w="910"/>
+            <w:tcBorders>
+              <w:top w:val="none" w:color="FFFFFF" w:sz="0"/>
+              <w:left w:val="none" w:color="FFFFFF" w:sz="0"/>
+              <w:bottom w:val="none" w:color="FFFFFF" w:sz="0"/>
+              <w:right w:val="none" w:color="FFFFFF" w:sz="0"/>
+            </w:tcBorders>
+            <w:tcMar>
+              <w:top w:type="dxa" w:w="80"/>
+              <w:left w:type="dxa" w:w="120"/>
+              <w:bottom w:type="dxa" w:w="80"/>
+              <w:right w:type="dxa" w:w="120"/>
+            </w:tcMar>
+            <w:vAlign w:val="center"/>
+          </w:tcPr>
+          <w:p>
+            <w:pPr>
+              <w:jc w:val="center"/>
+            </w:pPr>
+            <w:r>
+              <w:rPr>
+                <w:rFonts w:ascii="Calibri" w:cs="Calibri" w:eastAsia="Calibri" w:hAnsi="Calibri"/>
+                <w:b w:val="false"/>
+                <w:bCs w:val="false"/>
+                <w:sz w:val="22"/>
+                <w:szCs w:val="22"/>
+              </w:rPr>
+              <w:t xml:space="preserve">92%</w:t>
+            </w:r>
+          </w:p>
+        </w:tc>
+        <w:tc>
+          <w:tcPr>
+            <w:tcW w:type="dxa" w:w="910"/>
+            <w:tcBorders>
+              <w:top w:val="none" w:color="FFFFFF" w:sz="0"/>
+              <w:left w:val="none" w:color="FFFFFF" w:sz="0"/>
+              <w:bottom w:val="none" w:color="FFFFFF" w:sz="0"/>
+              <w:right w:val="none" w:color="FFFFFF" w:sz="0"/>
+            </w:tcBorders>
+            <w:tcMar>
+              <w:top w:type="dxa" w:w="80"/>
+              <w:left w:type="dxa" w:w="120"/>
+              <w:bottom w:type="dxa" w:w="80"/>
+              <w:right w:type="dxa" w:w="120"/>
+            </w:tcMar>
+            <w:vAlign w:val="center"/>
+          </w:tcPr>
+          <w:p>
+            <w:pPr>
+              <w:jc w:val="center"/>
+            </w:pPr>
+            <w:r>
+              <w:rPr>
+                <w:rFonts w:ascii="Calibri" w:cs="Calibri" w:eastAsia="Calibri" w:hAnsi="Calibri"/>
+                <w:b w:val="false"/>
+                <w:bCs w:val="false"/>
+                <w:sz w:val="22"/>
+                <w:szCs w:val="22"/>
+              </w:rPr>
+              <w:t xml:space="preserve">90%</w:t>
+            </w:r>
+          </w:p>
+        </w:tc>
+        <w:tc>
+          <w:tcPr>
+            <w:tcW w:type="dxa" w:w="910"/>
+            <w:tcBorders>
+              <w:top w:val="none" w:color="FFFFFF" w:sz="0"/>
+              <w:left w:val="none" w:color="FFFFFF" w:sz="0"/>
+              <w:bottom w:val="none" w:color="FFFFFF" w:sz="0"/>
+              <w:right w:val="none" w:color="FFFFFF" w:sz="0"/>
+            </w:tcBorders>
+            <w:tcMar>
+              <w:top w:type="dxa" w:w="80"/>
+              <w:left w:type="dxa" w:w="120"/>
+              <w:bottom w:type="dxa" w:w="80"/>
+              <w:right w:type="dxa" w:w="120"/>
+            </w:tcMar>
+            <w:vAlign w:val="center"/>
+          </w:tcPr>
+          <w:p>
+            <w:pPr>
+              <w:jc w:val="center"/>
+            </w:pPr>
+            <w:r>
+              <w:rPr>
+                <w:rFonts w:ascii="Calibri" w:cs="Calibri" w:eastAsia="Calibri" w:hAnsi="Calibri"/>
+                <w:b w:val="false"/>
+                <w:bCs w:val="false"/>
+                <w:sz w:val="22"/>
+                <w:szCs w:val="22"/>
+              </w:rPr>
+              <w:t xml:space="preserve">88%</w:t>
+            </w:r>
+          </w:p>
+        </w:tc>
+        <w:tc>
+          <w:tcPr>
+            <w:tcW w:type="dxa" w:w="910"/>
+            <w:tcBorders>
+              <w:top w:val="none" w:color="FFFFFF" w:sz="0"/>
+              <w:left w:val="none" w:color="FFFFFF" w:sz="0"/>
+              <w:bottom w:val="none" w:color="FFFFFF" w:sz="0"/>
+              <w:right w:val="none" w:color="FFFFFF" w:sz="0"/>
+            </w:tcBorders>
+            <w:tcMar>
+              <w:top w:type="dxa" w:w="80"/>
+              <w:left w:type="dxa" w:w="120"/>
+              <w:bottom w:type="dxa" w:w="80"/>
+              <w:right w:type="dxa" w:w="120"/>
+            </w:tcMar>
+            <w:vAlign w:val="center"/>
+          </w:tcPr>
+          <w:p>
+            <w:pPr>
+              <w:jc w:val="center"/>
+            </w:pPr>
+            <w:r>
+              <w:rPr>
+                <w:rFonts w:ascii="Calibri" w:cs="Calibri" w:eastAsia="Calibri" w:hAnsi="Calibri"/>
+                <w:b w:val="false"/>
+                <w:bCs w:val="false"/>
+                <w:sz w:val="22"/>
+                <w:szCs w:val="22"/>
+              </w:rPr>
+              <w:t xml:space="preserve">93%</w:t>
+            </w:r>
+          </w:p>
+        </w:tc>
+        <w:tc>
+          <w:tcPr>
+            <w:tcW w:type="dxa" w:w="910"/>
+            <w:tcBorders>
+              <w:top w:val="none" w:color="FFFFFF" w:sz="0"/>
+              <w:left w:val="none" w:color="FFFFFF" w:sz="0"/>
+              <w:bottom w:val="none" w:color="FFFFFF" w:sz="0"/>
+              <w:right w:val="none" w:color="FFFFFF" w:sz="0"/>
+            </w:tcBorders>
+            <w:tcMar>
+              <w:top w:type="dxa" w:w="80"/>
+              <w:left w:type="dxa" w:w="120"/>
+              <w:bottom w:type="dxa" w:w="80"/>
+              <w:right w:type="dxa" w:w="120"/>
+            </w:tcMar>
+            <w:vAlign w:val="center"/>
+          </w:tcPr>
+          <w:p>
+            <w:pPr>
+              <w:jc w:val="center"/>
+            </w:pPr>
+            <w:r>
+              <w:rPr>
+                <w:rFonts w:ascii="Calibri" w:cs="Calibri" w:eastAsia="Calibri" w:hAnsi="Calibri"/>
+                <w:b w:val="false"/>
+                <w:bCs w:val="false"/>
+                <w:sz w:val="22"/>
+                <w:szCs w:val="22"/>
+              </w:rPr>
+              <w:t xml:space="preserve">89%</w:t>
+            </w:r>
+          </w:p>
+        </w:tc>
+        <w:tc>
+          <w:tcPr>
+            <w:tcW w:type="dxa" w:w="910"/>
+            <w:tcBorders>
+              <w:top w:val="none" w:color="FFFFFF" w:sz="0"/>
+              <w:left w:val="none" w:color="FFFFFF" w:sz="0"/>
+              <w:bottom w:val="none" w:color="FFFFFF" w:sz="0"/>
+              <w:right w:val="none" w:color="FFFFFF" w:sz="0"/>
+            </w:tcBorders>
+            <w:tcMar>
+              <w:top w:type="dxa" w:w="80"/>
+              <w:left w:type="dxa" w:w="120"/>
+              <w:bottom w:type="dxa" w:w="80"/>
+              <w:right w:type="dxa" w:w="120"/>
+            </w:tcMar>
+            <w:vAlign w:val="center"/>
+          </w:tcPr>
+          <w:p>
+            <w:pPr>
+              <w:jc w:val="center"/>
+            </w:pPr>
+            <w:r>
+              <w:rPr>
+                <w:rFonts w:ascii="Calibri" w:cs="Calibri" w:eastAsia="Calibri" w:hAnsi="Calibri"/>
+                <w:b w:val="false"/>
+                <w:bCs w:val="false"/>
+                <w:sz w:val="22"/>
+                <w:szCs w:val="22"/>
+              </w:rPr>
+              <w:t xml:space="preserve">84%</w:t>
             </w:r>
           </w:p>
         </w:tc>
@@ -5969,50 +6160,55 @@
       <w:tr>
         <w:tc>
           <w:tcPr>
-            <w:tcW w:type="auto" w:w="0"/>
-            <w:tcBorders>
-              <w:top w:val="none" w:color="FFFFFF" w:sz="0"/>
-              <w:left w:val="none" w:color="FFFFFF" w:sz="0"/>
-              <w:bottom w:val="none" w:color="FFFFFF" w:sz="0"/>
-              <w:right w:val="none" w:color="FFFFFF" w:sz="0"/>
-            </w:tcBorders>
-            <w:tcMar>
-              <w:top w:type="dxa" w:w="80"/>
-              <w:left w:type="dxa" w:w="120"/>
-              <w:bottom w:type="dxa" w:w="80"/>
-              <w:right w:type="dxa" w:w="120"/>
-            </w:tcMar>
-          </w:tcPr>
-          <w:p>
-            <w:r>
-              <w:rPr>
-                <w:rFonts w:ascii="Calibri" w:cs="Calibri" w:eastAsia="Calibri" w:hAnsi="Calibri"/>
-                <w:b w:val="false"/>
-                <w:bCs w:val="false"/>
-                <w:sz w:val="22"/>
-                <w:szCs w:val="22"/>
-              </w:rPr>
-              <w:t xml:space="preserve">Is trustworthy</w:t>
-            </w:r>
-          </w:p>
-        </w:tc>
-        <w:tc>
-          <w:tcPr>
-            <w:tcW w:type="auto" w:w="0"/>
-            <w:tcBorders>
-              <w:top w:val="none" w:color="FFFFFF" w:sz="0"/>
-              <w:left w:val="none" w:color="FFFFFF" w:sz="0"/>
-              <w:bottom w:val="none" w:color="FFFFFF" w:sz="0"/>
-              <w:right w:val="none" w:color="FFFFFF" w:sz="0"/>
-            </w:tcBorders>
-            <w:tcMar>
-              <w:top w:type="dxa" w:w="80"/>
-              <w:left w:type="dxa" w:w="120"/>
-              <w:bottom w:type="dxa" w:w="80"/>
-              <w:right w:type="dxa" w:w="120"/>
-            </w:tcMar>
-          </w:tcPr>
-          <w:p>
+            <w:tcW w:type="dxa" w:w="3900"/>
+            <w:tcBorders>
+              <w:top w:val="none" w:color="FFFFFF" w:sz="0"/>
+              <w:left w:val="none" w:color="FFFFFF" w:sz="0"/>
+              <w:bottom w:val="none" w:color="FFFFFF" w:sz="0"/>
+              <w:right w:val="none" w:color="FFFFFF" w:sz="0"/>
+            </w:tcBorders>
+            <w:tcMar>
+              <w:top w:type="dxa" w:w="80"/>
+              <w:left w:type="dxa" w:w="120"/>
+              <w:bottom w:type="dxa" w:w="80"/>
+              <w:right w:type="dxa" w:w="120"/>
+            </w:tcMar>
+            <w:vAlign w:val="center"/>
+          </w:tcPr>
+          <w:p>
+            <w:r>
+              <w:rPr>
+                <w:rFonts w:ascii="Calibri" w:cs="Calibri" w:eastAsia="Calibri" w:hAnsi="Calibri"/>
+                <w:b w:val="false"/>
+                <w:bCs w:val="false"/>
+                <w:sz w:val="22"/>
+                <w:szCs w:val="22"/>
+              </w:rPr>
+              <w:t xml:space="preserve">Values my opinions about my life</w:t>
+            </w:r>
+          </w:p>
+        </w:tc>
+        <w:tc>
+          <w:tcPr>
+            <w:tcW w:type="dxa" w:w="910"/>
+            <w:tcBorders>
+              <w:top w:val="none" w:color="FFFFFF" w:sz="0"/>
+              <w:left w:val="none" w:color="FFFFFF" w:sz="0"/>
+              <w:bottom w:val="none" w:color="FFFFFF" w:sz="0"/>
+              <w:right w:val="none" w:color="FFFFFF" w:sz="0"/>
+            </w:tcBorders>
+            <w:tcMar>
+              <w:top w:type="dxa" w:w="80"/>
+              <w:left w:type="dxa" w:w="120"/>
+              <w:bottom w:type="dxa" w:w="80"/>
+              <w:right w:type="dxa" w:w="120"/>
+            </w:tcMar>
+            <w:vAlign w:val="center"/>
+          </w:tcPr>
+          <w:p>
+            <w:pPr>
+              <w:jc w:val="center"/>
+            </w:pPr>
             <w:r>
               <w:rPr>
                 <w:rFonts w:ascii="Calibri" w:cs="Calibri" w:eastAsia="Calibri" w:hAnsi="Calibri"/>
@@ -6027,21 +6223,25 @@
         </w:tc>
         <w:tc>
           <w:tcPr>
-            <w:tcW w:type="auto" w:w="0"/>
-            <w:tcBorders>
-              <w:top w:val="none" w:color="FFFFFF" w:sz="0"/>
-              <w:left w:val="none" w:color="FFFFFF" w:sz="0"/>
-              <w:bottom w:val="none" w:color="FFFFFF" w:sz="0"/>
-              <w:right w:val="none" w:color="FFFFFF" w:sz="0"/>
-            </w:tcBorders>
-            <w:tcMar>
-              <w:top w:type="dxa" w:w="80"/>
-              <w:left w:type="dxa" w:w="120"/>
-              <w:bottom w:type="dxa" w:w="80"/>
-              <w:right w:type="dxa" w:w="120"/>
-            </w:tcMar>
-          </w:tcPr>
-          <w:p>
+            <w:tcW w:type="dxa" w:w="910"/>
+            <w:tcBorders>
+              <w:top w:val="none" w:color="FFFFFF" w:sz="0"/>
+              <w:left w:val="none" w:color="FFFFFF" w:sz="0"/>
+              <w:bottom w:val="none" w:color="FFFFFF" w:sz="0"/>
+              <w:right w:val="none" w:color="FFFFFF" w:sz="0"/>
+            </w:tcBorders>
+            <w:tcMar>
+              <w:top w:type="dxa" w:w="80"/>
+              <w:left w:type="dxa" w:w="120"/>
+              <w:bottom w:type="dxa" w:w="80"/>
+              <w:right w:type="dxa" w:w="120"/>
+            </w:tcMar>
+            <w:vAlign w:val="center"/>
+          </w:tcPr>
+          <w:p>
+            <w:pPr>
+              <w:jc w:val="center"/>
+            </w:pPr>
             <w:r>
               <w:rPr>
                 <w:rFonts w:ascii="Calibri" w:cs="Calibri" w:eastAsia="Calibri" w:hAnsi="Calibri"/>
@@ -6056,108 +6256,124 @@
         </w:tc>
         <w:tc>
           <w:tcPr>
-            <w:tcW w:type="auto" w:w="0"/>
-            <w:tcBorders>
-              <w:top w:val="none" w:color="FFFFFF" w:sz="0"/>
-              <w:left w:val="none" w:color="FFFFFF" w:sz="0"/>
-              <w:bottom w:val="none" w:color="FFFFFF" w:sz="0"/>
-              <w:right w:val="none" w:color="FFFFFF" w:sz="0"/>
-            </w:tcBorders>
-            <w:tcMar>
-              <w:top w:type="dxa" w:w="80"/>
-              <w:left w:type="dxa" w:w="120"/>
-              <w:bottom w:type="dxa" w:w="80"/>
-              <w:right w:type="dxa" w:w="120"/>
-            </w:tcMar>
-          </w:tcPr>
-          <w:p>
-            <w:r>
-              <w:rPr>
-                <w:rFonts w:ascii="Calibri" w:cs="Calibri" w:eastAsia="Calibri" w:hAnsi="Calibri"/>
-                <w:b w:val="false"/>
-                <w:bCs w:val="false"/>
-                <w:sz w:val="22"/>
-                <w:szCs w:val="22"/>
-              </w:rPr>
-              <w:t xml:space="preserve">95%</w:t>
-            </w:r>
-          </w:p>
-        </w:tc>
-        <w:tc>
-          <w:tcPr>
-            <w:tcW w:type="auto" w:w="0"/>
-            <w:tcBorders>
-              <w:top w:val="none" w:color="FFFFFF" w:sz="0"/>
-              <w:left w:val="none" w:color="FFFFFF" w:sz="0"/>
-              <w:bottom w:val="none" w:color="FFFFFF" w:sz="0"/>
-              <w:right w:val="none" w:color="FFFFFF" w:sz="0"/>
-            </w:tcBorders>
-            <w:tcMar>
-              <w:top w:type="dxa" w:w="80"/>
-              <w:left w:type="dxa" w:w="120"/>
-              <w:bottom w:type="dxa" w:w="80"/>
-              <w:right w:type="dxa" w:w="120"/>
-            </w:tcMar>
-          </w:tcPr>
-          <w:p>
-            <w:r>
-              <w:rPr>
-                <w:rFonts w:ascii="Calibri" w:cs="Calibri" w:eastAsia="Calibri" w:hAnsi="Calibri"/>
-                <w:b w:val="false"/>
-                <w:bCs w:val="false"/>
-                <w:sz w:val="22"/>
-                <w:szCs w:val="22"/>
-              </w:rPr>
-              <w:t xml:space="preserve">95%</w:t>
-            </w:r>
-          </w:p>
-        </w:tc>
-        <w:tc>
-          <w:tcPr>
-            <w:tcW w:type="auto" w:w="0"/>
-            <w:tcBorders>
-              <w:top w:val="none" w:color="FFFFFF" w:sz="0"/>
-              <w:left w:val="none" w:color="FFFFFF" w:sz="0"/>
-              <w:bottom w:val="none" w:color="FFFFFF" w:sz="0"/>
-              <w:right w:val="none" w:color="FFFFFF" w:sz="0"/>
-            </w:tcBorders>
-            <w:tcMar>
-              <w:top w:type="dxa" w:w="80"/>
-              <w:left w:type="dxa" w:w="120"/>
-              <w:bottom w:type="dxa" w:w="80"/>
-              <w:right w:type="dxa" w:w="120"/>
-            </w:tcMar>
-          </w:tcPr>
-          <w:p>
-            <w:r>
-              <w:rPr>
-                <w:rFonts w:ascii="Calibri" w:cs="Calibri" w:eastAsia="Calibri" w:hAnsi="Calibri"/>
-                <w:b w:val="false"/>
-                <w:bCs w:val="false"/>
-                <w:sz w:val="22"/>
-                <w:szCs w:val="22"/>
-              </w:rPr>
-              <w:t xml:space="preserve">90%</w:t>
-            </w:r>
-          </w:p>
-        </w:tc>
-        <w:tc>
-          <w:tcPr>
-            <w:tcW w:type="auto" w:w="0"/>
-            <w:tcBorders>
-              <w:top w:val="none" w:color="FFFFFF" w:sz="0"/>
-              <w:left w:val="none" w:color="FFFFFF" w:sz="0"/>
-              <w:bottom w:val="none" w:color="FFFFFF" w:sz="0"/>
-              <w:right w:val="none" w:color="FFFFFF" w:sz="0"/>
-            </w:tcBorders>
-            <w:tcMar>
-              <w:top w:type="dxa" w:w="80"/>
-              <w:left w:type="dxa" w:w="120"/>
-              <w:bottom w:type="dxa" w:w="80"/>
-              <w:right w:type="dxa" w:w="120"/>
-            </w:tcMar>
-          </w:tcPr>
-          <w:p>
+            <w:tcW w:type="dxa" w:w="910"/>
+            <w:tcBorders>
+              <w:top w:val="none" w:color="FFFFFF" w:sz="0"/>
+              <w:left w:val="none" w:color="FFFFFF" w:sz="0"/>
+              <w:bottom w:val="none" w:color="FFFFFF" w:sz="0"/>
+              <w:right w:val="none" w:color="FFFFFF" w:sz="0"/>
+            </w:tcBorders>
+            <w:tcMar>
+              <w:top w:type="dxa" w:w="80"/>
+              <w:left w:type="dxa" w:w="120"/>
+              <w:bottom w:type="dxa" w:w="80"/>
+              <w:right w:type="dxa" w:w="120"/>
+            </w:tcMar>
+            <w:vAlign w:val="center"/>
+          </w:tcPr>
+          <w:p>
+            <w:pPr>
+              <w:jc w:val="center"/>
+            </w:pPr>
+            <w:r>
+              <w:rPr>
+                <w:rFonts w:ascii="Calibri" w:cs="Calibri" w:eastAsia="Calibri" w:hAnsi="Calibri"/>
+                <w:b w:val="false"/>
+                <w:bCs w:val="false"/>
+                <w:sz w:val="22"/>
+                <w:szCs w:val="22"/>
+              </w:rPr>
+              <w:t xml:space="preserve">91%</w:t>
+            </w:r>
+          </w:p>
+        </w:tc>
+        <w:tc>
+          <w:tcPr>
+            <w:tcW w:type="dxa" w:w="910"/>
+            <w:tcBorders>
+              <w:top w:val="none" w:color="FFFFFF" w:sz="0"/>
+              <w:left w:val="none" w:color="FFFFFF" w:sz="0"/>
+              <w:bottom w:val="none" w:color="FFFFFF" w:sz="0"/>
+              <w:right w:val="none" w:color="FFFFFF" w:sz="0"/>
+            </w:tcBorders>
+            <w:tcMar>
+              <w:top w:type="dxa" w:w="80"/>
+              <w:left w:type="dxa" w:w="120"/>
+              <w:bottom w:type="dxa" w:w="80"/>
+              <w:right w:type="dxa" w:w="120"/>
+            </w:tcMar>
+            <w:vAlign w:val="center"/>
+          </w:tcPr>
+          <w:p>
+            <w:pPr>
+              <w:jc w:val="center"/>
+            </w:pPr>
+            <w:r>
+              <w:rPr>
+                <w:rFonts w:ascii="Calibri" w:cs="Calibri" w:eastAsia="Calibri" w:hAnsi="Calibri"/>
+                <w:b w:val="false"/>
+                <w:bCs w:val="false"/>
+                <w:sz w:val="22"/>
+                <w:szCs w:val="22"/>
+              </w:rPr>
+              <w:t xml:space="preserve">93%</w:t>
+            </w:r>
+          </w:p>
+        </w:tc>
+        <w:tc>
+          <w:tcPr>
+            <w:tcW w:type="dxa" w:w="910"/>
+            <w:tcBorders>
+              <w:top w:val="none" w:color="FFFFFF" w:sz="0"/>
+              <w:left w:val="none" w:color="FFFFFF" w:sz="0"/>
+              <w:bottom w:val="none" w:color="FFFFFF" w:sz="0"/>
+              <w:right w:val="none" w:color="FFFFFF" w:sz="0"/>
+            </w:tcBorders>
+            <w:tcMar>
+              <w:top w:type="dxa" w:w="80"/>
+              <w:left w:type="dxa" w:w="120"/>
+              <w:bottom w:type="dxa" w:w="80"/>
+              <w:right w:type="dxa" w:w="120"/>
+            </w:tcMar>
+            <w:vAlign w:val="center"/>
+          </w:tcPr>
+          <w:p>
+            <w:pPr>
+              <w:jc w:val="center"/>
+            </w:pPr>
+            <w:r>
+              <w:rPr>
+                <w:rFonts w:ascii="Calibri" w:cs="Calibri" w:eastAsia="Calibri" w:hAnsi="Calibri"/>
+                <w:b w:val="false"/>
+                <w:bCs w:val="false"/>
+                <w:sz w:val="22"/>
+                <w:szCs w:val="22"/>
+              </w:rPr>
+              <w:t xml:space="preserve">91%</w:t>
+            </w:r>
+          </w:p>
+        </w:tc>
+        <w:tc>
+          <w:tcPr>
+            <w:tcW w:type="dxa" w:w="910"/>
+            <w:tcBorders>
+              <w:top w:val="none" w:color="FFFFFF" w:sz="0"/>
+              <w:left w:val="none" w:color="FFFFFF" w:sz="0"/>
+              <w:bottom w:val="none" w:color="FFFFFF" w:sz="0"/>
+              <w:right w:val="none" w:color="FFFFFF" w:sz="0"/>
+            </w:tcBorders>
+            <w:tcMar>
+              <w:top w:type="dxa" w:w="80"/>
+              <w:left w:type="dxa" w:w="120"/>
+              <w:bottom w:type="dxa" w:w="80"/>
+              <w:right w:type="dxa" w:w="120"/>
+            </w:tcMar>
+            <w:vAlign w:val="center"/>
+          </w:tcPr>
+          <w:p>
+            <w:pPr>
+              <w:jc w:val="center"/>
+            </w:pPr>
             <w:r>
               <w:rPr>
                 <w:rFonts w:ascii="Calibri" w:cs="Calibri" w:eastAsia="Calibri" w:hAnsi="Calibri"/>
@@ -6174,108 +6390,88 @@
       <w:tr>
         <w:tc>
           <w:tcPr>
-            <w:tcW w:type="auto" w:w="0"/>
-            <w:tcBorders>
-              <w:top w:val="none" w:color="FFFFFF" w:sz="0"/>
-              <w:left w:val="none" w:color="FFFFFF" w:sz="0"/>
-              <w:bottom w:val="none" w:color="FFFFFF" w:sz="0"/>
-              <w:right w:val="none" w:color="FFFFFF" w:sz="0"/>
-            </w:tcBorders>
-            <w:tcMar>
-              <w:top w:type="dxa" w:w="80"/>
-              <w:left w:type="dxa" w:w="120"/>
-              <w:bottom w:type="dxa" w:w="80"/>
-              <w:right w:type="dxa" w:w="120"/>
-            </w:tcMar>
-          </w:tcPr>
-          <w:p>
-            <w:r>
-              <w:rPr>
-                <w:rFonts w:ascii="Calibri" w:cs="Calibri" w:eastAsia="Calibri" w:hAnsi="Calibri"/>
-                <w:b w:val="false"/>
-                <w:bCs w:val="false"/>
-                <w:sz w:val="22"/>
-                <w:szCs w:val="22"/>
-              </w:rPr>
-              <w:t xml:space="preserve">Is reliable</w:t>
-            </w:r>
-          </w:p>
-        </w:tc>
-        <w:tc>
-          <w:tcPr>
-            <w:tcW w:type="auto" w:w="0"/>
-            <w:tcBorders>
-              <w:top w:val="none" w:color="FFFFFF" w:sz="0"/>
-              <w:left w:val="none" w:color="FFFFFF" w:sz="0"/>
-              <w:bottom w:val="none" w:color="FFFFFF" w:sz="0"/>
-              <w:right w:val="none" w:color="FFFFFF" w:sz="0"/>
-            </w:tcBorders>
-            <w:tcMar>
-              <w:top w:type="dxa" w:w="80"/>
-              <w:left w:type="dxa" w:w="120"/>
-              <w:bottom w:type="dxa" w:w="80"/>
-              <w:right w:type="dxa" w:w="120"/>
-            </w:tcMar>
-          </w:tcPr>
-          <w:p>
-            <w:r>
-              <w:rPr>
-                <w:rFonts w:ascii="Calibri" w:cs="Calibri" w:eastAsia="Calibri" w:hAnsi="Calibri"/>
-                <w:b w:val="false"/>
-                <w:bCs w:val="false"/>
-                <w:sz w:val="22"/>
-                <w:szCs w:val="22"/>
-              </w:rPr>
-              <w:t xml:space="preserve">92%</w:t>
-            </w:r>
-          </w:p>
-        </w:tc>
-        <w:tc>
-          <w:tcPr>
-            <w:tcW w:type="auto" w:w="0"/>
-            <w:tcBorders>
-              <w:top w:val="none" w:color="FFFFFF" w:sz="0"/>
-              <w:left w:val="none" w:color="FFFFFF" w:sz="0"/>
-              <w:bottom w:val="none" w:color="FFFFFF" w:sz="0"/>
-              <w:right w:val="none" w:color="FFFFFF" w:sz="0"/>
-            </w:tcBorders>
-            <w:tcMar>
-              <w:top w:type="dxa" w:w="80"/>
-              <w:left w:type="dxa" w:w="120"/>
-              <w:bottom w:type="dxa" w:w="80"/>
-              <w:right w:type="dxa" w:w="120"/>
-            </w:tcMar>
-          </w:tcPr>
-          <w:p>
-            <w:r>
-              <w:rPr>
-                <w:rFonts w:ascii="Calibri" w:cs="Calibri" w:eastAsia="Calibri" w:hAnsi="Calibri"/>
-                <w:b w:val="false"/>
-                <w:bCs w:val="false"/>
-                <w:sz w:val="22"/>
-                <w:szCs w:val="22"/>
-              </w:rPr>
-              <w:t xml:space="preserve">90%</w:t>
-            </w:r>
-          </w:p>
-        </w:tc>
-        <w:tc>
-          <w:tcPr>
-            <w:tcW w:type="auto" w:w="0"/>
-            <w:tcBorders>
-              <w:top w:val="none" w:color="FFFFFF" w:sz="0"/>
-              <w:left w:val="none" w:color="FFFFFF" w:sz="0"/>
-              <w:bottom w:val="none" w:color="FFFFFF" w:sz="0"/>
-              <w:right w:val="none" w:color="FFFFFF" w:sz="0"/>
-            </w:tcBorders>
-            <w:tcMar>
-              <w:top w:type="dxa" w:w="80"/>
-              <w:left w:type="dxa" w:w="120"/>
-              <w:bottom w:type="dxa" w:w="80"/>
-              <w:right w:type="dxa" w:w="120"/>
-            </w:tcMar>
-          </w:tcPr>
-          <w:p>
+            <w:tcW w:type="dxa" w:w="3900"/>
+            <w:tcBorders>
+              <w:top w:val="none" w:color="FFFFFF" w:sz="0"/>
+              <w:left w:val="none" w:color="FFFFFF" w:sz="0"/>
+              <w:bottom w:val="none" w:color="FFFFFF" w:sz="0"/>
+              <w:right w:val="none" w:color="FFFFFF" w:sz="0"/>
+            </w:tcBorders>
+            <w:tcMar>
+              <w:top w:type="dxa" w:w="80"/>
+              <w:left w:type="dxa" w:w="120"/>
+              <w:bottom w:type="dxa" w:w="80"/>
+              <w:right w:type="dxa" w:w="120"/>
+            </w:tcMar>
+            <w:vAlign w:val="center"/>
+          </w:tcPr>
+          <w:p>
+            <w:r>
+              <w:rPr>
+                <w:rFonts w:ascii="Calibri" w:cs="Calibri" w:eastAsia="Calibri" w:hAnsi="Calibri"/>
+                <w:b w:val="false"/>
+                <w:bCs w:val="false"/>
+                <w:sz w:val="22"/>
+                <w:szCs w:val="22"/>
+              </w:rPr>
+              <w:t xml:space="preserve">Is available to me when I need them</w:t>
+            </w:r>
+          </w:p>
+        </w:tc>
+        <w:tc>
+          <w:tcPr>
+            <w:tcW w:type="dxa" w:w="910"/>
+            <w:tcBorders>
+              <w:top w:val="none" w:color="FFFFFF" w:sz="0"/>
+              <w:left w:val="none" w:color="FFFFFF" w:sz="0"/>
+              <w:bottom w:val="none" w:color="FFFFFF" w:sz="0"/>
+              <w:right w:val="none" w:color="FFFFFF" w:sz="0"/>
+            </w:tcBorders>
+            <w:tcMar>
+              <w:top w:type="dxa" w:w="80"/>
+              <w:left w:type="dxa" w:w="120"/>
+              <w:bottom w:type="dxa" w:w="80"/>
+              <w:right w:type="dxa" w:w="120"/>
+            </w:tcMar>
+            <w:vAlign w:val="center"/>
+          </w:tcPr>
+          <w:p>
+            <w:pPr>
+              <w:jc w:val="center"/>
+            </w:pPr>
+            <w:r>
+              <w:rPr>
+                <w:rFonts w:ascii="Calibri" w:cs="Calibri" w:eastAsia="Calibri" w:hAnsi="Calibri"/>
+                <w:b w:val="false"/>
+                <w:bCs w:val="false"/>
+                <w:sz w:val="22"/>
+                <w:szCs w:val="22"/>
+              </w:rPr>
+              <w:t xml:space="preserve">85%</w:t>
+            </w:r>
+          </w:p>
+        </w:tc>
+        <w:tc>
+          <w:tcPr>
+            <w:tcW w:type="dxa" w:w="910"/>
+            <w:tcBorders>
+              <w:top w:val="none" w:color="FFFFFF" w:sz="0"/>
+              <w:left w:val="none" w:color="FFFFFF" w:sz="0"/>
+              <w:bottom w:val="none" w:color="FFFFFF" w:sz="0"/>
+              <w:right w:val="none" w:color="FFFFFF" w:sz="0"/>
+            </w:tcBorders>
+            <w:tcMar>
+              <w:top w:type="dxa" w:w="80"/>
+              <w:left w:type="dxa" w:w="120"/>
+              <w:bottom w:type="dxa" w:w="80"/>
+              <w:right w:type="dxa" w:w="120"/>
+            </w:tcMar>
+            <w:vAlign w:val="center"/>
+          </w:tcPr>
+          <w:p>
+            <w:pPr>
+              <w:jc w:val="center"/>
+            </w:pPr>
             <w:r>
               <w:rPr>
                 <w:rFonts w:ascii="Calibri" w:cs="Calibri" w:eastAsia="Calibri" w:hAnsi="Calibri"/>
@@ -6290,88 +6486,133 @@
         </w:tc>
         <w:tc>
           <w:tcPr>
-            <w:tcW w:type="auto" w:w="0"/>
-            <w:tcBorders>
-              <w:top w:val="none" w:color="FFFFFF" w:sz="0"/>
-              <w:left w:val="none" w:color="FFFFFF" w:sz="0"/>
-              <w:bottom w:val="none" w:color="FFFFFF" w:sz="0"/>
-              <w:right w:val="none" w:color="FFFFFF" w:sz="0"/>
-            </w:tcBorders>
-            <w:tcMar>
-              <w:top w:type="dxa" w:w="80"/>
-              <w:left w:type="dxa" w:w="120"/>
-              <w:bottom w:type="dxa" w:w="80"/>
-              <w:right w:type="dxa" w:w="120"/>
-            </w:tcMar>
-          </w:tcPr>
-          <w:p>
-            <w:r>
-              <w:rPr>
-                <w:rFonts w:ascii="Calibri" w:cs="Calibri" w:eastAsia="Calibri" w:hAnsi="Calibri"/>
-                <w:b w:val="false"/>
-                <w:bCs w:val="false"/>
-                <w:sz w:val="22"/>
-                <w:szCs w:val="22"/>
-              </w:rPr>
-              <w:t xml:space="preserve">93%</w:t>
-            </w:r>
-          </w:p>
-        </w:tc>
-        <w:tc>
-          <w:tcPr>
-            <w:tcW w:type="auto" w:w="0"/>
-            <w:tcBorders>
-              <w:top w:val="none" w:color="FFFFFF" w:sz="0"/>
-              <w:left w:val="none" w:color="FFFFFF" w:sz="0"/>
-              <w:bottom w:val="none" w:color="FFFFFF" w:sz="0"/>
-              <w:right w:val="none" w:color="FFFFFF" w:sz="0"/>
-            </w:tcBorders>
-            <w:tcMar>
-              <w:top w:type="dxa" w:w="80"/>
-              <w:left w:type="dxa" w:w="120"/>
-              <w:bottom w:type="dxa" w:w="80"/>
-              <w:right w:type="dxa" w:w="120"/>
-            </w:tcMar>
-          </w:tcPr>
-          <w:p>
-            <w:r>
-              <w:rPr>
-                <w:rFonts w:ascii="Calibri" w:cs="Calibri" w:eastAsia="Calibri" w:hAnsi="Calibri"/>
-                <w:b w:val="false"/>
-                <w:bCs w:val="false"/>
-                <w:sz w:val="22"/>
-                <w:szCs w:val="22"/>
-              </w:rPr>
-              <w:t xml:space="preserve">89%</w:t>
-            </w:r>
-          </w:p>
-        </w:tc>
-        <w:tc>
-          <w:tcPr>
-            <w:tcW w:type="auto" w:w="0"/>
-            <w:tcBorders>
-              <w:top w:val="none" w:color="FFFFFF" w:sz="0"/>
-              <w:left w:val="none" w:color="FFFFFF" w:sz="0"/>
-              <w:bottom w:val="none" w:color="FFFFFF" w:sz="0"/>
-              <w:right w:val="none" w:color="FFFFFF" w:sz="0"/>
-            </w:tcBorders>
-            <w:tcMar>
-              <w:top w:type="dxa" w:w="80"/>
-              <w:left w:type="dxa" w:w="120"/>
-              <w:bottom w:type="dxa" w:w="80"/>
-              <w:right w:type="dxa" w:w="120"/>
-            </w:tcMar>
-          </w:tcPr>
-          <w:p>
-            <w:r>
-              <w:rPr>
-                <w:rFonts w:ascii="Calibri" w:cs="Calibri" w:eastAsia="Calibri" w:hAnsi="Calibri"/>
-                <w:b w:val="false"/>
-                <w:bCs w:val="false"/>
-                <w:sz w:val="22"/>
-                <w:szCs w:val="22"/>
-              </w:rPr>
-              <w:t xml:space="preserve">84%</w:t>
+            <w:tcW w:type="dxa" w:w="910"/>
+            <w:tcBorders>
+              <w:top w:val="none" w:color="FFFFFF" w:sz="0"/>
+              <w:left w:val="none" w:color="FFFFFF" w:sz="0"/>
+              <w:bottom w:val="none" w:color="FFFFFF" w:sz="0"/>
+              <w:right w:val="none" w:color="FFFFFF" w:sz="0"/>
+            </w:tcBorders>
+            <w:tcMar>
+              <w:top w:type="dxa" w:w="80"/>
+              <w:left w:type="dxa" w:w="120"/>
+              <w:bottom w:type="dxa" w:w="80"/>
+              <w:right w:type="dxa" w:w="120"/>
+            </w:tcMar>
+            <w:vAlign w:val="center"/>
+          </w:tcPr>
+          <w:p>
+            <w:pPr>
+              <w:jc w:val="center"/>
+            </w:pPr>
+            <w:r>
+              <w:rPr>
+                <w:rFonts w:ascii="Calibri" w:cs="Calibri" w:eastAsia="Calibri" w:hAnsi="Calibri"/>
+                <w:b w:val="false"/>
+                <w:bCs w:val="false"/>
+                <w:sz w:val="22"/>
+                <w:szCs w:val="22"/>
+              </w:rPr>
+              <w:t xml:space="preserve">88%</w:t>
+            </w:r>
+          </w:p>
+        </w:tc>
+        <w:tc>
+          <w:tcPr>
+            <w:tcW w:type="dxa" w:w="910"/>
+            <w:tcBorders>
+              <w:top w:val="none" w:color="FFFFFF" w:sz="0"/>
+              <w:left w:val="none" w:color="FFFFFF" w:sz="0"/>
+              <w:bottom w:val="none" w:color="FFFFFF" w:sz="0"/>
+              <w:right w:val="none" w:color="FFFFFF" w:sz="0"/>
+            </w:tcBorders>
+            <w:tcMar>
+              <w:top w:type="dxa" w:w="80"/>
+              <w:left w:type="dxa" w:w="120"/>
+              <w:bottom w:type="dxa" w:w="80"/>
+              <w:right w:type="dxa" w:w="120"/>
+            </w:tcMar>
+            <w:vAlign w:val="center"/>
+          </w:tcPr>
+          <w:p>
+            <w:pPr>
+              <w:jc w:val="center"/>
+            </w:pPr>
+            <w:r>
+              <w:rPr>
+                <w:rFonts w:ascii="Calibri" w:cs="Calibri" w:eastAsia="Calibri" w:hAnsi="Calibri"/>
+                <w:b w:val="false"/>
+                <w:bCs w:val="false"/>
+                <w:sz w:val="22"/>
+                <w:szCs w:val="22"/>
+              </w:rPr>
+              <w:t xml:space="preserve">91%</w:t>
+            </w:r>
+          </w:p>
+        </w:tc>
+        <w:tc>
+          <w:tcPr>
+            <w:tcW w:type="dxa" w:w="910"/>
+            <w:tcBorders>
+              <w:top w:val="none" w:color="FFFFFF" w:sz="0"/>
+              <w:left w:val="none" w:color="FFFFFF" w:sz="0"/>
+              <w:bottom w:val="none" w:color="FFFFFF" w:sz="0"/>
+              <w:right w:val="none" w:color="FFFFFF" w:sz="0"/>
+            </w:tcBorders>
+            <w:tcMar>
+              <w:top w:type="dxa" w:w="80"/>
+              <w:left w:type="dxa" w:w="120"/>
+              <w:bottom w:type="dxa" w:w="80"/>
+              <w:right w:type="dxa" w:w="120"/>
+            </w:tcMar>
+            <w:vAlign w:val="center"/>
+          </w:tcPr>
+          <w:p>
+            <w:pPr>
+              <w:jc w:val="center"/>
+            </w:pPr>
+            <w:r>
+              <w:rPr>
+                <w:rFonts w:ascii="Calibri" w:cs="Calibri" w:eastAsia="Calibri" w:hAnsi="Calibri"/>
+                <w:b w:val="false"/>
+                <w:bCs w:val="false"/>
+                <w:sz w:val="22"/>
+                <w:szCs w:val="22"/>
+              </w:rPr>
+              <w:t xml:space="preserve">88%</w:t>
+            </w:r>
+          </w:p>
+        </w:tc>
+        <w:tc>
+          <w:tcPr>
+            <w:tcW w:type="dxa" w:w="910"/>
+            <w:tcBorders>
+              <w:top w:val="none" w:color="FFFFFF" w:sz="0"/>
+              <w:left w:val="none" w:color="FFFFFF" w:sz="0"/>
+              <w:bottom w:val="none" w:color="FFFFFF" w:sz="0"/>
+              <w:right w:val="none" w:color="FFFFFF" w:sz="0"/>
+            </w:tcBorders>
+            <w:tcMar>
+              <w:top w:type="dxa" w:w="80"/>
+              <w:left w:type="dxa" w:w="120"/>
+              <w:bottom w:type="dxa" w:w="80"/>
+              <w:right w:type="dxa" w:w="120"/>
+            </w:tcMar>
+            <w:vAlign w:val="center"/>
+          </w:tcPr>
+          <w:p>
+            <w:pPr>
+              <w:jc w:val="center"/>
+            </w:pPr>
+            <w:r>
+              <w:rPr>
+                <w:rFonts w:ascii="Calibri" w:cs="Calibri" w:eastAsia="Calibri" w:hAnsi="Calibri"/>
+                <w:b w:val="false"/>
+                <w:bCs w:val="false"/>
+                <w:sz w:val="22"/>
+                <w:szCs w:val="22"/>
+              </w:rPr>
+              <w:t xml:space="preserve">80%</w:t>
             </w:r>
           </w:p>
         </w:tc>
@@ -6379,79 +6620,154 @@
       <w:tr>
         <w:tc>
           <w:tcPr>
-            <w:tcW w:type="auto" w:w="0"/>
-            <w:tcBorders>
-              <w:top w:val="none" w:color="FFFFFF" w:sz="0"/>
-              <w:left w:val="none" w:color="FFFFFF" w:sz="0"/>
-              <w:bottom w:val="none" w:color="FFFFFF" w:sz="0"/>
-              <w:right w:val="none" w:color="FFFFFF" w:sz="0"/>
-            </w:tcBorders>
-            <w:tcMar>
-              <w:top w:type="dxa" w:w="80"/>
-              <w:left w:type="dxa" w:w="120"/>
-              <w:bottom w:type="dxa" w:w="80"/>
-              <w:right w:type="dxa" w:w="120"/>
-            </w:tcMar>
-          </w:tcPr>
-          <w:p>
-            <w:r>
-              <w:rPr>
-                <w:rFonts w:ascii="Calibri" w:cs="Calibri" w:eastAsia="Calibri" w:hAnsi="Calibri"/>
-                <w:b w:val="false"/>
-                <w:bCs w:val="false"/>
-                <w:sz w:val="22"/>
-                <w:szCs w:val="22"/>
-              </w:rPr>
-              <w:t xml:space="preserve">Values my opinions about my life</w:t>
-            </w:r>
-          </w:p>
-        </w:tc>
-        <w:tc>
-          <w:tcPr>
-            <w:tcW w:type="auto" w:w="0"/>
-            <w:tcBorders>
-              <w:top w:val="none" w:color="FFFFFF" w:sz="0"/>
-              <w:left w:val="none" w:color="FFFFFF" w:sz="0"/>
-              <w:bottom w:val="none" w:color="FFFFFF" w:sz="0"/>
-              <w:right w:val="none" w:color="FFFFFF" w:sz="0"/>
-            </w:tcBorders>
-            <w:tcMar>
-              <w:top w:type="dxa" w:w="80"/>
-              <w:left w:type="dxa" w:w="120"/>
-              <w:bottom w:type="dxa" w:w="80"/>
-              <w:right w:type="dxa" w:w="120"/>
-            </w:tcMar>
-          </w:tcPr>
-          <w:p>
-            <w:r>
-              <w:rPr>
-                <w:rFonts w:ascii="Calibri" w:cs="Calibri" w:eastAsia="Calibri" w:hAnsi="Calibri"/>
-                <w:b w:val="false"/>
-                <w:bCs w:val="false"/>
-                <w:sz w:val="22"/>
-                <w:szCs w:val="22"/>
-              </w:rPr>
-              <w:t xml:space="preserve">94%</w:t>
-            </w:r>
-          </w:p>
-        </w:tc>
-        <w:tc>
-          <w:tcPr>
-            <w:tcW w:type="auto" w:w="0"/>
-            <w:tcBorders>
-              <w:top w:val="none" w:color="FFFFFF" w:sz="0"/>
-              <w:left w:val="none" w:color="FFFFFF" w:sz="0"/>
-              <w:bottom w:val="none" w:color="FFFFFF" w:sz="0"/>
-              <w:right w:val="none" w:color="FFFFFF" w:sz="0"/>
-            </w:tcBorders>
-            <w:tcMar>
-              <w:top w:type="dxa" w:w="80"/>
-              <w:left w:type="dxa" w:w="120"/>
-              <w:bottom w:type="dxa" w:w="80"/>
-              <w:right w:type="dxa" w:w="120"/>
-            </w:tcMar>
-          </w:tcPr>
-          <w:p>
+            <w:tcW w:type="dxa" w:w="3900"/>
+            <w:tcBorders>
+              <w:top w:val="none" w:color="FFFFFF" w:sz="0"/>
+              <w:left w:val="none" w:color="FFFFFF" w:sz="0"/>
+              <w:bottom w:val="none" w:color="FFFFFF" w:sz="0"/>
+              <w:right w:val="none" w:color="FFFFFF" w:sz="0"/>
+            </w:tcBorders>
+            <w:tcMar>
+              <w:top w:type="dxa" w:w="80"/>
+              <w:left w:type="dxa" w:w="120"/>
+              <w:bottom w:type="dxa" w:w="80"/>
+              <w:right w:type="dxa" w:w="120"/>
+            </w:tcMar>
+            <w:vAlign w:val="center"/>
+          </w:tcPr>
+          <w:p>
+            <w:r>
+              <w:rPr>
+                <w:rFonts w:ascii="Calibri" w:cs="Calibri" w:eastAsia="Calibri" w:hAnsi="Calibri"/>
+                <w:b w:val="false"/>
+                <w:bCs w:val="false"/>
+                <w:sz w:val="22"/>
+                <w:szCs w:val="22"/>
+              </w:rPr>
+              <w:t xml:space="preserve">Makes me feel heard and understood</w:t>
+            </w:r>
+          </w:p>
+        </w:tc>
+        <w:tc>
+          <w:tcPr>
+            <w:tcW w:type="dxa" w:w="910"/>
+            <w:tcBorders>
+              <w:top w:val="none" w:color="FFFFFF" w:sz="0"/>
+              <w:left w:val="none" w:color="FFFFFF" w:sz="0"/>
+              <w:bottom w:val="none" w:color="FFFFFF" w:sz="0"/>
+              <w:right w:val="none" w:color="FFFFFF" w:sz="0"/>
+            </w:tcBorders>
+            <w:tcMar>
+              <w:top w:type="dxa" w:w="80"/>
+              <w:left w:type="dxa" w:w="120"/>
+              <w:bottom w:type="dxa" w:w="80"/>
+              <w:right w:type="dxa" w:w="120"/>
+            </w:tcMar>
+            <w:vAlign w:val="center"/>
+          </w:tcPr>
+          <w:p>
+            <w:pPr>
+              <w:jc w:val="center"/>
+            </w:pPr>
+            <w:r>
+              <w:rPr>
+                <w:rFonts w:ascii="Calibri" w:cs="Calibri" w:eastAsia="Calibri" w:hAnsi="Calibri"/>
+                <w:b w:val="false"/>
+                <w:bCs w:val="false"/>
+                <w:sz w:val="22"/>
+                <w:szCs w:val="22"/>
+              </w:rPr>
+              <w:t xml:space="preserve">92%</w:t>
+            </w:r>
+          </w:p>
+        </w:tc>
+        <w:tc>
+          <w:tcPr>
+            <w:tcW w:type="dxa" w:w="910"/>
+            <w:tcBorders>
+              <w:top w:val="none" w:color="FFFFFF" w:sz="0"/>
+              <w:left w:val="none" w:color="FFFFFF" w:sz="0"/>
+              <w:bottom w:val="none" w:color="FFFFFF" w:sz="0"/>
+              <w:right w:val="none" w:color="FFFFFF" w:sz="0"/>
+            </w:tcBorders>
+            <w:tcMar>
+              <w:top w:type="dxa" w:w="80"/>
+              <w:left w:type="dxa" w:w="120"/>
+              <w:bottom w:type="dxa" w:w="80"/>
+              <w:right w:type="dxa" w:w="120"/>
+            </w:tcMar>
+            <w:vAlign w:val="center"/>
+          </w:tcPr>
+          <w:p>
+            <w:pPr>
+              <w:jc w:val="center"/>
+            </w:pPr>
+            <w:r>
+              <w:rPr>
+                <w:rFonts w:ascii="Calibri" w:cs="Calibri" w:eastAsia="Calibri" w:hAnsi="Calibri"/>
+                <w:b w:val="false"/>
+                <w:bCs w:val="false"/>
+                <w:sz w:val="22"/>
+                <w:szCs w:val="22"/>
+              </w:rPr>
+              <w:t xml:space="preserve">90%</w:t>
+            </w:r>
+          </w:p>
+        </w:tc>
+        <w:tc>
+          <w:tcPr>
+            <w:tcW w:type="dxa" w:w="910"/>
+            <w:tcBorders>
+              <w:top w:val="none" w:color="FFFFFF" w:sz="0"/>
+              <w:left w:val="none" w:color="FFFFFF" w:sz="0"/>
+              <w:bottom w:val="none" w:color="FFFFFF" w:sz="0"/>
+              <w:right w:val="none" w:color="FFFFFF" w:sz="0"/>
+            </w:tcBorders>
+            <w:tcMar>
+              <w:top w:type="dxa" w:w="80"/>
+              <w:left w:type="dxa" w:w="120"/>
+              <w:bottom w:type="dxa" w:w="80"/>
+              <w:right w:type="dxa" w:w="120"/>
+            </w:tcMar>
+            <w:vAlign w:val="center"/>
+          </w:tcPr>
+          <w:p>
+            <w:pPr>
+              <w:jc w:val="center"/>
+            </w:pPr>
+            <w:r>
+              <w:rPr>
+                <w:rFonts w:ascii="Calibri" w:cs="Calibri" w:eastAsia="Calibri" w:hAnsi="Calibri"/>
+                <w:b w:val="false"/>
+                <w:bCs w:val="false"/>
+                <w:sz w:val="22"/>
+                <w:szCs w:val="22"/>
+              </w:rPr>
+              <w:t xml:space="preserve">92%</w:t>
+            </w:r>
+          </w:p>
+        </w:tc>
+        <w:tc>
+          <w:tcPr>
+            <w:tcW w:type="dxa" w:w="910"/>
+            <w:tcBorders>
+              <w:top w:val="none" w:color="FFFFFF" w:sz="0"/>
+              <w:left w:val="none" w:color="FFFFFF" w:sz="0"/>
+              <w:bottom w:val="none" w:color="FFFFFF" w:sz="0"/>
+              <w:right w:val="none" w:color="FFFFFF" w:sz="0"/>
+            </w:tcBorders>
+            <w:tcMar>
+              <w:top w:type="dxa" w:w="80"/>
+              <w:left w:type="dxa" w:w="120"/>
+              <w:bottom w:type="dxa" w:w="80"/>
+              <w:right w:type="dxa" w:w="120"/>
+            </w:tcMar>
+            <w:vAlign w:val="center"/>
+          </w:tcPr>
+          <w:p>
+            <w:pPr>
+              <w:jc w:val="center"/>
+            </w:pPr>
             <w:r>
               <w:rPr>
                 <w:rFonts w:ascii="Calibri" w:cs="Calibri" w:eastAsia="Calibri" w:hAnsi="Calibri"/>
@@ -6466,489 +6782,25 @@
         </w:tc>
         <w:tc>
           <w:tcPr>
-            <w:tcW w:type="auto" w:w="0"/>
-            <w:tcBorders>
-              <w:top w:val="none" w:color="FFFFFF" w:sz="0"/>
-              <w:left w:val="none" w:color="FFFFFF" w:sz="0"/>
-              <w:bottom w:val="none" w:color="FFFFFF" w:sz="0"/>
-              <w:right w:val="none" w:color="FFFFFF" w:sz="0"/>
-            </w:tcBorders>
-            <w:tcMar>
-              <w:top w:type="dxa" w:w="80"/>
-              <w:left w:type="dxa" w:w="120"/>
-              <w:bottom w:type="dxa" w:w="80"/>
-              <w:right w:type="dxa" w:w="120"/>
-            </w:tcMar>
-          </w:tcPr>
-          <w:p>
-            <w:r>
-              <w:rPr>
-                <w:rFonts w:ascii="Calibri" w:cs="Calibri" w:eastAsia="Calibri" w:hAnsi="Calibri"/>
-                <w:b w:val="false"/>
-                <w:bCs w:val="false"/>
-                <w:sz w:val="22"/>
-                <w:szCs w:val="22"/>
-              </w:rPr>
-              <w:t xml:space="preserve">91%</w:t>
-            </w:r>
-          </w:p>
-        </w:tc>
-        <w:tc>
-          <w:tcPr>
-            <w:tcW w:type="auto" w:w="0"/>
-            <w:tcBorders>
-              <w:top w:val="none" w:color="FFFFFF" w:sz="0"/>
-              <w:left w:val="none" w:color="FFFFFF" w:sz="0"/>
-              <w:bottom w:val="none" w:color="FFFFFF" w:sz="0"/>
-              <w:right w:val="none" w:color="FFFFFF" w:sz="0"/>
-            </w:tcBorders>
-            <w:tcMar>
-              <w:top w:type="dxa" w:w="80"/>
-              <w:left w:type="dxa" w:w="120"/>
-              <w:bottom w:type="dxa" w:w="80"/>
-              <w:right w:type="dxa" w:w="120"/>
-            </w:tcMar>
-          </w:tcPr>
-          <w:p>
-            <w:r>
-              <w:rPr>
-                <w:rFonts w:ascii="Calibri" w:cs="Calibri" w:eastAsia="Calibri" w:hAnsi="Calibri"/>
-                <w:b w:val="false"/>
-                <w:bCs w:val="false"/>
-                <w:sz w:val="22"/>
-                <w:szCs w:val="22"/>
-              </w:rPr>
-              <w:t xml:space="preserve">93%</w:t>
-            </w:r>
-          </w:p>
-        </w:tc>
-        <w:tc>
-          <w:tcPr>
-            <w:tcW w:type="auto" w:w="0"/>
-            <w:tcBorders>
-              <w:top w:val="none" w:color="FFFFFF" w:sz="0"/>
-              <w:left w:val="none" w:color="FFFFFF" w:sz="0"/>
-              <w:bottom w:val="none" w:color="FFFFFF" w:sz="0"/>
-              <w:right w:val="none" w:color="FFFFFF" w:sz="0"/>
-            </w:tcBorders>
-            <w:tcMar>
-              <w:top w:type="dxa" w:w="80"/>
-              <w:left w:type="dxa" w:w="120"/>
-              <w:bottom w:type="dxa" w:w="80"/>
-              <w:right w:type="dxa" w:w="120"/>
-            </w:tcMar>
-          </w:tcPr>
-          <w:p>
-            <w:r>
-              <w:rPr>
-                <w:rFonts w:ascii="Calibri" w:cs="Calibri" w:eastAsia="Calibri" w:hAnsi="Calibri"/>
-                <w:b w:val="false"/>
-                <w:bCs w:val="false"/>
-                <w:sz w:val="22"/>
-                <w:szCs w:val="22"/>
-              </w:rPr>
-              <w:t xml:space="preserve">91%</w:t>
-            </w:r>
-          </w:p>
-        </w:tc>
-        <w:tc>
-          <w:tcPr>
-            <w:tcW w:type="auto" w:w="0"/>
-            <w:tcBorders>
-              <w:top w:val="none" w:color="FFFFFF" w:sz="0"/>
-              <w:left w:val="none" w:color="FFFFFF" w:sz="0"/>
-              <w:bottom w:val="none" w:color="FFFFFF" w:sz="0"/>
-              <w:right w:val="none" w:color="FFFFFF" w:sz="0"/>
-            </w:tcBorders>
-            <w:tcMar>
-              <w:top w:type="dxa" w:w="80"/>
-              <w:left w:type="dxa" w:w="120"/>
-              <w:bottom w:type="dxa" w:w="80"/>
-              <w:right w:type="dxa" w:w="120"/>
-            </w:tcMar>
-          </w:tcPr>
-          <w:p>
-            <w:r>
-              <w:rPr>
-                <w:rFonts w:ascii="Calibri" w:cs="Calibri" w:eastAsia="Calibri" w:hAnsi="Calibri"/>
-                <w:b w:val="false"/>
-                <w:bCs w:val="false"/>
-                <w:sz w:val="22"/>
-                <w:szCs w:val="22"/>
-              </w:rPr>
-              <w:t xml:space="preserve">90%</w:t>
-            </w:r>
-          </w:p>
-        </w:tc>
-      </w:tr>
-      <w:tr>
-        <w:tc>
-          <w:tcPr>
-            <w:tcW w:type="auto" w:w="0"/>
-            <w:tcBorders>
-              <w:top w:val="none" w:color="FFFFFF" w:sz="0"/>
-              <w:left w:val="none" w:color="FFFFFF" w:sz="0"/>
-              <w:bottom w:val="none" w:color="FFFFFF" w:sz="0"/>
-              <w:right w:val="none" w:color="FFFFFF" w:sz="0"/>
-            </w:tcBorders>
-            <w:tcMar>
-              <w:top w:type="dxa" w:w="80"/>
-              <w:left w:type="dxa" w:w="120"/>
-              <w:bottom w:type="dxa" w:w="80"/>
-              <w:right w:type="dxa" w:w="120"/>
-            </w:tcMar>
-          </w:tcPr>
-          <w:p>
-            <w:r>
-              <w:rPr>
-                <w:rFonts w:ascii="Calibri" w:cs="Calibri" w:eastAsia="Calibri" w:hAnsi="Calibri"/>
-                <w:b w:val="false"/>
-                <w:bCs w:val="false"/>
-                <w:sz w:val="22"/>
-                <w:szCs w:val="22"/>
-              </w:rPr>
-              <w:t xml:space="preserve">Is available to me when I need them</w:t>
-            </w:r>
-          </w:p>
-        </w:tc>
-        <w:tc>
-          <w:tcPr>
-            <w:tcW w:type="auto" w:w="0"/>
-            <w:tcBorders>
-              <w:top w:val="none" w:color="FFFFFF" w:sz="0"/>
-              <w:left w:val="none" w:color="FFFFFF" w:sz="0"/>
-              <w:bottom w:val="none" w:color="FFFFFF" w:sz="0"/>
-              <w:right w:val="none" w:color="FFFFFF" w:sz="0"/>
-            </w:tcBorders>
-            <w:tcMar>
-              <w:top w:type="dxa" w:w="80"/>
-              <w:left w:type="dxa" w:w="120"/>
-              <w:bottom w:type="dxa" w:w="80"/>
-              <w:right w:type="dxa" w:w="120"/>
-            </w:tcMar>
-          </w:tcPr>
-          <w:p>
-            <w:r>
-              <w:rPr>
-                <w:rFonts w:ascii="Calibri" w:cs="Calibri" w:eastAsia="Calibri" w:hAnsi="Calibri"/>
-                <w:b w:val="false"/>
-                <w:bCs w:val="false"/>
-                <w:sz w:val="22"/>
-                <w:szCs w:val="22"/>
-              </w:rPr>
-              <w:t xml:space="preserve">85%</w:t>
-            </w:r>
-          </w:p>
-        </w:tc>
-        <w:tc>
-          <w:tcPr>
-            <w:tcW w:type="auto" w:w="0"/>
-            <w:tcBorders>
-              <w:top w:val="none" w:color="FFFFFF" w:sz="0"/>
-              <w:left w:val="none" w:color="FFFFFF" w:sz="0"/>
-              <w:bottom w:val="none" w:color="FFFFFF" w:sz="0"/>
-              <w:right w:val="none" w:color="FFFFFF" w:sz="0"/>
-            </w:tcBorders>
-            <w:tcMar>
-              <w:top w:type="dxa" w:w="80"/>
-              <w:left w:type="dxa" w:w="120"/>
-              <w:bottom w:type="dxa" w:w="80"/>
-              <w:right w:type="dxa" w:w="120"/>
-            </w:tcMar>
-          </w:tcPr>
-          <w:p>
-            <w:r>
-              <w:rPr>
-                <w:rFonts w:ascii="Calibri" w:cs="Calibri" w:eastAsia="Calibri" w:hAnsi="Calibri"/>
-                <w:b w:val="false"/>
-                <w:bCs w:val="false"/>
-                <w:sz w:val="22"/>
-                <w:szCs w:val="22"/>
-              </w:rPr>
-              <w:t xml:space="preserve">88%</w:t>
-            </w:r>
-          </w:p>
-        </w:tc>
-        <w:tc>
-          <w:tcPr>
-            <w:tcW w:type="auto" w:w="0"/>
-            <w:tcBorders>
-              <w:top w:val="none" w:color="FFFFFF" w:sz="0"/>
-              <w:left w:val="none" w:color="FFFFFF" w:sz="0"/>
-              <w:bottom w:val="none" w:color="FFFFFF" w:sz="0"/>
-              <w:right w:val="none" w:color="FFFFFF" w:sz="0"/>
-            </w:tcBorders>
-            <w:tcMar>
-              <w:top w:type="dxa" w:w="80"/>
-              <w:left w:type="dxa" w:w="120"/>
-              <w:bottom w:type="dxa" w:w="80"/>
-              <w:right w:type="dxa" w:w="120"/>
-            </w:tcMar>
-          </w:tcPr>
-          <w:p>
-            <w:r>
-              <w:rPr>
-                <w:rFonts w:ascii="Calibri" w:cs="Calibri" w:eastAsia="Calibri" w:hAnsi="Calibri"/>
-                <w:b w:val="false"/>
-                <w:bCs w:val="false"/>
-                <w:sz w:val="22"/>
-                <w:szCs w:val="22"/>
-              </w:rPr>
-              <w:t xml:space="preserve">88%</w:t>
-            </w:r>
-          </w:p>
-        </w:tc>
-        <w:tc>
-          <w:tcPr>
-            <w:tcW w:type="auto" w:w="0"/>
-            <w:tcBorders>
-              <w:top w:val="none" w:color="FFFFFF" w:sz="0"/>
-              <w:left w:val="none" w:color="FFFFFF" w:sz="0"/>
-              <w:bottom w:val="none" w:color="FFFFFF" w:sz="0"/>
-              <w:right w:val="none" w:color="FFFFFF" w:sz="0"/>
-            </w:tcBorders>
-            <w:tcMar>
-              <w:top w:type="dxa" w:w="80"/>
-              <w:left w:type="dxa" w:w="120"/>
-              <w:bottom w:type="dxa" w:w="80"/>
-              <w:right w:type="dxa" w:w="120"/>
-            </w:tcMar>
-          </w:tcPr>
-          <w:p>
-            <w:r>
-              <w:rPr>
-                <w:rFonts w:ascii="Calibri" w:cs="Calibri" w:eastAsia="Calibri" w:hAnsi="Calibri"/>
-                <w:b w:val="false"/>
-                <w:bCs w:val="false"/>
-                <w:sz w:val="22"/>
-                <w:szCs w:val="22"/>
-              </w:rPr>
-              <w:t xml:space="preserve">91%</w:t>
-            </w:r>
-          </w:p>
-        </w:tc>
-        <w:tc>
-          <w:tcPr>
-            <w:tcW w:type="auto" w:w="0"/>
-            <w:tcBorders>
-              <w:top w:val="none" w:color="FFFFFF" w:sz="0"/>
-              <w:left w:val="none" w:color="FFFFFF" w:sz="0"/>
-              <w:bottom w:val="none" w:color="FFFFFF" w:sz="0"/>
-              <w:right w:val="none" w:color="FFFFFF" w:sz="0"/>
-            </w:tcBorders>
-            <w:tcMar>
-              <w:top w:type="dxa" w:w="80"/>
-              <w:left w:type="dxa" w:w="120"/>
-              <w:bottom w:type="dxa" w:w="80"/>
-              <w:right w:type="dxa" w:w="120"/>
-            </w:tcMar>
-          </w:tcPr>
-          <w:p>
-            <w:r>
-              <w:rPr>
-                <w:rFonts w:ascii="Calibri" w:cs="Calibri" w:eastAsia="Calibri" w:hAnsi="Calibri"/>
-                <w:b w:val="false"/>
-                <w:bCs w:val="false"/>
-                <w:sz w:val="22"/>
-                <w:szCs w:val="22"/>
-              </w:rPr>
-              <w:t xml:space="preserve">88%</w:t>
-            </w:r>
-          </w:p>
-        </w:tc>
-        <w:tc>
-          <w:tcPr>
-            <w:tcW w:type="auto" w:w="0"/>
-            <w:tcBorders>
-              <w:top w:val="none" w:color="FFFFFF" w:sz="0"/>
-              <w:left w:val="none" w:color="FFFFFF" w:sz="0"/>
-              <w:bottom w:val="none" w:color="FFFFFF" w:sz="0"/>
-              <w:right w:val="none" w:color="FFFFFF" w:sz="0"/>
-            </w:tcBorders>
-            <w:tcMar>
-              <w:top w:type="dxa" w:w="80"/>
-              <w:left w:type="dxa" w:w="120"/>
-              <w:bottom w:type="dxa" w:w="80"/>
-              <w:right w:type="dxa" w:w="120"/>
-            </w:tcMar>
-          </w:tcPr>
-          <w:p>
-            <w:r>
-              <w:rPr>
-                <w:rFonts w:ascii="Calibri" w:cs="Calibri" w:eastAsia="Calibri" w:hAnsi="Calibri"/>
-                <w:b w:val="false"/>
-                <w:bCs w:val="false"/>
-                <w:sz w:val="22"/>
-                <w:szCs w:val="22"/>
-              </w:rPr>
-              <w:t xml:space="preserve">80%</w:t>
-            </w:r>
-          </w:p>
-        </w:tc>
-      </w:tr>
-      <w:tr>
-        <w:tc>
-          <w:tcPr>
-            <w:tcW w:type="auto" w:w="0"/>
-            <w:tcBorders>
-              <w:top w:val="none" w:color="FFFFFF" w:sz="0"/>
-              <w:left w:val="none" w:color="FFFFFF" w:sz="0"/>
-              <w:bottom w:val="none" w:color="FFFFFF" w:sz="0"/>
-              <w:right w:val="none" w:color="FFFFFF" w:sz="0"/>
-            </w:tcBorders>
-            <w:tcMar>
-              <w:top w:type="dxa" w:w="80"/>
-              <w:left w:type="dxa" w:w="120"/>
-              <w:bottom w:type="dxa" w:w="80"/>
-              <w:right w:type="dxa" w:w="120"/>
-            </w:tcMar>
-          </w:tcPr>
-          <w:p>
-            <w:r>
-              <w:rPr>
-                <w:rFonts w:ascii="Calibri" w:cs="Calibri" w:eastAsia="Calibri" w:hAnsi="Calibri"/>
-                <w:b w:val="false"/>
-                <w:bCs w:val="false"/>
-                <w:sz w:val="22"/>
-                <w:szCs w:val="22"/>
-              </w:rPr>
-              <w:t xml:space="preserve">Makes me feel heard and understood</w:t>
-            </w:r>
-          </w:p>
-        </w:tc>
-        <w:tc>
-          <w:tcPr>
-            <w:tcW w:type="auto" w:w="0"/>
-            <w:tcBorders>
-              <w:top w:val="none" w:color="FFFFFF" w:sz="0"/>
-              <w:left w:val="none" w:color="FFFFFF" w:sz="0"/>
-              <w:bottom w:val="none" w:color="FFFFFF" w:sz="0"/>
-              <w:right w:val="none" w:color="FFFFFF" w:sz="0"/>
-            </w:tcBorders>
-            <w:tcMar>
-              <w:top w:type="dxa" w:w="80"/>
-              <w:left w:type="dxa" w:w="120"/>
-              <w:bottom w:type="dxa" w:w="80"/>
-              <w:right w:type="dxa" w:w="120"/>
-            </w:tcMar>
-          </w:tcPr>
-          <w:p>
-            <w:r>
-              <w:rPr>
-                <w:rFonts w:ascii="Calibri" w:cs="Calibri" w:eastAsia="Calibri" w:hAnsi="Calibri"/>
-                <w:b w:val="false"/>
-                <w:bCs w:val="false"/>
-                <w:sz w:val="22"/>
-                <w:szCs w:val="22"/>
-              </w:rPr>
-              <w:t xml:space="preserve">92%</w:t>
-            </w:r>
-          </w:p>
-        </w:tc>
-        <w:tc>
-          <w:tcPr>
-            <w:tcW w:type="auto" w:w="0"/>
-            <w:tcBorders>
-              <w:top w:val="none" w:color="FFFFFF" w:sz="0"/>
-              <w:left w:val="none" w:color="FFFFFF" w:sz="0"/>
-              <w:bottom w:val="none" w:color="FFFFFF" w:sz="0"/>
-              <w:right w:val="none" w:color="FFFFFF" w:sz="0"/>
-            </w:tcBorders>
-            <w:tcMar>
-              <w:top w:type="dxa" w:w="80"/>
-              <w:left w:type="dxa" w:w="120"/>
-              <w:bottom w:type="dxa" w:w="80"/>
-              <w:right w:type="dxa" w:w="120"/>
-            </w:tcMar>
-          </w:tcPr>
-          <w:p>
-            <w:r>
-              <w:rPr>
-                <w:rFonts w:ascii="Calibri" w:cs="Calibri" w:eastAsia="Calibri" w:hAnsi="Calibri"/>
-                <w:b w:val="false"/>
-                <w:bCs w:val="false"/>
-                <w:sz w:val="22"/>
-                <w:szCs w:val="22"/>
-              </w:rPr>
-              <w:t xml:space="preserve">90%</w:t>
-            </w:r>
-          </w:p>
-        </w:tc>
-        <w:tc>
-          <w:tcPr>
-            <w:tcW w:type="auto" w:w="0"/>
-            <w:tcBorders>
-              <w:top w:val="none" w:color="FFFFFF" w:sz="0"/>
-              <w:left w:val="none" w:color="FFFFFF" w:sz="0"/>
-              <w:bottom w:val="none" w:color="FFFFFF" w:sz="0"/>
-              <w:right w:val="none" w:color="FFFFFF" w:sz="0"/>
-            </w:tcBorders>
-            <w:tcMar>
-              <w:top w:type="dxa" w:w="80"/>
-              <w:left w:type="dxa" w:w="120"/>
-              <w:bottom w:type="dxa" w:w="80"/>
-              <w:right w:type="dxa" w:w="120"/>
-            </w:tcMar>
-          </w:tcPr>
-          <w:p>
-            <w:r>
-              <w:rPr>
-                <w:rFonts w:ascii="Calibri" w:cs="Calibri" w:eastAsia="Calibri" w:hAnsi="Calibri"/>
-                <w:b w:val="false"/>
-                <w:bCs w:val="false"/>
-                <w:sz w:val="22"/>
-                <w:szCs w:val="22"/>
-              </w:rPr>
-              <w:t xml:space="preserve">92%</w:t>
-            </w:r>
-          </w:p>
-        </w:tc>
-        <w:tc>
-          <w:tcPr>
-            <w:tcW w:type="auto" w:w="0"/>
-            <w:tcBorders>
-              <w:top w:val="none" w:color="FFFFFF" w:sz="0"/>
-              <w:left w:val="none" w:color="FFFFFF" w:sz="0"/>
-              <w:bottom w:val="none" w:color="FFFFFF" w:sz="0"/>
-              <w:right w:val="none" w:color="FFFFFF" w:sz="0"/>
-            </w:tcBorders>
-            <w:tcMar>
-              <w:top w:type="dxa" w:w="80"/>
-              <w:left w:type="dxa" w:w="120"/>
-              <w:bottom w:type="dxa" w:w="80"/>
-              <w:right w:type="dxa" w:w="120"/>
-            </w:tcMar>
-          </w:tcPr>
-          <w:p>
-            <w:r>
-              <w:rPr>
-                <w:rFonts w:ascii="Calibri" w:cs="Calibri" w:eastAsia="Calibri" w:hAnsi="Calibri"/>
-                <w:b w:val="false"/>
-                <w:bCs w:val="false"/>
-                <w:sz w:val="22"/>
-                <w:szCs w:val="22"/>
-              </w:rPr>
-              <w:t xml:space="preserve">91%</w:t>
-            </w:r>
-          </w:p>
-        </w:tc>
-        <w:tc>
-          <w:tcPr>
-            <w:tcW w:type="auto" w:w="0"/>
-            <w:tcBorders>
-              <w:top w:val="none" w:color="FFFFFF" w:sz="0"/>
-              <w:left w:val="none" w:color="FFFFFF" w:sz="0"/>
-              <w:bottom w:val="none" w:color="FFFFFF" w:sz="0"/>
-              <w:right w:val="none" w:color="FFFFFF" w:sz="0"/>
-            </w:tcBorders>
-            <w:tcMar>
-              <w:top w:type="dxa" w:w="80"/>
-              <w:left w:type="dxa" w:w="120"/>
-              <w:bottom w:type="dxa" w:w="80"/>
-              <w:right w:type="dxa" w:w="120"/>
-            </w:tcMar>
-          </w:tcPr>
-          <w:p>
+            <w:tcW w:type="dxa" w:w="910"/>
+            <w:tcBorders>
+              <w:top w:val="none" w:color="FFFFFF" w:sz="0"/>
+              <w:left w:val="none" w:color="FFFFFF" w:sz="0"/>
+              <w:bottom w:val="none" w:color="FFFFFF" w:sz="0"/>
+              <w:right w:val="none" w:color="FFFFFF" w:sz="0"/>
+            </w:tcBorders>
+            <w:tcMar>
+              <w:top w:type="dxa" w:w="80"/>
+              <w:left w:type="dxa" w:w="120"/>
+              <w:bottom w:type="dxa" w:w="80"/>
+              <w:right w:type="dxa" w:w="120"/>
+            </w:tcMar>
+            <w:vAlign w:val="center"/>
+          </w:tcPr>
+          <w:p>
+            <w:pPr>
+              <w:jc w:val="center"/>
+            </w:pPr>
             <w:r>
               <w:rPr>
                 <w:rFonts w:ascii="Calibri" w:cs="Calibri" w:eastAsia="Calibri" w:hAnsi="Calibri"/>
@@ -6963,21 +6815,25 @@
         </w:tc>
         <w:tc>
           <w:tcPr>
-            <w:tcW w:type="auto" w:w="0"/>
-            <w:tcBorders>
-              <w:top w:val="none" w:color="FFFFFF" w:sz="0"/>
-              <w:left w:val="none" w:color="FFFFFF" w:sz="0"/>
-              <w:bottom w:val="none" w:color="FFFFFF" w:sz="0"/>
-              <w:right w:val="none" w:color="FFFFFF" w:sz="0"/>
-            </w:tcBorders>
-            <w:tcMar>
-              <w:top w:type="dxa" w:w="80"/>
-              <w:left w:type="dxa" w:w="120"/>
-              <w:bottom w:type="dxa" w:w="80"/>
-              <w:right w:type="dxa" w:w="120"/>
-            </w:tcMar>
-          </w:tcPr>
-          <w:p>
+            <w:tcW w:type="dxa" w:w="910"/>
+            <w:tcBorders>
+              <w:top w:val="none" w:color="FFFFFF" w:sz="0"/>
+              <w:left w:val="none" w:color="FFFFFF" w:sz="0"/>
+              <w:bottom w:val="none" w:color="FFFFFF" w:sz="0"/>
+              <w:right w:val="none" w:color="FFFFFF" w:sz="0"/>
+            </w:tcBorders>
+            <w:tcMar>
+              <w:top w:type="dxa" w:w="80"/>
+              <w:left w:type="dxa" w:w="120"/>
+              <w:bottom w:type="dxa" w:w="80"/>
+              <w:right w:type="dxa" w:w="120"/>
+            </w:tcMar>
+            <w:vAlign w:val="center"/>
+          </w:tcPr>
+          <w:p>
+            <w:pPr>
+              <w:jc w:val="center"/>
+            </w:pPr>
             <w:r>
               <w:rPr>
                 <w:rFonts w:ascii="Calibri" w:cs="Calibri" w:eastAsia="Calibri" w:hAnsi="Calibri"/>
@@ -7000,7 +6856,7 @@
       <w:r>
         <w:drawing>
           <wp:inline distT="0" distB="0" distL="0" distR="0">
-            <wp:extent cx="5029200" cy="2400300"/>
+            <wp:extent cx="5029200" cy="3381375"/>
             <wp:effectExtent t="0" r="0" b="0" l="0"/>
             <wp:docPr id="1" name="" descr="" title=""/>
             <wp:cNvGraphicFramePr>
@@ -7025,7 +6881,7 @@
                   <pic:spPr bwMode="auto">
                     <a:xfrm>
                       <a:off x="0" y="0"/>
-                      <a:ext cx="5029200" cy="2400300"/>
+                      <a:ext cx="5029200" cy="3381375"/>
                     </a:xfrm>
                     <a:prstGeom prst="rect">
                       <a:avLst/>
@@ -7051,7 +6907,7 @@
           <w:sz w:val="22"/>
           <w:szCs w:val="22"/>
         </w:rPr>
-        <w:t xml:space="preserve">The majority of youth communicate with their coaches weekly or monthly. A small number of youth reported their communication was Not Enough.</w:t>
+        <w:t xml:space="preserve">Most respondents rated the amount of communication with their coach positively. 85% reported the amount was a Good amount, while 14% (24 youth) reported it was Not enough and 2% reported Too much. This is a slight increase from February 2025, when 11% (19 youth) reported their communication was Not enough.</w:t>
       </w:r>
     </w:p>
     <w:p>
@@ -7062,7 +6918,7 @@
       <w:r>
         <w:drawing>
           <wp:inline distT="0" distB="0" distL="0" distR="0">
-            <wp:extent cx="4114800" cy="1323975"/>
+            <wp:extent cx="4114800" cy="2266950"/>
             <wp:effectExtent t="0" r="0" b="0" l="0"/>
             <wp:docPr id="1" name="" descr="" title=""/>
             <wp:cNvGraphicFramePr>
@@ -7087,7 +6943,7 @@
                   <pic:spPr bwMode="auto">
                     <a:xfrm>
                       <a:off x="0" y="0"/>
-                      <a:ext cx="4114800" cy="1323975"/>
+                      <a:ext cx="4114800" cy="2266950"/>
                     </a:xfrm>
                     <a:prstGeom prst="rect">
                       <a:avLst/>
@@ -7129,7 +6985,7 @@
           <w:sz w:val="22"/>
           <w:szCs w:val="22"/>
         </w:rPr>
-        <w:t xml:space="preserve">Most of the Count youth who reported Not Enough communicated with their coach 1–2 times per month (12 youth) or less than once a month (10 youth); 2 youth reported about once a week.</w:t>
+        <w:t xml:space="preserve">14% of respondents (n=24) reported their communication with their coach was Not enough. Most of these youth communicated 1–2 times per month (12 youth) or less than once a month (10 youth).</w:t>
       </w:r>
     </w:p>
     <w:p>
@@ -7140,7 +6996,7 @@
       <w:r>
         <w:drawing>
           <wp:inline distT="0" distB="0" distL="0" distR="0">
-            <wp:extent cx="4114800" cy="1657350"/>
+            <wp:extent cx="4114800" cy="2028825"/>
             <wp:effectExtent t="0" r="0" b="0" l="0"/>
             <wp:docPr id="1" name="" descr="" title=""/>
             <wp:cNvGraphicFramePr>
@@ -7165,7 +7021,7 @@
                   <pic:spPr bwMode="auto">
                     <a:xfrm>
                       <a:off x="0" y="0"/>
-                      <a:ext cx="4114800" cy="1657350"/>
+                      <a:ext cx="4114800" cy="2028825"/>
                     </a:xfrm>
                     <a:prstGeom prst="rect">
                       <a:avLst/>
@@ -7235,7 +7091,7 @@
     </w:p>
     <w:tbl>
       <w:tblPr>
-        <w:tblW w:type="auto" w:w="0"/>
+        <w:tblW w:type="dxa" w:w="9360"/>
         <w:tblBorders>
           <w:top w:val="none" w:color="FFFFFF" w:sz="0"/>
           <w:left w:val="none" w:color="FFFFFF" w:sz="0"/>
@@ -7244,7 +7100,7 @@
           <w:insideH w:val="single" w:color="auto" w:sz="4"/>
           <w:insideV w:val="single" w:color="auto" w:sz="4"/>
         </w:tblBorders>
-        <w:tblLayout w:type="autofit"/>
+        <w:tblLayout w:type="fixed"/>
       </w:tblPr>
       <w:tblGrid>
         <w:gridCol w:w="100"/>
@@ -7261,7 +7117,7 @@
       <w:tr>
         <w:tc>
           <w:tcPr>
-            <w:tcW w:type="auto" w:w="0"/>
+            <w:tcW w:type="dxa" w:w="2900"/>
             <w:tcBorders>
               <w:top w:val="none" w:color="FFFFFF" w:sz="0"/>
               <w:left w:val="none" w:color="FFFFFF" w:sz="0"/>
@@ -7291,7 +7147,7 @@
         </w:tc>
         <w:tc>
           <w:tcPr>
-            <w:tcW w:type="auto" w:w="0"/>
+            <w:tcW w:type="dxa" w:w="560"/>
             <w:tcBorders>
               <w:top w:val="none" w:color="FFFFFF" w:sz="0"/>
               <w:left w:val="none" w:color="FFFFFF" w:sz="0"/>
@@ -7321,7 +7177,7 @@
         </w:tc>
         <w:tc>
           <w:tcPr>
-            <w:tcW w:type="auto" w:w="0"/>
+            <w:tcW w:type="dxa" w:w="640"/>
             <w:tcBorders>
               <w:top w:val="none" w:color="FFFFFF" w:sz="0"/>
               <w:left w:val="none" w:color="FFFFFF" w:sz="0"/>
@@ -7351,7 +7207,7 @@
         </w:tc>
         <w:tc>
           <w:tcPr>
-            <w:tcW w:type="auto" w:w="0"/>
+            <w:tcW w:type="dxa" w:w="800"/>
             <w:tcBorders>
               <w:top w:val="none" w:color="FFFFFF" w:sz="0"/>
               <w:left w:val="none" w:color="FFFFFF" w:sz="0"/>
@@ -7381,7 +7237,7 @@
         </w:tc>
         <w:tc>
           <w:tcPr>
-            <w:tcW w:type="auto" w:w="0"/>
+            <w:tcW w:type="dxa" w:w="880"/>
             <w:tcBorders>
               <w:top w:val="none" w:color="FFFFFF" w:sz="0"/>
               <w:left w:val="none" w:color="FFFFFF" w:sz="0"/>
@@ -7411,7 +7267,7 @@
         </w:tc>
         <w:tc>
           <w:tcPr>
-            <w:tcW w:type="auto" w:w="0"/>
+            <w:tcW w:type="dxa" w:w="780"/>
             <w:tcBorders>
               <w:top w:val="none" w:color="FFFFFF" w:sz="0"/>
               <w:left w:val="none" w:color="FFFFFF" w:sz="0"/>
@@ -7441,7 +7297,7 @@
         </w:tc>
         <w:tc>
           <w:tcPr>
-            <w:tcW w:type="auto" w:w="0"/>
+            <w:tcW w:type="dxa" w:w="650"/>
             <w:tcBorders>
               <w:top w:val="none" w:color="FFFFFF" w:sz="0"/>
               <w:left w:val="none" w:color="FFFFFF" w:sz="0"/>
@@ -7471,7 +7327,7 @@
         </w:tc>
         <w:tc>
           <w:tcPr>
-            <w:tcW w:type="auto" w:w="0"/>
+            <w:tcW w:type="dxa" w:w="700"/>
             <w:tcBorders>
               <w:top w:val="none" w:color="FFFFFF" w:sz="0"/>
               <w:left w:val="none" w:color="FFFFFF" w:sz="0"/>
@@ -7501,7 +7357,7 @@
         </w:tc>
         <w:tc>
           <w:tcPr>
-            <w:tcW w:type="auto" w:w="0"/>
+            <w:tcW w:type="dxa" w:w="920"/>
             <w:tcBorders>
               <w:top w:val="none" w:color="FFFFFF" w:sz="0"/>
               <w:left w:val="none" w:color="FFFFFF" w:sz="0"/>
@@ -7531,7 +7387,7 @@
         </w:tc>
         <w:tc>
           <w:tcPr>
-            <w:tcW w:type="auto" w:w="0"/>
+            <w:tcW w:type="dxa" w:w="530"/>
             <w:tcBorders>
               <w:top w:val="none" w:color="FFFFFF" w:sz="0"/>
               <w:left w:val="none" w:color="FFFFFF" w:sz="0"/>
@@ -7563,36 +7419,36 @@
       <w:tr>
         <w:tc>
           <w:tcPr>
-            <w:tcW w:type="auto" w:w="0"/>
-            <w:tcBorders>
-              <w:top w:val="none" w:color="FFFFFF" w:sz="0"/>
-              <w:left w:val="none" w:color="FFFFFF" w:sz="0"/>
-              <w:bottom w:val="none" w:color="FFFFFF" w:sz="0"/>
-              <w:right w:val="none" w:color="FFFFFF" w:sz="0"/>
-            </w:tcBorders>
-            <w:tcMar>
-              <w:top w:type="dxa" w:w="80"/>
-              <w:left w:type="dxa" w:w="120"/>
-              <w:bottom w:type="dxa" w:w="80"/>
-              <w:right w:type="dxa" w:w="120"/>
-            </w:tcMar>
-          </w:tcPr>
-          <w:p>
-            <w:r>
-              <w:rPr>
-                <w:rFonts w:ascii="Calibri" w:cs="Calibri" w:eastAsia="Calibri" w:hAnsi="Calibri"/>
-                <w:b w:val="false"/>
-                <w:bCs w:val="false"/>
-                <w:sz w:val="22"/>
-                <w:szCs w:val="22"/>
-              </w:rPr>
-              <w:t xml:space="preserve">Safe and stable (90+ days)</w:t>
-            </w:r>
-          </w:p>
-        </w:tc>
-        <w:tc>
-          <w:tcPr>
-            <w:tcW w:type="auto" w:w="0"/>
+            <w:tcW w:type="dxa" w:w="2900"/>
+            <w:tcBorders>
+              <w:top w:val="none" w:color="FFFFFF" w:sz="0"/>
+              <w:left w:val="none" w:color="FFFFFF" w:sz="0"/>
+              <w:bottom w:val="none" w:color="FFFFFF" w:sz="0"/>
+              <w:right w:val="none" w:color="FFFFFF" w:sz="0"/>
+            </w:tcBorders>
+            <w:tcMar>
+              <w:top w:type="dxa" w:w="80"/>
+              <w:left w:type="dxa" w:w="120"/>
+              <w:bottom w:type="dxa" w:w="80"/>
+              <w:right w:type="dxa" w:w="120"/>
+            </w:tcMar>
+          </w:tcPr>
+          <w:p>
+            <w:r>
+              <w:rPr>
+                <w:rFonts w:ascii="Calibri" w:cs="Calibri" w:eastAsia="Calibri" w:hAnsi="Calibri"/>
+                <w:b w:val="false"/>
+                <w:bCs w:val="false"/>
+                <w:sz w:val="22"/>
+                <w:szCs w:val="22"/>
+              </w:rPr>
+              <w:t xml:space="preserve">Safe and stable</w:t>
+            </w:r>
+          </w:p>
+        </w:tc>
+        <w:tc>
+          <w:tcPr>
+            <w:tcW w:type="dxa" w:w="560"/>
             <w:tcBorders>
               <w:top w:val="none" w:color="FFFFFF" w:sz="0"/>
               <w:left w:val="none" w:color="FFFFFF" w:sz="0"/>
@@ -7621,7 +7477,7 @@
         </w:tc>
         <w:tc>
           <w:tcPr>
-            <w:tcW w:type="auto" w:w="0"/>
+            <w:tcW w:type="dxa" w:w="640"/>
             <w:tcBorders>
               <w:top w:val="none" w:color="FFFFFF" w:sz="0"/>
               <w:left w:val="none" w:color="FFFFFF" w:sz="0"/>
@@ -7650,7 +7506,7 @@
         </w:tc>
         <w:tc>
           <w:tcPr>
-            <w:tcW w:type="auto" w:w="0"/>
+            <w:tcW w:type="dxa" w:w="800"/>
             <w:tcBorders>
               <w:top w:val="none" w:color="FFFFFF" w:sz="0"/>
               <w:left w:val="none" w:color="FFFFFF" w:sz="0"/>
@@ -7679,7 +7535,7 @@
         </w:tc>
         <w:tc>
           <w:tcPr>
-            <w:tcW w:type="auto" w:w="0"/>
+            <w:tcW w:type="dxa" w:w="880"/>
             <w:tcBorders>
               <w:top w:val="none" w:color="FFFFFF" w:sz="0"/>
               <w:left w:val="none" w:color="FFFFFF" w:sz="0"/>
@@ -7708,7 +7564,7 @@
         </w:tc>
         <w:tc>
           <w:tcPr>
-            <w:tcW w:type="auto" w:w="0"/>
+            <w:tcW w:type="dxa" w:w="780"/>
             <w:tcBorders>
               <w:top w:val="none" w:color="FFFFFF" w:sz="0"/>
               <w:left w:val="none" w:color="FFFFFF" w:sz="0"/>
@@ -7737,7 +7593,7 @@
         </w:tc>
         <w:tc>
           <w:tcPr>
-            <w:tcW w:type="auto" w:w="0"/>
+            <w:tcW w:type="dxa" w:w="650"/>
             <w:tcBorders>
               <w:top w:val="none" w:color="FFFFFF" w:sz="0"/>
               <w:left w:val="none" w:color="FFFFFF" w:sz="0"/>
@@ -7766,7 +7622,7 @@
         </w:tc>
         <w:tc>
           <w:tcPr>
-            <w:tcW w:type="auto" w:w="0"/>
+            <w:tcW w:type="dxa" w:w="700"/>
             <w:tcBorders>
               <w:top w:val="none" w:color="FFFFFF" w:sz="0"/>
               <w:left w:val="none" w:color="FFFFFF" w:sz="0"/>
@@ -7795,7 +7651,7 @@
         </w:tc>
         <w:tc>
           <w:tcPr>
-            <w:tcW w:type="auto" w:w="0"/>
+            <w:tcW w:type="dxa" w:w="920"/>
             <w:tcBorders>
               <w:top w:val="none" w:color="FFFFFF" w:sz="0"/>
               <w:left w:val="none" w:color="FFFFFF" w:sz="0"/>
@@ -7824,7 +7680,7 @@
         </w:tc>
         <w:tc>
           <w:tcPr>
-            <w:tcW w:type="auto" w:w="0"/>
+            <w:tcW w:type="dxa" w:w="530"/>
             <w:tcBorders>
               <w:top w:val="none" w:color="FFFFFF" w:sz="0"/>
               <w:left w:val="none" w:color="FFFFFF" w:sz="0"/>
@@ -7855,36 +7711,36 @@
       <w:tr>
         <w:tc>
           <w:tcPr>
-            <w:tcW w:type="auto" w:w="0"/>
-            <w:tcBorders>
-              <w:top w:val="none" w:color="FFFFFF" w:sz="0"/>
-              <w:left w:val="none" w:color="FFFFFF" w:sz="0"/>
-              <w:bottom w:val="none" w:color="FFFFFF" w:sz="0"/>
-              <w:right w:val="none" w:color="FFFFFF" w:sz="0"/>
-            </w:tcBorders>
-            <w:tcMar>
-              <w:top w:type="dxa" w:w="80"/>
-              <w:left w:type="dxa" w:w="120"/>
-              <w:bottom w:type="dxa" w:w="80"/>
-              <w:right w:type="dxa" w:w="120"/>
-            </w:tcMar>
-          </w:tcPr>
-          <w:p>
-            <w:r>
-              <w:rPr>
-                <w:rFonts w:ascii="Calibri" w:cs="Calibri" w:eastAsia="Calibri" w:hAnsi="Calibri"/>
-                <w:b w:val="false"/>
-                <w:bCs w:val="false"/>
-                <w:sz w:val="22"/>
-                <w:szCs w:val="22"/>
-              </w:rPr>
-              <w:t xml:space="preserve">Safe, but cannot stay 90 days</w:t>
-            </w:r>
-          </w:p>
-        </w:tc>
-        <w:tc>
-          <w:tcPr>
-            <w:tcW w:type="auto" w:w="0"/>
+            <w:tcW w:type="dxa" w:w="2900"/>
+            <w:tcBorders>
+              <w:top w:val="none" w:color="FFFFFF" w:sz="0"/>
+              <w:left w:val="none" w:color="FFFFFF" w:sz="0"/>
+              <w:bottom w:val="none" w:color="FFFFFF" w:sz="0"/>
+              <w:right w:val="none" w:color="FFFFFF" w:sz="0"/>
+            </w:tcBorders>
+            <w:tcMar>
+              <w:top w:type="dxa" w:w="80"/>
+              <w:left w:type="dxa" w:w="120"/>
+              <w:bottom w:type="dxa" w:w="80"/>
+              <w:right w:type="dxa" w:w="120"/>
+            </w:tcMar>
+          </w:tcPr>
+          <w:p>
+            <w:r>
+              <w:rPr>
+                <w:rFonts w:ascii="Calibri" w:cs="Calibri" w:eastAsia="Calibri" w:hAnsi="Calibri"/>
+                <w:b w:val="false"/>
+                <w:bCs w:val="false"/>
+                <w:sz w:val="22"/>
+                <w:szCs w:val="22"/>
+              </w:rPr>
+              <w:t xml:space="preserve">Safe, cannot stay 90 days</w:t>
+            </w:r>
+          </w:p>
+        </w:tc>
+        <w:tc>
+          <w:tcPr>
+            <w:tcW w:type="dxa" w:w="560"/>
             <w:tcBorders>
               <w:top w:val="none" w:color="FFFFFF" w:sz="0"/>
               <w:left w:val="none" w:color="FFFFFF" w:sz="0"/>
@@ -7913,7 +7769,7 @@
         </w:tc>
         <w:tc>
           <w:tcPr>
-            <w:tcW w:type="auto" w:w="0"/>
+            <w:tcW w:type="dxa" w:w="640"/>
             <w:tcBorders>
               <w:top w:val="none" w:color="FFFFFF" w:sz="0"/>
               <w:left w:val="none" w:color="FFFFFF" w:sz="0"/>
@@ -7942,7 +7798,7 @@
         </w:tc>
         <w:tc>
           <w:tcPr>
-            <w:tcW w:type="auto" w:w="0"/>
+            <w:tcW w:type="dxa" w:w="800"/>
             <w:tcBorders>
               <w:top w:val="none" w:color="FFFFFF" w:sz="0"/>
               <w:left w:val="none" w:color="FFFFFF" w:sz="0"/>
@@ -7971,7 +7827,7 @@
         </w:tc>
         <w:tc>
           <w:tcPr>
-            <w:tcW w:type="auto" w:w="0"/>
+            <w:tcW w:type="dxa" w:w="880"/>
             <w:tcBorders>
               <w:top w:val="none" w:color="FFFFFF" w:sz="0"/>
               <w:left w:val="none" w:color="FFFFFF" w:sz="0"/>
@@ -8000,7 +7856,7 @@
         </w:tc>
         <w:tc>
           <w:tcPr>
-            <w:tcW w:type="auto" w:w="0"/>
+            <w:tcW w:type="dxa" w:w="780"/>
             <w:tcBorders>
               <w:top w:val="none" w:color="FFFFFF" w:sz="0"/>
               <w:left w:val="none" w:color="FFFFFF" w:sz="0"/>
@@ -8029,7 +7885,7 @@
         </w:tc>
         <w:tc>
           <w:tcPr>
-            <w:tcW w:type="auto" w:w="0"/>
+            <w:tcW w:type="dxa" w:w="650"/>
             <w:tcBorders>
               <w:top w:val="none" w:color="FFFFFF" w:sz="0"/>
               <w:left w:val="none" w:color="FFFFFF" w:sz="0"/>
@@ -8058,7 +7914,7 @@
         </w:tc>
         <w:tc>
           <w:tcPr>
-            <w:tcW w:type="auto" w:w="0"/>
+            <w:tcW w:type="dxa" w:w="700"/>
             <w:tcBorders>
               <w:top w:val="none" w:color="FFFFFF" w:sz="0"/>
               <w:left w:val="none" w:color="FFFFFF" w:sz="0"/>
@@ -8087,7 +7943,7 @@
         </w:tc>
         <w:tc>
           <w:tcPr>
-            <w:tcW w:type="auto" w:w="0"/>
+            <w:tcW w:type="dxa" w:w="920"/>
             <w:tcBorders>
               <w:top w:val="none" w:color="FFFFFF" w:sz="0"/>
               <w:left w:val="none" w:color="FFFFFF" w:sz="0"/>
@@ -8116,7 +7972,7 @@
         </w:tc>
         <w:tc>
           <w:tcPr>
-            <w:tcW w:type="auto" w:w="0"/>
+            <w:tcW w:type="dxa" w:w="530"/>
             <w:tcBorders>
               <w:top w:val="none" w:color="FFFFFF" w:sz="0"/>
               <w:left w:val="none" w:color="FFFFFF" w:sz="0"/>
@@ -8147,36 +8003,36 @@
       <w:tr>
         <w:tc>
           <w:tcPr>
-            <w:tcW w:type="auto" w:w="0"/>
-            <w:tcBorders>
-              <w:top w:val="none" w:color="FFFFFF" w:sz="0"/>
-              <w:left w:val="none" w:color="FFFFFF" w:sz="0"/>
-              <w:bottom w:val="none" w:color="FFFFFF" w:sz="0"/>
-              <w:right w:val="none" w:color="FFFFFF" w:sz="0"/>
-            </w:tcBorders>
-            <w:tcMar>
-              <w:top w:type="dxa" w:w="80"/>
-              <w:left w:type="dxa" w:w="120"/>
-              <w:bottom w:type="dxa" w:w="80"/>
-              <w:right w:type="dxa" w:w="120"/>
-            </w:tcMar>
-          </w:tcPr>
-          <w:p>
-            <w:r>
-              <w:rPr>
-                <w:rFonts w:ascii="Calibri" w:cs="Calibri" w:eastAsia="Calibri" w:hAnsi="Calibri"/>
-                <w:b w:val="false"/>
-                <w:bCs w:val="false"/>
-                <w:sz w:val="22"/>
-                <w:szCs w:val="22"/>
-              </w:rPr>
-              <w:t xml:space="preserve">Can stay 90 days, but not safe</w:t>
-            </w:r>
-          </w:p>
-        </w:tc>
-        <w:tc>
-          <w:tcPr>
-            <w:tcW w:type="auto" w:w="0"/>
+            <w:tcW w:type="dxa" w:w="2900"/>
+            <w:tcBorders>
+              <w:top w:val="none" w:color="FFFFFF" w:sz="0"/>
+              <w:left w:val="none" w:color="FFFFFF" w:sz="0"/>
+              <w:bottom w:val="none" w:color="FFFFFF" w:sz="0"/>
+              <w:right w:val="none" w:color="FFFFFF" w:sz="0"/>
+            </w:tcBorders>
+            <w:tcMar>
+              <w:top w:type="dxa" w:w="80"/>
+              <w:left w:type="dxa" w:w="120"/>
+              <w:bottom w:type="dxa" w:w="80"/>
+              <w:right w:type="dxa" w:w="120"/>
+            </w:tcMar>
+          </w:tcPr>
+          <w:p>
+            <w:r>
+              <w:rPr>
+                <w:rFonts w:ascii="Calibri" w:cs="Calibri" w:eastAsia="Calibri" w:hAnsi="Calibri"/>
+                <w:b w:val="false"/>
+                <w:bCs w:val="false"/>
+                <w:sz w:val="22"/>
+                <w:szCs w:val="22"/>
+              </w:rPr>
+              <w:t xml:space="preserve">Can stay, but not safe</w:t>
+            </w:r>
+          </w:p>
+        </w:tc>
+        <w:tc>
+          <w:tcPr>
+            <w:tcW w:type="dxa" w:w="560"/>
             <w:tcBorders>
               <w:top w:val="none" w:color="FFFFFF" w:sz="0"/>
               <w:left w:val="none" w:color="FFFFFF" w:sz="0"/>
@@ -8205,7 +8061,7 @@
         </w:tc>
         <w:tc>
           <w:tcPr>
-            <w:tcW w:type="auto" w:w="0"/>
+            <w:tcW w:type="dxa" w:w="640"/>
             <w:tcBorders>
               <w:top w:val="none" w:color="FFFFFF" w:sz="0"/>
               <w:left w:val="none" w:color="FFFFFF" w:sz="0"/>
@@ -8234,7 +8090,7 @@
         </w:tc>
         <w:tc>
           <w:tcPr>
-            <w:tcW w:type="auto" w:w="0"/>
+            <w:tcW w:type="dxa" w:w="800"/>
             <w:tcBorders>
               <w:top w:val="none" w:color="FFFFFF" w:sz="0"/>
               <w:left w:val="none" w:color="FFFFFF" w:sz="0"/>
@@ -8263,7 +8119,7 @@
         </w:tc>
         <w:tc>
           <w:tcPr>
-            <w:tcW w:type="auto" w:w="0"/>
+            <w:tcW w:type="dxa" w:w="880"/>
             <w:tcBorders>
               <w:top w:val="none" w:color="FFFFFF" w:sz="0"/>
               <w:left w:val="none" w:color="FFFFFF" w:sz="0"/>
@@ -8292,7 +8148,7 @@
         </w:tc>
         <w:tc>
           <w:tcPr>
-            <w:tcW w:type="auto" w:w="0"/>
+            <w:tcW w:type="dxa" w:w="780"/>
             <w:tcBorders>
               <w:top w:val="none" w:color="FFFFFF" w:sz="0"/>
               <w:left w:val="none" w:color="FFFFFF" w:sz="0"/>
@@ -8321,7 +8177,7 @@
         </w:tc>
         <w:tc>
           <w:tcPr>
-            <w:tcW w:type="auto" w:w="0"/>
+            <w:tcW w:type="dxa" w:w="650"/>
             <w:tcBorders>
               <w:top w:val="none" w:color="FFFFFF" w:sz="0"/>
               <w:left w:val="none" w:color="FFFFFF" w:sz="0"/>
@@ -8350,7 +8206,7 @@
         </w:tc>
         <w:tc>
           <w:tcPr>
-            <w:tcW w:type="auto" w:w="0"/>
+            <w:tcW w:type="dxa" w:w="700"/>
             <w:tcBorders>
               <w:top w:val="none" w:color="FFFFFF" w:sz="0"/>
               <w:left w:val="none" w:color="FFFFFF" w:sz="0"/>
@@ -8379,7 +8235,7 @@
         </w:tc>
         <w:tc>
           <w:tcPr>
-            <w:tcW w:type="auto" w:w="0"/>
+            <w:tcW w:type="dxa" w:w="920"/>
             <w:tcBorders>
               <w:top w:val="none" w:color="FFFFFF" w:sz="0"/>
               <w:left w:val="none" w:color="FFFFFF" w:sz="0"/>
@@ -8408,7 +8264,7 @@
         </w:tc>
         <w:tc>
           <w:tcPr>
-            <w:tcW w:type="auto" w:w="0"/>
+            <w:tcW w:type="dxa" w:w="530"/>
             <w:tcBorders>
               <w:top w:val="none" w:color="FFFFFF" w:sz="0"/>
               <w:left w:val="none" w:color="FFFFFF" w:sz="0"/>
@@ -8439,7 +8295,7 @@
       <w:tr>
         <w:tc>
           <w:tcPr>
-            <w:tcW w:type="auto" w:w="0"/>
+            <w:tcW w:type="dxa" w:w="2900"/>
             <w:tcBorders>
               <w:top w:val="none" w:color="FFFFFF" w:sz="0"/>
               <w:left w:val="none" w:color="FFFFFF" w:sz="0"/>
@@ -8468,7 +8324,7 @@
         </w:tc>
         <w:tc>
           <w:tcPr>
-            <w:tcW w:type="auto" w:w="0"/>
+            <w:tcW w:type="dxa" w:w="560"/>
             <w:tcBorders>
               <w:top w:val="none" w:color="FFFFFF" w:sz="0"/>
               <w:left w:val="none" w:color="FFFFFF" w:sz="0"/>
@@ -8497,7 +8353,7 @@
         </w:tc>
         <w:tc>
           <w:tcPr>
-            <w:tcW w:type="auto" w:w="0"/>
+            <w:tcW w:type="dxa" w:w="640"/>
             <w:tcBorders>
               <w:top w:val="none" w:color="FFFFFF" w:sz="0"/>
               <w:left w:val="none" w:color="FFFFFF" w:sz="0"/>
@@ -8526,7 +8382,7 @@
         </w:tc>
         <w:tc>
           <w:tcPr>
-            <w:tcW w:type="auto" w:w="0"/>
+            <w:tcW w:type="dxa" w:w="800"/>
             <w:tcBorders>
               <w:top w:val="none" w:color="FFFFFF" w:sz="0"/>
               <w:left w:val="none" w:color="FFFFFF" w:sz="0"/>
@@ -8555,7 +8411,7 @@
         </w:tc>
         <w:tc>
           <w:tcPr>
-            <w:tcW w:type="auto" w:w="0"/>
+            <w:tcW w:type="dxa" w:w="880"/>
             <w:tcBorders>
               <w:top w:val="none" w:color="FFFFFF" w:sz="0"/>
               <w:left w:val="none" w:color="FFFFFF" w:sz="0"/>
@@ -8584,7 +8440,7 @@
         </w:tc>
         <w:tc>
           <w:tcPr>
-            <w:tcW w:type="auto" w:w="0"/>
+            <w:tcW w:type="dxa" w:w="780"/>
             <w:tcBorders>
               <w:top w:val="none" w:color="FFFFFF" w:sz="0"/>
               <w:left w:val="none" w:color="FFFFFF" w:sz="0"/>
@@ -8613,7 +8469,7 @@
         </w:tc>
         <w:tc>
           <w:tcPr>
-            <w:tcW w:type="auto" w:w="0"/>
+            <w:tcW w:type="dxa" w:w="650"/>
             <w:tcBorders>
               <w:top w:val="none" w:color="FFFFFF" w:sz="0"/>
               <w:left w:val="none" w:color="FFFFFF" w:sz="0"/>
@@ -8642,7 +8498,7 @@
         </w:tc>
         <w:tc>
           <w:tcPr>
-            <w:tcW w:type="auto" w:w="0"/>
+            <w:tcW w:type="dxa" w:w="700"/>
             <w:tcBorders>
               <w:top w:val="none" w:color="FFFFFF" w:sz="0"/>
               <w:left w:val="none" w:color="FFFFFF" w:sz="0"/>
@@ -8671,7 +8527,7 @@
         </w:tc>
         <w:tc>
           <w:tcPr>
-            <w:tcW w:type="auto" w:w="0"/>
+            <w:tcW w:type="dxa" w:w="920"/>
             <w:tcBorders>
               <w:top w:val="none" w:color="FFFFFF" w:sz="0"/>
               <w:left w:val="none" w:color="FFFFFF" w:sz="0"/>
@@ -8700,7 +8556,7 @@
         </w:tc>
         <w:tc>
           <w:tcPr>
-            <w:tcW w:type="auto" w:w="0"/>
+            <w:tcW w:type="dxa" w:w="530"/>
             <w:tcBorders>
               <w:top w:val="none" w:color="FFFFFF" w:sz="0"/>
               <w:left w:val="none" w:color="FFFFFF" w:sz="0"/>
@@ -8731,7 +8587,7 @@
       <w:tr>
         <w:tc>
           <w:tcPr>
-            <w:tcW w:type="auto" w:w="0"/>
+            <w:tcW w:type="dxa" w:w="2900"/>
             <w:tcBorders>
               <w:top w:val="none" w:color="FFFFFF" w:sz="0"/>
               <w:left w:val="none" w:color="FFFFFF" w:sz="0"/>
@@ -8761,7 +8617,7 @@
         </w:tc>
         <w:tc>
           <w:tcPr>
-            <w:tcW w:type="auto" w:w="0"/>
+            <w:tcW w:type="dxa" w:w="560"/>
             <w:tcBorders>
               <w:top w:val="none" w:color="FFFFFF" w:sz="0"/>
               <w:left w:val="none" w:color="FFFFFF" w:sz="0"/>
@@ -8791,7 +8647,7 @@
         </w:tc>
         <w:tc>
           <w:tcPr>
-            <w:tcW w:type="auto" w:w="0"/>
+            <w:tcW w:type="dxa" w:w="640"/>
             <w:tcBorders>
               <w:top w:val="none" w:color="FFFFFF" w:sz="0"/>
               <w:left w:val="none" w:color="FFFFFF" w:sz="0"/>
@@ -8821,7 +8677,7 @@
         </w:tc>
         <w:tc>
           <w:tcPr>
-            <w:tcW w:type="auto" w:w="0"/>
+            <w:tcW w:type="dxa" w:w="800"/>
             <w:tcBorders>
               <w:top w:val="none" w:color="FFFFFF" w:sz="0"/>
               <w:left w:val="none" w:color="FFFFFF" w:sz="0"/>
@@ -8851,7 +8707,7 @@
         </w:tc>
         <w:tc>
           <w:tcPr>
-            <w:tcW w:type="auto" w:w="0"/>
+            <w:tcW w:type="dxa" w:w="880"/>
             <w:tcBorders>
               <w:top w:val="none" w:color="FFFFFF" w:sz="0"/>
               <w:left w:val="none" w:color="FFFFFF" w:sz="0"/>
@@ -8881,7 +8737,7 @@
         </w:tc>
         <w:tc>
           <w:tcPr>
-            <w:tcW w:type="auto" w:w="0"/>
+            <w:tcW w:type="dxa" w:w="780"/>
             <w:tcBorders>
               <w:top w:val="none" w:color="FFFFFF" w:sz="0"/>
               <w:left w:val="none" w:color="FFFFFF" w:sz="0"/>
@@ -8911,7 +8767,7 @@
         </w:tc>
         <w:tc>
           <w:tcPr>
-            <w:tcW w:type="auto" w:w="0"/>
+            <w:tcW w:type="dxa" w:w="650"/>
             <w:tcBorders>
               <w:top w:val="none" w:color="FFFFFF" w:sz="0"/>
               <w:left w:val="none" w:color="FFFFFF" w:sz="0"/>
@@ -8941,7 +8797,7 @@
         </w:tc>
         <w:tc>
           <w:tcPr>
-            <w:tcW w:type="auto" w:w="0"/>
+            <w:tcW w:type="dxa" w:w="700"/>
             <w:tcBorders>
               <w:top w:val="none" w:color="FFFFFF" w:sz="0"/>
               <w:left w:val="none" w:color="FFFFFF" w:sz="0"/>
@@ -8971,7 +8827,7 @@
         </w:tc>
         <w:tc>
           <w:tcPr>
-            <w:tcW w:type="auto" w:w="0"/>
+            <w:tcW w:type="dxa" w:w="920"/>
             <w:tcBorders>
               <w:top w:val="none" w:color="FFFFFF" w:sz="0"/>
               <w:left w:val="none" w:color="FFFFFF" w:sz="0"/>
@@ -9001,7 +8857,7 @@
         </w:tc>
         <w:tc>
           <w:tcPr>
-            <w:tcW w:type="auto" w:w="0"/>
+            <w:tcW w:type="dxa" w:w="530"/>
             <w:tcBorders>
               <w:top w:val="none" w:color="FFFFFF" w:sz="0"/>
               <w:left w:val="none" w:color="FFFFFF" w:sz="0"/>

</xml_diff>

<commit_message>
reviewed through main reasons for visiting
</commit_message>
<xml_diff>
--- a/report/412YZ/report_412YZ_v2.docx
+++ b/report/412YZ/report_412YZ_v2.docx
@@ -24055,7 +24055,7 @@
           <w:sz w:val="22"/>
           <w:szCs w:val="22"/>
         </w:rPr>
-        <w:t xml:space="preserve">6 of the 55 youth who provided a reason (11%) said they did not know how to register, and unlike March 2025, no respondents in the current data reported being registered while also selecting a reason for not being registered.</w:t>
+        <w:t xml:space="preserve">6 of the 55 youth who provided a reason (11%) said they did not know how to register. Another 5 youth indicated they had not completed the registration process, suggesting a concrete opportunity for the 412 Youth Zone to help youth navigate and finish registration.</w:t>
       </w:r>
     </w:p>
     <w:p>
@@ -24312,38 +24312,38 @@
                 <w:szCs w:val="22"/>
                 <w:u w:val="none"/>
               </w:rPr>
-              <w:t xml:space="preserve">9</w:t>
-            </w:r>
-          </w:p>
-        </w:tc>
-        <w:tc>
-          <w:tcPr>
-            <w:tcW w:type="auto" w:w="0"/>
-            <w:tcBorders>
-              <w:top w:val="none" w:color="FFFFFF" w:sz="0"/>
-              <w:left w:val="none" w:color="FFFFFF" w:sz="0"/>
-              <w:bottom w:val="none" w:color="FFFFFF" w:sz="0"/>
-              <w:right w:val="none" w:color="FFFFFF" w:sz="0"/>
-            </w:tcBorders>
-            <w:tcMar>
-              <w:top w:type="dxa" w:w="80"/>
-              <w:left w:type="dxa" w:w="120"/>
-              <w:bottom w:type="dxa" w:w="80"/>
-              <w:right w:type="dxa" w:w="120"/>
-            </w:tcMar>
-            <w:vAlign w:val="center"/>
-          </w:tcPr>
-          <w:p>
-            <w:r>
-              <w:rPr>
-                <w:rFonts w:ascii="Calibri" w:cs="Calibri" w:eastAsia="Calibri" w:hAnsi="Calibri"/>
-                <w:b w:val="false"/>
-                <w:bCs w:val="false"/>
-                <w:sz w:val="22"/>
-                <w:szCs w:val="22"/>
-                <w:u w:val="none"/>
-              </w:rPr>
-              <w:t xml:space="preserve">22</w:t>
+              <w:t xml:space="preserve">10</w:t>
+            </w:r>
+          </w:p>
+        </w:tc>
+        <w:tc>
+          <w:tcPr>
+            <w:tcW w:type="auto" w:w="0"/>
+            <w:tcBorders>
+              <w:top w:val="none" w:color="FFFFFF" w:sz="0"/>
+              <w:left w:val="none" w:color="FFFFFF" w:sz="0"/>
+              <w:bottom w:val="none" w:color="FFFFFF" w:sz="0"/>
+              <w:right w:val="none" w:color="FFFFFF" w:sz="0"/>
+            </w:tcBorders>
+            <w:tcMar>
+              <w:top w:type="dxa" w:w="80"/>
+              <w:left w:type="dxa" w:w="120"/>
+              <w:bottom w:type="dxa" w:w="80"/>
+              <w:right w:type="dxa" w:w="120"/>
+            </w:tcMar>
+            <w:vAlign w:val="center"/>
+          </w:tcPr>
+          <w:p>
+            <w:r>
+              <w:rPr>
+                <w:rFonts w:ascii="Calibri" w:cs="Calibri" w:eastAsia="Calibri" w:hAnsi="Calibri"/>
+                <w:b w:val="false"/>
+                <w:bCs w:val="false"/>
+                <w:sz w:val="22"/>
+                <w:szCs w:val="22"/>
+                <w:u w:val="none"/>
+              </w:rPr>
+              <w:t xml:space="preserve">23</w:t>
             </w:r>
           </w:p>
         </w:tc>
@@ -24564,38 +24564,554 @@
                 <w:szCs w:val="22"/>
                 <w:u w:val="none"/>
               </w:rPr>
-              <w:t xml:space="preserve">3</w:t>
-            </w:r>
-          </w:p>
-        </w:tc>
-        <w:tc>
-          <w:tcPr>
-            <w:tcW w:type="auto" w:w="0"/>
-            <w:tcBorders>
-              <w:top w:val="none" w:color="FFFFFF" w:sz="0"/>
-              <w:left w:val="none" w:color="FFFFFF" w:sz="0"/>
-              <w:bottom w:val="none" w:color="FFFFFF" w:sz="0"/>
-              <w:right w:val="none" w:color="FFFFFF" w:sz="0"/>
-            </w:tcBorders>
-            <w:tcMar>
-              <w:top w:type="dxa" w:w="80"/>
-              <w:left w:type="dxa" w:w="120"/>
-              <w:bottom w:type="dxa" w:w="80"/>
-              <w:right w:type="dxa" w:w="120"/>
-            </w:tcMar>
-            <w:vAlign w:val="center"/>
-          </w:tcPr>
-          <w:p>
-            <w:r>
-              <w:rPr>
-                <w:rFonts w:ascii="Calibri" w:cs="Calibri" w:eastAsia="Calibri" w:hAnsi="Calibri"/>
-                <w:b w:val="false"/>
-                <w:bCs w:val="false"/>
-                <w:sz w:val="22"/>
-                <w:szCs w:val="22"/>
-                <w:u w:val="none"/>
-              </w:rPr>
-              <w:t xml:space="preserve">12</w:t>
+              <w:t xml:space="preserve">2</w:t>
+            </w:r>
+          </w:p>
+        </w:tc>
+        <w:tc>
+          <w:tcPr>
+            <w:tcW w:type="auto" w:w="0"/>
+            <w:tcBorders>
+              <w:top w:val="none" w:color="FFFFFF" w:sz="0"/>
+              <w:left w:val="none" w:color="FFFFFF" w:sz="0"/>
+              <w:bottom w:val="none" w:color="FFFFFF" w:sz="0"/>
+              <w:right w:val="none" w:color="FFFFFF" w:sz="0"/>
+            </w:tcBorders>
+            <w:tcMar>
+              <w:top w:type="dxa" w:w="80"/>
+              <w:left w:type="dxa" w:w="120"/>
+              <w:bottom w:type="dxa" w:w="80"/>
+              <w:right w:type="dxa" w:w="120"/>
+            </w:tcMar>
+            <w:vAlign w:val="center"/>
+          </w:tcPr>
+          <w:p>
+            <w:r>
+              <w:rPr>
+                <w:rFonts w:ascii="Calibri" w:cs="Calibri" w:eastAsia="Calibri" w:hAnsi="Calibri"/>
+                <w:b w:val="false"/>
+                <w:bCs w:val="false"/>
+                <w:sz w:val="22"/>
+                <w:szCs w:val="22"/>
+                <w:u w:val="none"/>
+              </w:rPr>
+              <w:t xml:space="preserve">11</w:t>
+            </w:r>
+          </w:p>
+        </w:tc>
+      </w:tr>
+      <w:tr>
+        <w:tc>
+          <w:tcPr>
+            <w:tcW w:type="auto" w:w="0"/>
+            <w:tcBorders>
+              <w:top w:val="none" w:color="FFFFFF" w:sz="0"/>
+              <w:left w:val="none" w:color="FFFFFF" w:sz="0"/>
+              <w:bottom w:val="none" w:color="FFFFFF" w:sz="0"/>
+              <w:right w:val="none" w:color="FFFFFF" w:sz="0"/>
+            </w:tcBorders>
+            <w:tcMar>
+              <w:top w:type="dxa" w:w="80"/>
+              <w:left w:type="dxa" w:w="120"/>
+              <w:bottom w:type="dxa" w:w="80"/>
+              <w:right w:type="dxa" w:w="120"/>
+            </w:tcMar>
+            <w:vAlign w:val="center"/>
+          </w:tcPr>
+          <w:p>
+            <w:pPr>
+              <w:ind w:left="480"/>
+            </w:pPr>
+            <w:r>
+              <w:rPr>
+                <w:rFonts w:ascii="Calibri" w:cs="Calibri" w:eastAsia="Calibri" w:hAnsi="Calibri"/>
+                <w:b w:val="false"/>
+                <w:bCs w:val="false"/>
+                <w:sz w:val="22"/>
+                <w:szCs w:val="22"/>
+                <w:u w:val="none"/>
+              </w:rPr>
+              <w:t xml:space="preserve">Has not completed registration process</w:t>
+            </w:r>
+          </w:p>
+        </w:tc>
+        <w:tc>
+          <w:tcPr>
+            <w:tcW w:type="auto" w:w="0"/>
+            <w:tcBorders>
+              <w:top w:val="none" w:color="FFFFFF" w:sz="0"/>
+              <w:left w:val="none" w:color="FFFFFF" w:sz="0"/>
+              <w:bottom w:val="none" w:color="FFFFFF" w:sz="0"/>
+              <w:right w:val="none" w:color="FFFFFF" w:sz="0"/>
+            </w:tcBorders>
+            <w:tcMar>
+              <w:top w:type="dxa" w:w="80"/>
+              <w:left w:type="dxa" w:w="120"/>
+              <w:bottom w:type="dxa" w:w="80"/>
+              <w:right w:type="dxa" w:w="120"/>
+            </w:tcMar>
+            <w:vAlign w:val="center"/>
+          </w:tcPr>
+          <w:p>
+            <w:r>
+              <w:rPr>
+                <w:rFonts w:ascii="Calibri" w:cs="Calibri" w:eastAsia="Calibri" w:hAnsi="Calibri"/>
+                <w:b w:val="false"/>
+                <w:bCs w:val="false"/>
+                <w:sz w:val="22"/>
+                <w:szCs w:val="22"/>
+                <w:u w:val="none"/>
+              </w:rPr>
+              <w:t xml:space="preserve">5</w:t>
+            </w:r>
+          </w:p>
+        </w:tc>
+        <w:tc>
+          <w:tcPr>
+            <w:tcW w:type="auto" w:w="0"/>
+            <w:tcBorders>
+              <w:top w:val="none" w:color="FFFFFF" w:sz="0"/>
+              <w:left w:val="none" w:color="FFFFFF" w:sz="0"/>
+              <w:bottom w:val="none" w:color="FFFFFF" w:sz="0"/>
+              <w:right w:val="none" w:color="FFFFFF" w:sz="0"/>
+            </w:tcBorders>
+            <w:tcMar>
+              <w:top w:type="dxa" w:w="80"/>
+              <w:left w:type="dxa" w:w="120"/>
+              <w:bottom w:type="dxa" w:w="80"/>
+              <w:right w:type="dxa" w:w="120"/>
+            </w:tcMar>
+            <w:vAlign w:val="center"/>
+          </w:tcPr>
+          <w:p>
+            <w:r>
+              <w:rPr>
+                <w:rFonts w:ascii="Calibri" w:cs="Calibri" w:eastAsia="Calibri" w:hAnsi="Calibri"/>
+                <w:b w:val="false"/>
+                <w:bCs w:val="false"/>
+                <w:sz w:val="22"/>
+                <w:szCs w:val="22"/>
+                <w:u w:val="none"/>
+              </w:rPr>
+              <w:t xml:space="preserve">0</w:t>
+            </w:r>
+          </w:p>
+        </w:tc>
+        <w:tc>
+          <w:tcPr>
+            <w:tcW w:type="auto" w:w="0"/>
+            <w:tcBorders>
+              <w:top w:val="none" w:color="FFFFFF" w:sz="0"/>
+              <w:left w:val="none" w:color="FFFFFF" w:sz="0"/>
+              <w:bottom w:val="none" w:color="FFFFFF" w:sz="0"/>
+              <w:right w:val="none" w:color="FFFFFF" w:sz="0"/>
+            </w:tcBorders>
+            <w:tcMar>
+              <w:top w:type="dxa" w:w="80"/>
+              <w:left w:type="dxa" w:w="120"/>
+              <w:bottom w:type="dxa" w:w="80"/>
+              <w:right w:type="dxa" w:w="120"/>
+            </w:tcMar>
+            <w:vAlign w:val="center"/>
+          </w:tcPr>
+          <w:p>
+            <w:r>
+              <w:rPr>
+                <w:rFonts w:ascii="Calibri" w:cs="Calibri" w:eastAsia="Calibri" w:hAnsi="Calibri"/>
+                <w:b w:val="false"/>
+                <w:bCs w:val="false"/>
+                <w:sz w:val="22"/>
+                <w:szCs w:val="22"/>
+                <w:u w:val="none"/>
+              </w:rPr>
+              <w:t xml:space="preserve">5</w:t>
+            </w:r>
+          </w:p>
+        </w:tc>
+      </w:tr>
+      <w:tr>
+        <w:tc>
+          <w:tcPr>
+            <w:tcW w:type="auto" w:w="0"/>
+            <w:tcBorders>
+              <w:top w:val="none" w:color="FFFFFF" w:sz="0"/>
+              <w:left w:val="none" w:color="FFFFFF" w:sz="0"/>
+              <w:bottom w:val="none" w:color="FFFFFF" w:sz="0"/>
+              <w:right w:val="none" w:color="FFFFFF" w:sz="0"/>
+            </w:tcBorders>
+            <w:tcMar>
+              <w:top w:type="dxa" w:w="80"/>
+              <w:left w:type="dxa" w:w="120"/>
+              <w:bottom w:type="dxa" w:w="80"/>
+              <w:right w:type="dxa" w:w="120"/>
+            </w:tcMar>
+            <w:vAlign w:val="center"/>
+          </w:tcPr>
+          <w:p>
+            <w:pPr>
+              <w:ind w:left="480"/>
+            </w:pPr>
+            <w:r>
+              <w:rPr>
+                <w:rFonts w:ascii="Calibri" w:cs="Calibri" w:eastAsia="Calibri" w:hAnsi="Calibri"/>
+                <w:b w:val="false"/>
+                <w:bCs w:val="false"/>
+                <w:sz w:val="22"/>
+                <w:szCs w:val="22"/>
+                <w:u w:val="none"/>
+              </w:rPr>
+              <w:t xml:space="preserve">Eligibility barrier</w:t>
+            </w:r>
+          </w:p>
+        </w:tc>
+        <w:tc>
+          <w:tcPr>
+            <w:tcW w:type="auto" w:w="0"/>
+            <w:tcBorders>
+              <w:top w:val="none" w:color="FFFFFF" w:sz="0"/>
+              <w:left w:val="none" w:color="FFFFFF" w:sz="0"/>
+              <w:bottom w:val="none" w:color="FFFFFF" w:sz="0"/>
+              <w:right w:val="none" w:color="FFFFFF" w:sz="0"/>
+            </w:tcBorders>
+            <w:tcMar>
+              <w:top w:type="dxa" w:w="80"/>
+              <w:left w:type="dxa" w:w="120"/>
+              <w:bottom w:type="dxa" w:w="80"/>
+              <w:right w:type="dxa" w:w="120"/>
+            </w:tcMar>
+            <w:vAlign w:val="center"/>
+          </w:tcPr>
+          <w:p>
+            <w:r>
+              <w:rPr>
+                <w:rFonts w:ascii="Calibri" w:cs="Calibri" w:eastAsia="Calibri" w:hAnsi="Calibri"/>
+                <w:b w:val="false"/>
+                <w:bCs w:val="false"/>
+                <w:sz w:val="22"/>
+                <w:szCs w:val="22"/>
+                <w:u w:val="none"/>
+              </w:rPr>
+              <w:t xml:space="preserve">2</w:t>
+            </w:r>
+          </w:p>
+        </w:tc>
+        <w:tc>
+          <w:tcPr>
+            <w:tcW w:type="auto" w:w="0"/>
+            <w:tcBorders>
+              <w:top w:val="none" w:color="FFFFFF" w:sz="0"/>
+              <w:left w:val="none" w:color="FFFFFF" w:sz="0"/>
+              <w:bottom w:val="none" w:color="FFFFFF" w:sz="0"/>
+              <w:right w:val="none" w:color="FFFFFF" w:sz="0"/>
+            </w:tcBorders>
+            <w:tcMar>
+              <w:top w:type="dxa" w:w="80"/>
+              <w:left w:type="dxa" w:w="120"/>
+              <w:bottom w:type="dxa" w:w="80"/>
+              <w:right w:type="dxa" w:w="120"/>
+            </w:tcMar>
+            <w:vAlign w:val="center"/>
+          </w:tcPr>
+          <w:p>
+            <w:r>
+              <w:rPr>
+                <w:rFonts w:ascii="Calibri" w:cs="Calibri" w:eastAsia="Calibri" w:hAnsi="Calibri"/>
+                <w:b w:val="false"/>
+                <w:bCs w:val="false"/>
+                <w:sz w:val="22"/>
+                <w:szCs w:val="22"/>
+                <w:u w:val="none"/>
+              </w:rPr>
+              <w:t xml:space="preserve">0</w:t>
+            </w:r>
+          </w:p>
+        </w:tc>
+        <w:tc>
+          <w:tcPr>
+            <w:tcW w:type="auto" w:w="0"/>
+            <w:tcBorders>
+              <w:top w:val="none" w:color="FFFFFF" w:sz="0"/>
+              <w:left w:val="none" w:color="FFFFFF" w:sz="0"/>
+              <w:bottom w:val="none" w:color="FFFFFF" w:sz="0"/>
+              <w:right w:val="none" w:color="FFFFFF" w:sz="0"/>
+            </w:tcBorders>
+            <w:tcMar>
+              <w:top w:type="dxa" w:w="80"/>
+              <w:left w:type="dxa" w:w="120"/>
+              <w:bottom w:type="dxa" w:w="80"/>
+              <w:right w:type="dxa" w:w="120"/>
+            </w:tcMar>
+            <w:vAlign w:val="center"/>
+          </w:tcPr>
+          <w:p>
+            <w:r>
+              <w:rPr>
+                <w:rFonts w:ascii="Calibri" w:cs="Calibri" w:eastAsia="Calibri" w:hAnsi="Calibri"/>
+                <w:b w:val="false"/>
+                <w:bCs w:val="false"/>
+                <w:sz w:val="22"/>
+                <w:szCs w:val="22"/>
+                <w:u w:val="none"/>
+              </w:rPr>
+              <w:t xml:space="preserve">2</w:t>
+            </w:r>
+          </w:p>
+        </w:tc>
+      </w:tr>
+      <w:tr>
+        <w:tc>
+          <w:tcPr>
+            <w:tcW w:type="auto" w:w="0"/>
+            <w:tcBorders>
+              <w:top w:val="none" w:color="FFFFFF" w:sz="0"/>
+              <w:left w:val="none" w:color="FFFFFF" w:sz="0"/>
+              <w:bottom w:val="none" w:color="FFFFFF" w:sz="0"/>
+              <w:right w:val="none" w:color="FFFFFF" w:sz="0"/>
+            </w:tcBorders>
+            <w:tcMar>
+              <w:top w:type="dxa" w:w="80"/>
+              <w:left w:type="dxa" w:w="120"/>
+              <w:bottom w:type="dxa" w:w="80"/>
+              <w:right w:type="dxa" w:w="120"/>
+            </w:tcMar>
+            <w:vAlign w:val="center"/>
+          </w:tcPr>
+          <w:p>
+            <w:pPr>
+              <w:ind w:left="480"/>
+            </w:pPr>
+            <w:r>
+              <w:rPr>
+                <w:rFonts w:ascii="Calibri" w:cs="Calibri" w:eastAsia="Calibri" w:hAnsi="Calibri"/>
+                <w:b w:val="false"/>
+                <w:bCs w:val="false"/>
+                <w:sz w:val="22"/>
+                <w:szCs w:val="22"/>
+                <w:u w:val="none"/>
+              </w:rPr>
+              <w:t xml:space="preserve">Not interested</w:t>
+            </w:r>
+          </w:p>
+        </w:tc>
+        <w:tc>
+          <w:tcPr>
+            <w:tcW w:type="auto" w:w="0"/>
+            <w:tcBorders>
+              <w:top w:val="none" w:color="FFFFFF" w:sz="0"/>
+              <w:left w:val="none" w:color="FFFFFF" w:sz="0"/>
+              <w:bottom w:val="none" w:color="FFFFFF" w:sz="0"/>
+              <w:right w:val="none" w:color="FFFFFF" w:sz="0"/>
+            </w:tcBorders>
+            <w:tcMar>
+              <w:top w:type="dxa" w:w="80"/>
+              <w:left w:type="dxa" w:w="120"/>
+              <w:bottom w:type="dxa" w:w="80"/>
+              <w:right w:type="dxa" w:w="120"/>
+            </w:tcMar>
+            <w:vAlign w:val="center"/>
+          </w:tcPr>
+          <w:p>
+            <w:r>
+              <w:rPr>
+                <w:rFonts w:ascii="Calibri" w:cs="Calibri" w:eastAsia="Calibri" w:hAnsi="Calibri"/>
+                <w:b w:val="false"/>
+                <w:bCs w:val="false"/>
+                <w:sz w:val="22"/>
+                <w:szCs w:val="22"/>
+                <w:u w:val="none"/>
+              </w:rPr>
+              <w:t xml:space="preserve">1</w:t>
+            </w:r>
+          </w:p>
+        </w:tc>
+        <w:tc>
+          <w:tcPr>
+            <w:tcW w:type="auto" w:w="0"/>
+            <w:tcBorders>
+              <w:top w:val="none" w:color="FFFFFF" w:sz="0"/>
+              <w:left w:val="none" w:color="FFFFFF" w:sz="0"/>
+              <w:bottom w:val="none" w:color="FFFFFF" w:sz="0"/>
+              <w:right w:val="none" w:color="FFFFFF" w:sz="0"/>
+            </w:tcBorders>
+            <w:tcMar>
+              <w:top w:type="dxa" w:w="80"/>
+              <w:left w:type="dxa" w:w="120"/>
+              <w:bottom w:type="dxa" w:w="80"/>
+              <w:right w:type="dxa" w:w="120"/>
+            </w:tcMar>
+            <w:vAlign w:val="center"/>
+          </w:tcPr>
+          <w:p>
+            <w:r>
+              <w:rPr>
+                <w:rFonts w:ascii="Calibri" w:cs="Calibri" w:eastAsia="Calibri" w:hAnsi="Calibri"/>
+                <w:b w:val="false"/>
+                <w:bCs w:val="false"/>
+                <w:sz w:val="22"/>
+                <w:szCs w:val="22"/>
+                <w:u w:val="none"/>
+              </w:rPr>
+              <w:t xml:space="preserve">1</w:t>
+            </w:r>
+          </w:p>
+        </w:tc>
+        <w:tc>
+          <w:tcPr>
+            <w:tcW w:type="auto" w:w="0"/>
+            <w:tcBorders>
+              <w:top w:val="none" w:color="FFFFFF" w:sz="0"/>
+              <w:left w:val="none" w:color="FFFFFF" w:sz="0"/>
+              <w:bottom w:val="none" w:color="FFFFFF" w:sz="0"/>
+              <w:right w:val="none" w:color="FFFFFF" w:sz="0"/>
+            </w:tcBorders>
+            <w:tcMar>
+              <w:top w:type="dxa" w:w="80"/>
+              <w:left w:type="dxa" w:w="120"/>
+              <w:bottom w:type="dxa" w:w="80"/>
+              <w:right w:type="dxa" w:w="120"/>
+            </w:tcMar>
+            <w:vAlign w:val="center"/>
+          </w:tcPr>
+          <w:p>
+            <w:r>
+              <w:rPr>
+                <w:rFonts w:ascii="Calibri" w:cs="Calibri" w:eastAsia="Calibri" w:hAnsi="Calibri"/>
+                <w:b w:val="false"/>
+                <w:bCs w:val="false"/>
+                <w:sz w:val="22"/>
+                <w:szCs w:val="22"/>
+                <w:u w:val="none"/>
+              </w:rPr>
+              <w:t xml:space="preserve">2</w:t>
+            </w:r>
+          </w:p>
+        </w:tc>
+      </w:tr>
+      <w:tr>
+        <w:tc>
+          <w:tcPr>
+            <w:tcW w:type="auto" w:w="0"/>
+            <w:tcBorders>
+              <w:top w:val="none" w:color="FFFFFF" w:sz="0"/>
+              <w:left w:val="none" w:color="FFFFFF" w:sz="0"/>
+              <w:bottom w:val="none" w:color="FFFFFF" w:sz="0"/>
+              <w:right w:val="none" w:color="FFFFFF" w:sz="0"/>
+            </w:tcBorders>
+            <w:tcMar>
+              <w:top w:type="dxa" w:w="80"/>
+              <w:left w:type="dxa" w:w="120"/>
+              <w:bottom w:type="dxa" w:w="80"/>
+              <w:right w:type="dxa" w:w="120"/>
+            </w:tcMar>
+            <w:vAlign w:val="center"/>
+          </w:tcPr>
+          <w:p>
+            <w:pPr>
+              <w:ind w:left="480"/>
+            </w:pPr>
+            <w:r>
+              <w:rPr>
+                <w:rFonts w:ascii="Calibri" w:cs="Calibri" w:eastAsia="Calibri" w:hAnsi="Calibri"/>
+                <w:b w:val="false"/>
+                <w:bCs w:val="false"/>
+                <w:sz w:val="22"/>
+                <w:szCs w:val="22"/>
+                <w:u w:val="none"/>
+              </w:rPr>
+              <w:t xml:space="preserve">Unsure</w:t>
+            </w:r>
+          </w:p>
+        </w:tc>
+        <w:tc>
+          <w:tcPr>
+            <w:tcW w:type="auto" w:w="0"/>
+            <w:tcBorders>
+              <w:top w:val="none" w:color="FFFFFF" w:sz="0"/>
+              <w:left w:val="none" w:color="FFFFFF" w:sz="0"/>
+              <w:bottom w:val="none" w:color="FFFFFF" w:sz="0"/>
+              <w:right w:val="none" w:color="FFFFFF" w:sz="0"/>
+            </w:tcBorders>
+            <w:tcMar>
+              <w:top w:type="dxa" w:w="80"/>
+              <w:left w:type="dxa" w:w="120"/>
+              <w:bottom w:type="dxa" w:w="80"/>
+              <w:right w:type="dxa" w:w="120"/>
+            </w:tcMar>
+            <w:vAlign w:val="center"/>
+          </w:tcPr>
+          <w:p>
+            <w:r>
+              <w:rPr>
+                <w:rFonts w:ascii="Calibri" w:cs="Calibri" w:eastAsia="Calibri" w:hAnsi="Calibri"/>
+                <w:b w:val="false"/>
+                <w:bCs w:val="false"/>
+                <w:sz w:val="22"/>
+                <w:szCs w:val="22"/>
+                <w:u w:val="none"/>
+              </w:rPr>
+              <w:t xml:space="preserve">0</w:t>
+            </w:r>
+          </w:p>
+        </w:tc>
+        <w:tc>
+          <w:tcPr>
+            <w:tcW w:type="auto" w:w="0"/>
+            <w:tcBorders>
+              <w:top w:val="none" w:color="FFFFFF" w:sz="0"/>
+              <w:left w:val="none" w:color="FFFFFF" w:sz="0"/>
+              <w:bottom w:val="none" w:color="FFFFFF" w:sz="0"/>
+              <w:right w:val="none" w:color="FFFFFF" w:sz="0"/>
+            </w:tcBorders>
+            <w:tcMar>
+              <w:top w:type="dxa" w:w="80"/>
+              <w:left w:type="dxa" w:w="120"/>
+              <w:bottom w:type="dxa" w:w="80"/>
+              <w:right w:type="dxa" w:w="120"/>
+            </w:tcMar>
+            <w:vAlign w:val="center"/>
+          </w:tcPr>
+          <w:p>
+            <w:r>
+              <w:rPr>
+                <w:rFonts w:ascii="Calibri" w:cs="Calibri" w:eastAsia="Calibri" w:hAnsi="Calibri"/>
+                <w:b w:val="false"/>
+                <w:bCs w:val="false"/>
+                <w:sz w:val="22"/>
+                <w:szCs w:val="22"/>
+                <w:u w:val="none"/>
+              </w:rPr>
+              <w:t xml:space="preserve">1</w:t>
+            </w:r>
+          </w:p>
+        </w:tc>
+        <w:tc>
+          <w:tcPr>
+            <w:tcW w:type="auto" w:w="0"/>
+            <w:tcBorders>
+              <w:top w:val="none" w:color="FFFFFF" w:sz="0"/>
+              <w:left w:val="none" w:color="FFFFFF" w:sz="0"/>
+              <w:bottom w:val="none" w:color="FFFFFF" w:sz="0"/>
+              <w:right w:val="none" w:color="FFFFFF" w:sz="0"/>
+            </w:tcBorders>
+            <w:tcMar>
+              <w:top w:type="dxa" w:w="80"/>
+              <w:left w:type="dxa" w:w="120"/>
+              <w:bottom w:type="dxa" w:w="80"/>
+              <w:right w:type="dxa" w:w="120"/>
+            </w:tcMar>
+            <w:vAlign w:val="center"/>
+          </w:tcPr>
+          <w:p>
+            <w:r>
+              <w:rPr>
+                <w:rFonts w:ascii="Calibri" w:cs="Calibri" w:eastAsia="Calibri" w:hAnsi="Calibri"/>
+                <w:b w:val="false"/>
+                <w:bCs w:val="false"/>
+                <w:sz w:val="22"/>
+                <w:szCs w:val="22"/>
+                <w:u w:val="none"/>
+              </w:rPr>
+              <w:t xml:space="preserve">1</w:t>
             </w:r>
           </w:p>
         </w:tc>
@@ -26062,7 +26578,7 @@
       <w:r>
         <w:drawing>
           <wp:inline distT="0" distB="0" distL="0" distR="0">
-            <wp:extent cx="5029200" cy="2800350"/>
+            <wp:extent cx="5029200" cy="2809875"/>
             <wp:effectExtent t="0" r="0" b="0" l="0"/>
             <wp:docPr id="1" name="" descr="" title=""/>
             <wp:cNvGraphicFramePr>
@@ -26087,7 +26603,69 @@
                   <pic:spPr bwMode="auto">
                     <a:xfrm>
                       <a:off x="0" y="0"/>
-                      <a:ext cx="5029200" cy="2800350"/>
+                      <a:ext cx="5029200" cy="2809875"/>
+                    </a:xfrm>
+                    <a:prstGeom prst="rect">
+                      <a:avLst/>
+                    </a:prstGeom>
+                  </pic:spPr>
+                </pic:pic>
+              </a:graphicData>
+            </a:graphic>
+          </wp:inline>
+        </w:drawing>
+      </w:r>
+    </w:p>
+    <w:p>
+      <w:pPr>
+        <w:pStyle w:val="Normal"/>
+        <w:spacing w:after="240" w:before="240" w:line="240"/>
+      </w:pPr>
+      <w:r>
+        <w:rPr>
+          <w:rFonts w:ascii="Calibri" w:cs="Calibri" w:eastAsia="Calibri" w:hAnsi="Calibri"/>
+          <w:b w:val="false"/>
+          <w:bCs w:val="false"/>
+          <w:sz w:val="22"/>
+          <w:szCs w:val="22"/>
+        </w:rPr>
+        <w:t xml:space="preserve">77% of respondents fully agreed that support from the Youth Zone helps them stay focused on their goals, up from 71% in February 2025. As in the prior report, there appears to be a mild correlation between attendance at the Zone and youth reporting that the Youth Zone helps them stay focused on their goals: 96% of youth who report attending the Zone at least monthly agree or somewhat agree, compared to 85% of youth who report attending less than monthly or never. Youth who attend less frequently are also more likely to report not having clear goals right now (9% vs. 0%).</w:t>
+      </w:r>
+    </w:p>
+    <w:p>
+      <w:pPr>
+        <w:spacing w:after="120"/>
+        <w:jc w:val="center"/>
+      </w:pPr>
+      <w:r>
+        <w:drawing>
+          <wp:inline distT="0" distB="0" distL="0" distR="0">
+            <wp:extent cx="6038850" cy="3467100"/>
+            <wp:effectExtent t="0" r="0" b="0" l="0"/>
+            <wp:docPr id="1" name="" descr="" title=""/>
+            <wp:cNvGraphicFramePr>
+              <a:graphicFrameLocks xmlns:a="http://schemas.openxmlformats.org/drawingml/2006/main" noChangeAspect="1"/>
+            </wp:cNvGraphicFramePr>
+            <a:graphic xmlns:a="http://schemas.openxmlformats.org/drawingml/2006/main">
+              <a:graphicData uri="http://schemas.openxmlformats.org/drawingml/2006/picture">
+                <pic:pic xmlns:pic="http://schemas.openxmlformats.org/drawingml/2006/picture">
+                  <pic:nvPicPr>
+                    <pic:cNvPr id="0" name="" descr=""/>
+                    <pic:cNvPicPr>
+                      <a:picLocks noChangeAspect="1" noChangeArrowheads="1"/>
+                    </pic:cNvPicPr>
+                  </pic:nvPicPr>
+                  <pic:blipFill>
+                    <a:blip r:embed="rId14" cstate="none"/>
+                    <a:srcRect/>
+                    <a:stretch>
+                      <a:fillRect/>
+                    </a:stretch>
+                  </pic:blipFill>
+                  <pic:spPr bwMode="auto">
+                    <a:xfrm>
+                      <a:off x="0" y="0"/>
+                      <a:ext cx="6038850" cy="3467100"/>
                     </a:xfrm>
                     <a:prstGeom prst="rect">
                       <a:avLst/>
@@ -39526,7 +40104,7 @@
                     </pic:cNvPicPr>
                   </pic:nvPicPr>
                   <pic:blipFill>
-                    <a:blip r:embed="rId14" cstate="none"/>
+                    <a:blip r:embed="rId15" cstate="none"/>
                     <a:srcRect/>
                     <a:stretch>
                       <a:fillRect/>

</xml_diff>